<commit_message>
Revise Handoff Paper: benchmark-forward, outsider-friendly, concrete testing protocol
- Title: Testing The First Pattern: A Benchmark and Methods Guide
- Added confidence level methodology (High/Medium/Low/Open)
- Operator definitions versioned as v1.0 with validation status
- Simplified Q1 wording
- Added prerequisites, time estimates, failure criteria to testing protocol
- Added worked example (software release cycle)
- Benchmarks now include data requirements and difficulty levels
- Honest code availability statement
- Concrete references with DOIs

Co-Authored-By: Claude Opus 4.6 (1M context) <noreply@anthropic.com>
</commit_message>
<xml_diff>
--- a/papers/TFP_Handoff_Paper.docx
+++ b/papers/TFP_Handoff_Paper.docx
@@ -4,7 +4,7 @@
   <w:body>
     <w:p>
       <w:pPr>
-        <w:spacing w:before="480" w:after="120"/>
+        <w:spacing w:after="40"/>
         <w:jc w:val="center"/>
       </w:pPr>
       <w:r>
@@ -15,14 +15,14 @@
           <w:color w:val="2F5496"/>
           <w:sz w:val="52"/>
         </w:rPr>
-        <w:t>The First Pattern Research Program:</w:t>
+        <w:t>Testing The First Pattern:</w:t>
         <w:br/>
-        <w:t>A Portable Framework for Testing Lifecycle Stage Structure Across Domains</w:t>
+        <w:t>A Benchmark and Methods Guide for Lifecycle Stage Structure Research</w:t>
       </w:r>
     </w:p>
     <w:p>
       <w:pPr>
-        <w:spacing w:before="0" w:after="120"/>
+        <w:spacing w:after="120"/>
         <w:pBdr>
           <w:bottom w:val="single" w:sz="6" w:space="1" w:color="2F5496"/>
         </w:pBdr>
@@ -30,12 +30,12 @@
     </w:p>
     <w:p>
       <w:pPr>
-        <w:spacing w:before="0" w:after="60"/>
+        <w:spacing w:after="20"/>
       </w:pPr>
       <w:r>
         <w:rPr>
           <w:rFonts w:ascii="Times New Roman" w:hAnsi="Times New Roman"/>
-          <w:b/>
+          <w:b w:val="0"/>
           <w:i w:val="0"/>
           <w:color w:val="000000"/>
           <w:sz w:val="22"/>
@@ -45,7 +45,7 @@
     </w:p>
     <w:p>
       <w:pPr>
-        <w:spacing w:before="0" w:after="60"/>
+        <w:spacing w:after="20"/>
       </w:pPr>
       <w:r>
         <w:rPr>
@@ -60,7 +60,7 @@
     </w:p>
     <w:p>
       <w:pPr>
-        <w:spacing w:before="0" w:after="60"/>
+        <w:spacing w:after="120"/>
       </w:pPr>
       <w:r>
         <w:rPr>
@@ -75,18 +75,8 @@
     </w:p>
     <w:p>
       <w:pPr>
-        <w:spacing w:before="120" w:after="120"/>
+        <w:spacing w:after="160"/>
       </w:pPr>
-      <w:r>
-        <w:rPr>
-          <w:rFonts w:ascii="Times New Roman" w:hAnsi="Times New Roman"/>
-          <w:b/>
-          <w:i w:val="0"/>
-          <w:color w:val="000000"/>
-          <w:sz w:val="22"/>
-        </w:rPr>
-        <w:t xml:space="preserve">Keywords: </w:t>
-      </w:r>
       <w:r>
         <w:rPr>
           <w:rFonts w:ascii="Times New Roman" w:hAnsi="Times New Roman"/>
@@ -95,12 +85,12 @@
           <w:color w:val="000000"/>
           <w:sz w:val="22"/>
         </w:rPr>
-        <w:t>lifecycle grammar, information operators, stage non-interchangeability, reseeding, falsification, research program, cross-domain invariants</w:t>
+        <w:t>Keywords: lifecycle grammar, information operators, stage non-interchangeability, benchmark, falsification, research program, cross-domain invariants</w:t>
       </w:r>
     </w:p>
     <w:p>
       <w:pPr>
-        <w:spacing w:before="320" w:after="120"/>
+        <w:spacing w:after="120" w:before="240"/>
       </w:pPr>
       <w:r>
         <w:rPr>
@@ -115,7 +105,7 @@
     </w:p>
     <w:p>
       <w:pPr>
-        <w:spacing w:before="0" w:after="60" w:line="260" w:lineRule="exact"/>
+        <w:spacing w:after="60"/>
       </w:pPr>
       <w:r>
         <w:rPr>
@@ -125,12 +115,12 @@
           <w:color w:val="000000"/>
           <w:sz w:val="22"/>
         </w:rPr>
-        <w:t>The First Pattern (TFP) proposes that adaptive processes follow a directed lifecycle with conserved, non-interchangeable stage functions. Specifically, TFP posits a four-quadrant Information Emergence Cycle (IEC) in which each stage is governed by a distinct information operator—internal stabilization, external gathering, internal narrowing, and external commitment—and that these operator-stage bindings are conserved across domains. This paper provides the minimum viable research package for outside researchers to test, falsify, or extend TFP. We summarize the current evidence base spanning two flagship papers and three supporting papers, define the canonical claims with explicit confidence levels, specify benchmark tasks and rival models with kill criteria, and identify ten open problems. The goal is to make TFP a portable research program rather than a private theory. We provide step-by-step guidance for applying TFP’s predictions to new lifecycle datasets, a hierarchy of invariant claims ranked by empirical support, locked operator definitions with measurable proxies, and a mechanism roadmap for future theoretical work. Every claim carries an explicit confidence level and every test carries explicit failure criteria. Researchers who find that TFP’s predictions fail in their domain will have contributed as much to the program as those who find support.</w:t>
+        <w:t>The First Pattern (TFP) is a proposed lifecycle grammar: a claim that adaptive processes exhibiting staged progression share conserved, non-interchangeable stage functions organized around four information operators. This paper provides the minimum viable research package for outside researchers to independently test, replicate, falsify, or extend TFP predictions in new domains. We present: (a) a validated claims table with explicit confidence levels and assignment criteria; (b) canonical operational definitions for each information operator with measurable proxies; (c) step-by-step test protocols with prerequisites, time estimates, and explicit failure criteria; (d) benchmark tasks with rival models, minimum data requirements, and kill criteria; and (e) a catalog of open problems ranked by tractability. The current evidence base spans five papers covering institutional lifecycle domains (standards bodies, clinical trials, regulatory processes, patents), simulation, battery degradation, and foraging. Six core signatures have been validated at high confidence across multiple domains. Several predictions remain untested, the theoretical mechanism underlying the observed invariants is unknown, and the boundary conditions have not been systematically mapped. Every claim carries an explicit confidence level and every test carries explicit failure criteria. Researchers who find that TFP predictions fail in their domain will have contributed as much to the program as those who find support.</w:t>
       </w:r>
     </w:p>
     <w:p>
       <w:pPr>
-        <w:spacing w:before="320" w:after="120"/>
+        <w:spacing w:after="120" w:before="240"/>
       </w:pPr>
       <w:r>
         <w:rPr>
@@ -145,7 +135,7 @@
     </w:p>
     <w:p>
       <w:pPr>
-        <w:spacing w:before="0" w:after="60" w:line="260" w:lineRule="exact"/>
+        <w:spacing w:after="60"/>
       </w:pPr>
       <w:r>
         <w:rPr>
@@ -155,12 +145,27 @@
           <w:color w:val="000000"/>
           <w:sz w:val="22"/>
         </w:rPr>
-        <w:t>The First Pattern (TFP) is a proposed lifecycle grammar: a claim that adaptive processes exhibiting staged progression share conserved, non-interchangeable stage functions. Rather than proposing that all systems follow a single template, TFP identifies a specific structural invariant—that the functions performed at each lifecycle stage are not arbitrary but are drawn from a conserved set of information operators bound to specific positions in the lifecycle sequence.</w:t>
+        <w:t>Lifecycle stage structure is a common feature of complex adaptive processes. Internet standards progress through proposal, review, and ratification stages. Clinical trials advance through protocol registration, enrollment, and results reporting. Regulatory rules move from proposal through comment periods to final publication. A natural question arises: are the functions performed at each stage arbitrary, or do they reflect a conserved structure?</w:t>
       </w:r>
     </w:p>
     <w:p>
       <w:pPr>
-        <w:spacing w:before="0" w:after="60" w:line="260" w:lineRule="exact"/>
+        <w:spacing w:after="60"/>
+      </w:pPr>
+      <w:r>
+        <w:rPr>
+          <w:rFonts w:ascii="Times New Roman" w:hAnsi="Times New Roman"/>
+          <w:b w:val="0"/>
+          <w:i w:val="0"/>
+          <w:color w:val="000000"/>
+          <w:sz w:val="22"/>
+        </w:rPr>
+        <w:t>The First Pattern (TFP) proposes a specific answer: systems that exhibit staged lifecycle progression will show conserved, non-interchangeable stage functions consistent with a four-quadrant Information Emergence Cycle (IEC). Each quadrant is governed by a distinct information operator, and TFP predicts that these operator–stage bindings are conserved across domains.</w:t>
+      </w:r>
+    </w:p>
+    <w:p>
+      <w:pPr>
+        <w:spacing w:after="60"/>
       </w:pPr>
       <w:r>
         <w:rPr>
@@ -175,7 +180,7 @@
     </w:p>
     <w:p>
       <w:pPr>
-        <w:spacing w:before="0" w:after="60" w:line="260" w:lineRule="exact"/>
+        <w:spacing w:after="60"/>
       </w:pPr>
       <w:r>
         <w:rPr>
@@ -185,12 +190,12 @@
           <w:color w:val="000000"/>
           <w:sz w:val="22"/>
         </w:rPr>
-        <w:t>The purpose of this paper is to make TFP testable by outside researchers. We provide: (a) precise definitions of what TFP claims and does not claim; (b) a summary of what has been validated and at what confidence level; (c) locked operator definitions with measurable proxies; (d) step-by-step instructions for testing TFP on a new domain; (e) benchmark tasks with rival models and kill criteria; (f) a mechanism roadmap for future theoretical work; and (g) a catalog of open problems.</w:t>
+        <w:t>The purpose of this paper is to provide a self-contained research toolkit for outside investigators. We supply: (a) precise definitions of what TFP claims and does not claim; (b) a summary of what has been validated and at what confidence level, with transparent criteria for how confidence levels are assigned; (c) canonical operational definitions for each operator with measurable proxies; (d) step-by-step instructions for testing TFP on a new domain, including prerequisites, time estimates, and what failure looks like at each step; (e) benchmark tasks with rival models, minimum data requirements, and kill criteria; (f) a mechanism roadmap for future theoretical work; and (g) a catalog of open problems.</w:t>
       </w:r>
     </w:p>
     <w:p>
       <w:pPr>
-        <w:spacing w:before="0" w:after="60" w:line="260" w:lineRule="exact"/>
+        <w:spacing w:after="60"/>
       </w:pPr>
       <w:r>
         <w:rPr>
@@ -200,12 +205,12 @@
           <w:color w:val="000000"/>
           <w:sz w:val="22"/>
         </w:rPr>
-        <w:t>This paper is not a theory pitch, not a proof, and not a manifesto. It is a research toolkit. Its value will be determined by whether outside researchers find it sufficient to run their own TFP tests without consulting the original author.</w:t>
+        <w:t>This paper is not a theory pitch, not a proof, and not a manifesto. It is a benchmark and methods guide. Its value will be determined by whether outside researchers find it sufficient to run their own TFP tests without consulting the original author.</w:t>
       </w:r>
     </w:p>
     <w:p>
       <w:pPr>
-        <w:spacing w:before="320" w:after="120"/>
+        <w:spacing w:after="120" w:before="240"/>
       </w:pPr>
       <w:r>
         <w:rPr>
@@ -220,7 +225,7 @@
     </w:p>
     <w:p>
       <w:pPr>
-        <w:spacing w:before="200" w:after="80"/>
+        <w:spacing w:after="80" w:before="160"/>
       </w:pPr>
       <w:r>
         <w:rPr>
@@ -235,7 +240,7 @@
     </w:p>
     <w:p>
       <w:pPr>
-        <w:spacing w:before="0" w:after="60" w:line="260" w:lineRule="exact"/>
+        <w:spacing w:after="60"/>
       </w:pPr>
       <w:r>
         <w:rPr>
@@ -245,24 +250,13 @@
           <w:color w:val="000000"/>
           <w:sz w:val="22"/>
         </w:rPr>
-        <w:t>TFP’s central structure is the Information Emergence Cycle (IEC), a four-quadrant lifecycle model in which each quadrant performs a distinct information-processing function. The four quadrants are:</w:t>
+        <w:t>TFP's central structure is the Information Emergence Cycle (IEC), a four-quadrant lifecycle model in which each quadrant performs a distinct information-processing function:</w:t>
       </w:r>
     </w:p>
     <w:p>
       <w:pPr>
-        <w:spacing w:before="0" w:after="40" w:line="260" w:lineRule="exact"/>
-        <w:ind w:left="720" w:hanging="360"/>
+        <w:spacing w:after="60"/>
       </w:pPr>
-      <w:r>
-        <w:rPr>
-          <w:rFonts w:ascii="Times New Roman" w:hAnsi="Times New Roman"/>
-          <w:b/>
-          <w:i w:val="0"/>
-          <w:color w:val="000000"/>
-          <w:sz w:val="22"/>
-        </w:rPr>
-        <w:t xml:space="preserve">• Q1 (Generation): </w:t>
-      </w:r>
       <w:r>
         <w:rPr>
           <w:rFonts w:ascii="Times New Roman" w:hAnsi="Times New Roman"/>
@@ -271,24 +265,13 @@
           <w:color w:val="000000"/>
           <w:sz w:val="22"/>
         </w:rPr>
-        <w:t>Internal stabilization (B_in) + internal exploration (E_in). The system establishes an internal orientation and begins narrowing its initial possibility space.</w:t>
+        <w:t>• Q1 (Generation): The system stabilizes internally before engaging with external input. In lifecycle terms, this is the pre-engagement preparation phase.</w:t>
       </w:r>
     </w:p>
     <w:p>
       <w:pPr>
-        <w:spacing w:before="0" w:after="40" w:line="260" w:lineRule="exact"/>
-        <w:ind w:left="720" w:hanging="360"/>
+        <w:spacing w:after="60"/>
       </w:pPr>
-      <w:r>
-        <w:rPr>
-          <w:rFonts w:ascii="Times New Roman" w:hAnsi="Times New Roman"/>
-          <w:b/>
-          <w:i w:val="0"/>
-          <w:color w:val="000000"/>
-          <w:sz w:val="22"/>
-        </w:rPr>
-        <w:t xml:space="preserve">• Q2 (Selection): </w:t>
-      </w:r>
       <w:r>
         <w:rPr>
           <w:rFonts w:ascii="Times New Roman" w:hAnsi="Times New Roman"/>
@@ -297,24 +280,13 @@
           <w:color w:val="000000"/>
           <w:sz w:val="22"/>
         </w:rPr>
-        <w:t>External coupling (E_out) + internal consolidation (B_in). The system gathers external information broadly and consolidates internal references.</w:t>
+        <w:t>• Q2 (Selection): The system couples with external information sources, gathering broadly while consolidating internal references. In lifecycle terms, this is the broad intake and evaluation phase.</w:t>
       </w:r>
     </w:p>
     <w:p>
       <w:pPr>
-        <w:spacing w:before="0" w:after="40" w:line="260" w:lineRule="exact"/>
-        <w:ind w:left="720" w:hanging="360"/>
+        <w:spacing w:after="60"/>
       </w:pPr>
-      <w:r>
-        <w:rPr>
-          <w:rFonts w:ascii="Times New Roman" w:hAnsi="Times New Roman"/>
-          <w:b/>
-          <w:i w:val="0"/>
-          <w:color w:val="000000"/>
-          <w:sz w:val="22"/>
-        </w:rPr>
-        <w:t xml:space="preserve">• Q3 (Refinement): </w:t>
-      </w:r>
       <w:r>
         <w:rPr>
           <w:rFonts w:ascii="Times New Roman" w:hAnsi="Times New Roman"/>
@@ -323,24 +295,13 @@
           <w:color w:val="000000"/>
           <w:sz w:val="22"/>
         </w:rPr>
-        <w:t>Internal transformation (E_in) + external commitment (B_out). The system narrows options internally while beginning to commit externally.</w:t>
+        <w:t>• Q3 (Refinement): The system narrows options internally while beginning to commit externally. In lifecycle terms, this is the convergence and decision phase.</w:t>
       </w:r>
     </w:p>
     <w:p>
       <w:pPr>
-        <w:spacing w:before="0" w:after="40" w:line="260" w:lineRule="exact"/>
-        <w:ind w:left="720" w:hanging="360"/>
+        <w:spacing w:after="60"/>
       </w:pPr>
-      <w:r>
-        <w:rPr>
-          <w:rFonts w:ascii="Times New Roman" w:hAnsi="Times New Roman"/>
-          <w:b/>
-          <w:i w:val="0"/>
-          <w:color w:val="000000"/>
-          <w:sz w:val="22"/>
-        </w:rPr>
-        <w:t xml:space="preserve">• Q4 (Deployment): </w:t>
-      </w:r>
       <w:r>
         <w:rPr>
           <w:rFonts w:ascii="Times New Roman" w:hAnsi="Times New Roman"/>
@@ -349,12 +310,12 @@
           <w:color w:val="000000"/>
           <w:sz w:val="22"/>
         </w:rPr>
-        <w:t>Irreversible commitment (B_out) + external propagation (E_out). The system makes persistent external writes. Q4 bifurcates into Q4A (continuation along the current trajectory) and Q4B (reseeding—viability-gated return to earlier lifecycle functions after failure).</w:t>
+        <w:t>• Q4 (Deployment): The system makes irreversible external commitments. Q4 bifurcates into Q4A (continuation along the current trajectory) and Q4B (viability-gated return to earlier lifecycle functions after failure).</w:t>
       </w:r>
     </w:p>
     <w:p>
       <w:pPr>
-        <w:spacing w:before="200" w:after="80"/>
+        <w:spacing w:after="80" w:before="160"/>
       </w:pPr>
       <w:r>
         <w:rPr>
@@ -369,7 +330,7 @@
     </w:p>
     <w:p>
       <w:pPr>
-        <w:spacing w:before="0" w:after="60" w:line="260" w:lineRule="exact"/>
+        <w:spacing w:after="60"/>
       </w:pPr>
       <w:r>
         <w:rPr>
@@ -379,13 +340,12 @@
           <w:color w:val="000000"/>
           <w:sz w:val="22"/>
         </w:rPr>
-        <w:t>Each quadrant’s function is defined by a combination of four information operators, distinguished along two axes: internal vs. external orientation, and binding (stabilizing) vs. exploring (destabilizing) function.</w:t>
+        <w:t>Each quadrant's function is defined by a combination of four information operators, distinguished along two axes: internal vs. external orientation, and binding (stabilizing) vs. exploring (destabilizing) function.</w:t>
       </w:r>
     </w:p>
     <w:p>
       <w:pPr>
-        <w:spacing w:before="0" w:after="40" w:line="260" w:lineRule="exact"/>
-        <w:ind w:left="720" w:hanging="360"/>
+        <w:spacing w:after="60"/>
       </w:pPr>
       <w:r>
         <w:rPr>
@@ -400,8 +360,7 @@
     </w:p>
     <w:p>
       <w:pPr>
-        <w:spacing w:before="0" w:after="40" w:line="260" w:lineRule="exact"/>
-        <w:ind w:left="720" w:hanging="360"/>
+        <w:spacing w:after="60"/>
       </w:pPr>
       <w:r>
         <w:rPr>
@@ -416,8 +375,7 @@
     </w:p>
     <w:p>
       <w:pPr>
-        <w:spacing w:before="0" w:after="40" w:line="260" w:lineRule="exact"/>
-        <w:ind w:left="720" w:hanging="360"/>
+        <w:spacing w:after="60"/>
       </w:pPr>
       <w:r>
         <w:rPr>
@@ -432,8 +390,7 @@
     </w:p>
     <w:p>
       <w:pPr>
-        <w:spacing w:before="0" w:after="40" w:line="260" w:lineRule="exact"/>
-        <w:ind w:left="720" w:hanging="360"/>
+        <w:spacing w:after="60"/>
       </w:pPr>
       <w:r>
         <w:rPr>
@@ -448,7 +405,7 @@
     </w:p>
     <w:p>
       <w:pPr>
-        <w:spacing w:before="200" w:after="80"/>
+        <w:spacing w:after="80" w:before="160"/>
       </w:pPr>
       <w:r>
         <w:rPr>
@@ -463,7 +420,7 @@
     </w:p>
     <w:p>
       <w:pPr>
-        <w:spacing w:before="0" w:after="60" w:line="260" w:lineRule="exact"/>
+        <w:spacing w:after="60"/>
       </w:pPr>
       <w:r>
         <w:rPr>
@@ -478,7 +435,7 @@
     </w:p>
     <w:p>
       <w:pPr>
-        <w:spacing w:before="320" w:after="120"/>
+        <w:spacing w:after="120" w:before="240"/>
       </w:pPr>
       <w:r>
         <w:rPr>
@@ -493,7 +450,7 @@
     </w:p>
     <w:p>
       <w:pPr>
-        <w:spacing w:before="0" w:after="60" w:line="260" w:lineRule="exact"/>
+        <w:spacing w:after="60"/>
       </w:pPr>
       <w:r>
         <w:rPr>
@@ -503,20 +460,20 @@
           <w:color w:val="000000"/>
           <w:sz w:val="22"/>
         </w:rPr>
-        <w:t>Table 1 summarizes the current validation status of TFP’s claims. Confidence levels reflect the strength and breadth of current evidence, not theoretical certainty.</w:t>
+        <w:t>Table 1 summarizes the current validation status of TFP claims. Confidence levels reflect the strength and breadth of current evidence, not theoretical certainty. See Section 3.1 for confidence level definitions.</w:t>
       </w:r>
     </w:p>
     <w:p>
       <w:pPr>
-        <w:spacing w:before="0" w:after="60" w:line="260" w:lineRule="exact"/>
+        <w:spacing w:after="80"/>
       </w:pPr>
       <w:r>
         <w:rPr>
           <w:rFonts w:ascii="Times New Roman" w:hAnsi="Times New Roman"/>
-          <w:b w:val="0"/>
-          <w:i w:val="0"/>
+          <w:b/>
+          <w:i/>
           <w:color w:val="000000"/>
-          <w:sz w:val="22"/>
+          <w:sz w:val="20"/>
         </w:rPr>
         <w:t>Table 1. TFP Claim Validation Status</w:t>
       </w:r>
@@ -527,12 +484,12 @@
         <w:jc w:val="center"/>
         <w:tblLook w:firstColumn="1" w:firstRow="1" w:lastColumn="0" w:lastRow="0" w:noHBand="0" w:noVBand="1" w:val="04A0"/>
         <w:tblBorders>
-          <w:top w:val="single" w:sz="4" w:space="0" w:color="999999"/>
-          <w:left w:val="single" w:sz="4" w:space="0" w:color="999999"/>
-          <w:bottom w:val="single" w:sz="4" w:space="0" w:color="999999"/>
-          <w:right w:val="single" w:sz="4" w:space="0" w:color="999999"/>
-          <w:insideH w:val="single" w:sz="4" w:space="0" w:color="999999"/>
-          <w:insideV w:val="single" w:sz="4" w:space="0" w:color="999999"/>
+          <w:top w:val="single" w:sz="4" w:space="0" w:color="808080"/>
+          <w:left w:val="single" w:sz="4" w:space="0" w:color="808080"/>
+          <w:bottom w:val="single" w:sz="4" w:space="0" w:color="808080"/>
+          <w:right w:val="single" w:sz="4" w:space="0" w:color="808080"/>
+          <w:insideH w:val="single" w:sz="4" w:space="0" w:color="808080"/>
+          <w:insideV w:val="single" w:sz="4" w:space="0" w:color="808080"/>
         </w:tblBorders>
       </w:tblPr>
       <w:tblGrid>
@@ -546,16 +503,18 @@
         <w:tc>
           <w:tcPr>
             <w:tcW w:type="dxa" w:w="1728"/>
-            <w:shd w:fill="4472C4"/>
+            <w:shd w:fill="D9E2F3" w:val="clear"/>
           </w:tcPr>
           <w:p>
+            <w:pPr>
+              <w:spacing w:after="20" w:before="20"/>
+            </w:pPr>
             <w:r/>
             <w:r>
               <w:rPr>
                 <w:rFonts w:ascii="Times New Roman" w:hAnsi="Times New Roman"/>
                 <w:b/>
-                <w:i w:val="0"/>
-                <w:color w:val="FFFFFF"/>
+                <w:color w:val="000000"/>
                 <w:sz w:val="20"/>
               </w:rPr>
               <w:t>Claim</w:t>
@@ -565,16 +524,18 @@
         <w:tc>
           <w:tcPr>
             <w:tcW w:type="dxa" w:w="1728"/>
-            <w:shd w:fill="4472C4"/>
+            <w:shd w:fill="D9E2F3" w:val="clear"/>
           </w:tcPr>
           <w:p>
+            <w:pPr>
+              <w:spacing w:after="20" w:before="20"/>
+            </w:pPr>
             <w:r/>
             <w:r>
               <w:rPr>
                 <w:rFonts w:ascii="Times New Roman" w:hAnsi="Times New Roman"/>
                 <w:b/>
-                <w:i w:val="0"/>
-                <w:color w:val="FFFFFF"/>
+                <w:color w:val="000000"/>
                 <w:sz w:val="20"/>
               </w:rPr>
               <w:t>Paper</w:t>
@@ -584,16 +545,18 @@
         <w:tc>
           <w:tcPr>
             <w:tcW w:type="dxa" w:w="1728"/>
-            <w:shd w:fill="4472C4"/>
+            <w:shd w:fill="D9E2F3" w:val="clear"/>
           </w:tcPr>
           <w:p>
+            <w:pPr>
+              <w:spacing w:after="20" w:before="20"/>
+            </w:pPr>
             <w:r/>
             <w:r>
               <w:rPr>
                 <w:rFonts w:ascii="Times New Roman" w:hAnsi="Times New Roman"/>
                 <w:b/>
-                <w:i w:val="0"/>
-                <w:color w:val="FFFFFF"/>
+                <w:color w:val="000000"/>
                 <w:sz w:val="20"/>
               </w:rPr>
               <w:t>Status</w:t>
@@ -603,16 +566,18 @@
         <w:tc>
           <w:tcPr>
             <w:tcW w:type="dxa" w:w="1728"/>
-            <w:shd w:fill="4472C4"/>
+            <w:shd w:fill="D9E2F3" w:val="clear"/>
           </w:tcPr>
           <w:p>
+            <w:pPr>
+              <w:spacing w:after="20" w:before="20"/>
+            </w:pPr>
             <w:r/>
             <w:r>
               <w:rPr>
                 <w:rFonts w:ascii="Times New Roman" w:hAnsi="Times New Roman"/>
                 <w:b/>
-                <w:i w:val="0"/>
-                <w:color w:val="FFFFFF"/>
+                <w:color w:val="000000"/>
                 <w:sz w:val="20"/>
               </w:rPr>
               <w:t>Key Result</w:t>
@@ -622,16 +587,18 @@
         <w:tc>
           <w:tcPr>
             <w:tcW w:type="dxa" w:w="1728"/>
-            <w:shd w:fill="4472C4"/>
+            <w:shd w:fill="D9E2F3" w:val="clear"/>
           </w:tcPr>
           <w:p>
+            <w:pPr>
+              <w:spacing w:after="20" w:before="20"/>
+            </w:pPr>
             <w:r/>
             <w:r>
               <w:rPr>
                 <w:rFonts w:ascii="Times New Roman" w:hAnsi="Times New Roman"/>
                 <w:b/>
-                <w:i w:val="0"/>
-                <w:color w:val="FFFFFF"/>
+                <w:color w:val="000000"/>
                 <w:sz w:val="20"/>
               </w:rPr>
               <w:t>Confidence</w:t>
@@ -645,12 +612,14 @@
             <w:tcW w:type="dxa" w:w="1728"/>
           </w:tcPr>
           <w:p>
+            <w:pPr>
+              <w:spacing w:after="20" w:before="20"/>
+            </w:pPr>
             <w:r/>
             <w:r>
               <w:rPr>
                 <w:rFonts w:ascii="Times New Roman" w:hAnsi="Times New Roman"/>
                 <w:b w:val="0"/>
-                <w:i w:val="0"/>
                 <w:color w:val="000000"/>
                 <w:sz w:val="20"/>
               </w:rPr>
@@ -663,12 +632,14 @@
             <w:tcW w:type="dxa" w:w="1728"/>
           </w:tcPr>
           <w:p>
+            <w:pPr>
+              <w:spacing w:after="20" w:before="20"/>
+            </w:pPr>
             <w:r/>
             <w:r>
               <w:rPr>
                 <w:rFonts w:ascii="Times New Roman" w:hAnsi="Times New Roman"/>
                 <w:b w:val="0"/>
-                <w:i w:val="0"/>
                 <w:color w:val="000000"/>
                 <w:sz w:val="20"/>
               </w:rPr>
@@ -681,12 +652,14 @@
             <w:tcW w:type="dxa" w:w="1728"/>
           </w:tcPr>
           <w:p>
+            <w:pPr>
+              <w:spacing w:after="20" w:before="20"/>
+            </w:pPr>
             <w:r/>
             <w:r>
               <w:rPr>
                 <w:rFonts w:ascii="Times New Roman" w:hAnsi="Times New Roman"/>
                 <w:b w:val="0"/>
-                <w:i w:val="0"/>
                 <w:color w:val="000000"/>
                 <w:sz w:val="20"/>
               </w:rPr>
@@ -699,12 +672,14 @@
             <w:tcW w:type="dxa" w:w="1728"/>
           </w:tcPr>
           <w:p>
+            <w:pPr>
+              <w:spacing w:after="20" w:before="20"/>
+            </w:pPr>
             <w:r/>
             <w:r>
               <w:rPr>
                 <w:rFonts w:ascii="Times New Roman" w:hAnsi="Times New Roman"/>
                 <w:b w:val="0"/>
-                <w:i w:val="0"/>
                 <w:color w:val="000000"/>
                 <w:sz w:val="20"/>
               </w:rPr>
@@ -717,12 +692,14 @@
             <w:tcW w:type="dxa" w:w="1728"/>
           </w:tcPr>
           <w:p>
+            <w:pPr>
+              <w:spacing w:after="20" w:before="20"/>
+            </w:pPr>
             <w:r/>
             <w:r>
               <w:rPr>
                 <w:rFonts w:ascii="Times New Roman" w:hAnsi="Times New Roman"/>
                 <w:b w:val="0"/>
-                <w:i w:val="0"/>
                 <w:color w:val="000000"/>
                 <w:sz w:val="20"/>
               </w:rPr>
@@ -737,12 +714,14 @@
             <w:tcW w:type="dxa" w:w="1728"/>
           </w:tcPr>
           <w:p>
+            <w:pPr>
+              <w:spacing w:after="20" w:before="20"/>
+            </w:pPr>
             <w:r/>
             <w:r>
               <w:rPr>
                 <w:rFonts w:ascii="Times New Roman" w:hAnsi="Times New Roman"/>
                 <w:b w:val="0"/>
-                <w:i w:val="0"/>
                 <w:color w:val="000000"/>
                 <w:sz w:val="20"/>
               </w:rPr>
@@ -755,12 +734,14 @@
             <w:tcW w:type="dxa" w:w="1728"/>
           </w:tcPr>
           <w:p>
+            <w:pPr>
+              <w:spacing w:after="20" w:before="20"/>
+            </w:pPr>
             <w:r/>
             <w:r>
               <w:rPr>
                 <w:rFonts w:ascii="Times New Roman" w:hAnsi="Times New Roman"/>
                 <w:b w:val="0"/>
-                <w:i w:val="0"/>
                 <w:color w:val="000000"/>
                 <w:sz w:val="20"/>
               </w:rPr>
@@ -773,12 +754,14 @@
             <w:tcW w:type="dxa" w:w="1728"/>
           </w:tcPr>
           <w:p>
+            <w:pPr>
+              <w:spacing w:after="20" w:before="20"/>
+            </w:pPr>
             <w:r/>
             <w:r>
               <w:rPr>
                 <w:rFonts w:ascii="Times New Roman" w:hAnsi="Times New Roman"/>
                 <w:b w:val="0"/>
-                <w:i w:val="0"/>
                 <w:color w:val="000000"/>
                 <w:sz w:val="20"/>
               </w:rPr>
@@ -791,12 +774,14 @@
             <w:tcW w:type="dxa" w:w="1728"/>
           </w:tcPr>
           <w:p>
+            <w:pPr>
+              <w:spacing w:after="20" w:before="20"/>
+            </w:pPr>
             <w:r/>
             <w:r>
               <w:rPr>
                 <w:rFonts w:ascii="Times New Roman" w:hAnsi="Times New Roman"/>
                 <w:b w:val="0"/>
-                <w:i w:val="0"/>
                 <w:color w:val="000000"/>
                 <w:sz w:val="20"/>
               </w:rPr>
@@ -809,12 +794,14 @@
             <w:tcW w:type="dxa" w:w="1728"/>
           </w:tcPr>
           <w:p>
+            <w:pPr>
+              <w:spacing w:after="20" w:before="20"/>
+            </w:pPr>
             <w:r/>
             <w:r>
               <w:rPr>
                 <w:rFonts w:ascii="Times New Roman" w:hAnsi="Times New Roman"/>
                 <w:b w:val="0"/>
-                <w:i w:val="0"/>
                 <w:color w:val="000000"/>
                 <w:sz w:val="20"/>
               </w:rPr>
@@ -829,12 +816,14 @@
             <w:tcW w:type="dxa" w:w="1728"/>
           </w:tcPr>
           <w:p>
+            <w:pPr>
+              <w:spacing w:after="20" w:before="20"/>
+            </w:pPr>
             <w:r/>
             <w:r>
               <w:rPr>
                 <w:rFonts w:ascii="Times New Roman" w:hAnsi="Times New Roman"/>
                 <w:b w:val="0"/>
-                <w:i w:val="0"/>
                 <w:color w:val="000000"/>
                 <w:sz w:val="20"/>
               </w:rPr>
@@ -847,12 +836,14 @@
             <w:tcW w:type="dxa" w:w="1728"/>
           </w:tcPr>
           <w:p>
+            <w:pPr>
+              <w:spacing w:after="20" w:before="20"/>
+            </w:pPr>
             <w:r/>
             <w:r>
               <w:rPr>
                 <w:rFonts w:ascii="Times New Roman" w:hAnsi="Times New Roman"/>
                 <w:b w:val="0"/>
-                <w:i w:val="0"/>
                 <w:color w:val="000000"/>
                 <w:sz w:val="20"/>
               </w:rPr>
@@ -865,12 +856,14 @@
             <w:tcW w:type="dxa" w:w="1728"/>
           </w:tcPr>
           <w:p>
+            <w:pPr>
+              <w:spacing w:after="20" w:before="20"/>
+            </w:pPr>
             <w:r/>
             <w:r>
               <w:rPr>
                 <w:rFonts w:ascii="Times New Roman" w:hAnsi="Times New Roman"/>
                 <w:b w:val="0"/>
-                <w:i w:val="0"/>
                 <w:color w:val="000000"/>
                 <w:sz w:val="20"/>
               </w:rPr>
@@ -883,12 +876,14 @@
             <w:tcW w:type="dxa" w:w="1728"/>
           </w:tcPr>
           <w:p>
+            <w:pPr>
+              <w:spacing w:after="20" w:before="20"/>
+            </w:pPr>
             <w:r/>
             <w:r>
               <w:rPr>
                 <w:rFonts w:ascii="Times New Roman" w:hAnsi="Times New Roman"/>
                 <w:b w:val="0"/>
-                <w:i w:val="0"/>
                 <w:color w:val="000000"/>
                 <w:sz w:val="20"/>
               </w:rPr>
@@ -901,12 +896,14 @@
             <w:tcW w:type="dxa" w:w="1728"/>
           </w:tcPr>
           <w:p>
+            <w:pPr>
+              <w:spacing w:after="20" w:before="20"/>
+            </w:pPr>
             <w:r/>
             <w:r>
               <w:rPr>
                 <w:rFonts w:ascii="Times New Roman" w:hAnsi="Times New Roman"/>
                 <w:b w:val="0"/>
-                <w:i w:val="0"/>
                 <w:color w:val="000000"/>
                 <w:sz w:val="20"/>
               </w:rPr>
@@ -921,12 +918,14 @@
             <w:tcW w:type="dxa" w:w="1728"/>
           </w:tcPr>
           <w:p>
+            <w:pPr>
+              <w:spacing w:after="20" w:before="20"/>
+            </w:pPr>
             <w:r/>
             <w:r>
               <w:rPr>
                 <w:rFonts w:ascii="Times New Roman" w:hAnsi="Times New Roman"/>
                 <w:b w:val="0"/>
-                <w:i w:val="0"/>
                 <w:color w:val="000000"/>
                 <w:sz w:val="20"/>
               </w:rPr>
@@ -939,12 +938,14 @@
             <w:tcW w:type="dxa" w:w="1728"/>
           </w:tcPr>
           <w:p>
+            <w:pPr>
+              <w:spacing w:after="20" w:before="20"/>
+            </w:pPr>
             <w:r/>
             <w:r>
               <w:rPr>
                 <w:rFonts w:ascii="Times New Roman" w:hAnsi="Times New Roman"/>
                 <w:b w:val="0"/>
-                <w:i w:val="0"/>
                 <w:color w:val="000000"/>
                 <w:sz w:val="20"/>
               </w:rPr>
@@ -957,12 +958,14 @@
             <w:tcW w:type="dxa" w:w="1728"/>
           </w:tcPr>
           <w:p>
+            <w:pPr>
+              <w:spacing w:after="20" w:before="20"/>
+            </w:pPr>
             <w:r/>
             <w:r>
               <w:rPr>
                 <w:rFonts w:ascii="Times New Roman" w:hAnsi="Times New Roman"/>
                 <w:b w:val="0"/>
-                <w:i w:val="0"/>
                 <w:color w:val="000000"/>
                 <w:sz w:val="20"/>
               </w:rPr>
@@ -975,12 +978,14 @@
             <w:tcW w:type="dxa" w:w="1728"/>
           </w:tcPr>
           <w:p>
+            <w:pPr>
+              <w:spacing w:after="20" w:before="20"/>
+            </w:pPr>
             <w:r/>
             <w:r>
               <w:rPr>
                 <w:rFonts w:ascii="Times New Roman" w:hAnsi="Times New Roman"/>
                 <w:b w:val="0"/>
-                <w:i w:val="0"/>
                 <w:color w:val="000000"/>
                 <w:sz w:val="20"/>
               </w:rPr>
@@ -993,12 +998,14 @@
             <w:tcW w:type="dxa" w:w="1728"/>
           </w:tcPr>
           <w:p>
+            <w:pPr>
+              <w:spacing w:after="20" w:before="20"/>
+            </w:pPr>
             <w:r/>
             <w:r>
               <w:rPr>
                 <w:rFonts w:ascii="Times New Roman" w:hAnsi="Times New Roman"/>
                 <w:b w:val="0"/>
-                <w:i w:val="0"/>
                 <w:color w:val="000000"/>
                 <w:sz w:val="20"/>
               </w:rPr>
@@ -1013,12 +1020,14 @@
             <w:tcW w:type="dxa" w:w="1728"/>
           </w:tcPr>
           <w:p>
+            <w:pPr>
+              <w:spacing w:after="20" w:before="20"/>
+            </w:pPr>
             <w:r/>
             <w:r>
               <w:rPr>
                 <w:rFonts w:ascii="Times New Roman" w:hAnsi="Times New Roman"/>
                 <w:b w:val="0"/>
-                <w:i w:val="0"/>
                 <w:color w:val="000000"/>
                 <w:sz w:val="20"/>
               </w:rPr>
@@ -1031,12 +1040,14 @@
             <w:tcW w:type="dxa" w:w="1728"/>
           </w:tcPr>
           <w:p>
+            <w:pPr>
+              <w:spacing w:after="20" w:before="20"/>
+            </w:pPr>
             <w:r/>
             <w:r>
               <w:rPr>
                 <w:rFonts w:ascii="Times New Roman" w:hAnsi="Times New Roman"/>
                 <w:b w:val="0"/>
-                <w:i w:val="0"/>
                 <w:color w:val="000000"/>
                 <w:sz w:val="20"/>
               </w:rPr>
@@ -1049,12 +1060,14 @@
             <w:tcW w:type="dxa" w:w="1728"/>
           </w:tcPr>
           <w:p>
+            <w:pPr>
+              <w:spacing w:after="20" w:before="20"/>
+            </w:pPr>
             <w:r/>
             <w:r>
               <w:rPr>
                 <w:rFonts w:ascii="Times New Roman" w:hAnsi="Times New Roman"/>
                 <w:b w:val="0"/>
-                <w:i w:val="0"/>
                 <w:color w:val="000000"/>
                 <w:sz w:val="20"/>
               </w:rPr>
@@ -1067,12 +1080,14 @@
             <w:tcW w:type="dxa" w:w="1728"/>
           </w:tcPr>
           <w:p>
+            <w:pPr>
+              <w:spacing w:after="20" w:before="20"/>
+            </w:pPr>
             <w:r/>
             <w:r>
               <w:rPr>
                 <w:rFonts w:ascii="Times New Roman" w:hAnsi="Times New Roman"/>
                 <w:b w:val="0"/>
-                <w:i w:val="0"/>
                 <w:color w:val="000000"/>
                 <w:sz w:val="20"/>
               </w:rPr>
@@ -1085,12 +1100,14 @@
             <w:tcW w:type="dxa" w:w="1728"/>
           </w:tcPr>
           <w:p>
+            <w:pPr>
+              <w:spacing w:after="20" w:before="20"/>
+            </w:pPr>
             <w:r/>
             <w:r>
               <w:rPr>
                 <w:rFonts w:ascii="Times New Roman" w:hAnsi="Times New Roman"/>
                 <w:b w:val="0"/>
-                <w:i w:val="0"/>
                 <w:color w:val="000000"/>
                 <w:sz w:val="20"/>
               </w:rPr>
@@ -1105,12 +1122,14 @@
             <w:tcW w:type="dxa" w:w="1728"/>
           </w:tcPr>
           <w:p>
+            <w:pPr>
+              <w:spacing w:after="20" w:before="20"/>
+            </w:pPr>
             <w:r/>
             <w:r>
               <w:rPr>
                 <w:rFonts w:ascii="Times New Roman" w:hAnsi="Times New Roman"/>
                 <w:b w:val="0"/>
-                <w:i w:val="0"/>
                 <w:color w:val="000000"/>
                 <w:sz w:val="20"/>
               </w:rPr>
@@ -1123,12 +1142,14 @@
             <w:tcW w:type="dxa" w:w="1728"/>
           </w:tcPr>
           <w:p>
+            <w:pPr>
+              <w:spacing w:after="20" w:before="20"/>
+            </w:pPr>
             <w:r/>
             <w:r>
               <w:rPr>
                 <w:rFonts w:ascii="Times New Roman" w:hAnsi="Times New Roman"/>
                 <w:b w:val="0"/>
-                <w:i w:val="0"/>
                 <w:color w:val="000000"/>
                 <w:sz w:val="20"/>
               </w:rPr>
@@ -1141,12 +1162,14 @@
             <w:tcW w:type="dxa" w:w="1728"/>
           </w:tcPr>
           <w:p>
+            <w:pPr>
+              <w:spacing w:after="20" w:before="20"/>
+            </w:pPr>
             <w:r/>
             <w:r>
               <w:rPr>
                 <w:rFonts w:ascii="Times New Roman" w:hAnsi="Times New Roman"/>
                 <w:b w:val="0"/>
-                <w:i w:val="0"/>
                 <w:color w:val="000000"/>
                 <w:sz w:val="20"/>
               </w:rPr>
@@ -1159,12 +1182,14 @@
             <w:tcW w:type="dxa" w:w="1728"/>
           </w:tcPr>
           <w:p>
+            <w:pPr>
+              <w:spacing w:after="20" w:before="20"/>
+            </w:pPr>
             <w:r/>
             <w:r>
               <w:rPr>
                 <w:rFonts w:ascii="Times New Roman" w:hAnsi="Times New Roman"/>
                 <w:b w:val="0"/>
-                <w:i w:val="0"/>
                 <w:color w:val="000000"/>
                 <w:sz w:val="20"/>
               </w:rPr>
@@ -1177,12 +1202,14 @@
             <w:tcW w:type="dxa" w:w="1728"/>
           </w:tcPr>
           <w:p>
+            <w:pPr>
+              <w:spacing w:after="20" w:before="20"/>
+            </w:pPr>
             <w:r/>
             <w:r>
               <w:rPr>
                 <w:rFonts w:ascii="Times New Roman" w:hAnsi="Times New Roman"/>
                 <w:b w:val="0"/>
-                <w:i w:val="0"/>
                 <w:color w:val="000000"/>
                 <w:sz w:val="20"/>
               </w:rPr>
@@ -1197,12 +1224,14 @@
             <w:tcW w:type="dxa" w:w="1728"/>
           </w:tcPr>
           <w:p>
+            <w:pPr>
+              <w:spacing w:after="20" w:before="20"/>
+            </w:pPr>
             <w:r/>
             <w:r>
               <w:rPr>
                 <w:rFonts w:ascii="Times New Roman" w:hAnsi="Times New Roman"/>
                 <w:b w:val="0"/>
-                <w:i w:val="0"/>
                 <w:color w:val="000000"/>
                 <w:sz w:val="20"/>
               </w:rPr>
@@ -1215,12 +1244,14 @@
             <w:tcW w:type="dxa" w:w="1728"/>
           </w:tcPr>
           <w:p>
+            <w:pPr>
+              <w:spacing w:after="20" w:before="20"/>
+            </w:pPr>
             <w:r/>
             <w:r>
               <w:rPr>
                 <w:rFonts w:ascii="Times New Roman" w:hAnsi="Times New Roman"/>
                 <w:b w:val="0"/>
-                <w:i w:val="0"/>
                 <w:color w:val="000000"/>
                 <w:sz w:val="20"/>
               </w:rPr>
@@ -1233,12 +1264,14 @@
             <w:tcW w:type="dxa" w:w="1728"/>
           </w:tcPr>
           <w:p>
+            <w:pPr>
+              <w:spacing w:after="20" w:before="20"/>
+            </w:pPr>
             <w:r/>
             <w:r>
               <w:rPr>
                 <w:rFonts w:ascii="Times New Roman" w:hAnsi="Times New Roman"/>
                 <w:b w:val="0"/>
-                <w:i w:val="0"/>
                 <w:color w:val="000000"/>
                 <w:sz w:val="20"/>
               </w:rPr>
@@ -1251,12 +1284,14 @@
             <w:tcW w:type="dxa" w:w="1728"/>
           </w:tcPr>
           <w:p>
+            <w:pPr>
+              <w:spacing w:after="20" w:before="20"/>
+            </w:pPr>
             <w:r/>
             <w:r>
               <w:rPr>
                 <w:rFonts w:ascii="Times New Roman" w:hAnsi="Times New Roman"/>
                 <w:b w:val="0"/>
-                <w:i w:val="0"/>
                 <w:color w:val="000000"/>
                 <w:sz w:val="20"/>
               </w:rPr>
@@ -1269,12 +1304,14 @@
             <w:tcW w:type="dxa" w:w="1728"/>
           </w:tcPr>
           <w:p>
+            <w:pPr>
+              <w:spacing w:after="20" w:before="20"/>
+            </w:pPr>
             <w:r/>
             <w:r>
               <w:rPr>
                 <w:rFonts w:ascii="Times New Roman" w:hAnsi="Times New Roman"/>
                 <w:b w:val="0"/>
-                <w:i w:val="0"/>
                 <w:color w:val="000000"/>
                 <w:sz w:val="20"/>
               </w:rPr>
@@ -1289,12 +1326,14 @@
             <w:tcW w:type="dxa" w:w="1728"/>
           </w:tcPr>
           <w:p>
+            <w:pPr>
+              <w:spacing w:after="20" w:before="20"/>
+            </w:pPr>
             <w:r/>
             <w:r>
               <w:rPr>
                 <w:rFonts w:ascii="Times New Roman" w:hAnsi="Times New Roman"/>
                 <w:b w:val="0"/>
-                <w:i w:val="0"/>
                 <w:color w:val="000000"/>
                 <w:sz w:val="20"/>
               </w:rPr>
@@ -1307,12 +1346,14 @@
             <w:tcW w:type="dxa" w:w="1728"/>
           </w:tcPr>
           <w:p>
+            <w:pPr>
+              <w:spacing w:after="20" w:before="20"/>
+            </w:pPr>
             <w:r/>
             <w:r>
               <w:rPr>
                 <w:rFonts w:ascii="Times New Roman" w:hAnsi="Times New Roman"/>
                 <w:b w:val="0"/>
-                <w:i w:val="0"/>
                 <w:color w:val="000000"/>
                 <w:sz w:val="20"/>
               </w:rPr>
@@ -1325,12 +1366,14 @@
             <w:tcW w:type="dxa" w:w="1728"/>
           </w:tcPr>
           <w:p>
+            <w:pPr>
+              <w:spacing w:after="20" w:before="20"/>
+            </w:pPr>
             <w:r/>
             <w:r>
               <w:rPr>
                 <w:rFonts w:ascii="Times New Roman" w:hAnsi="Times New Roman"/>
                 <w:b w:val="0"/>
-                <w:i w:val="0"/>
                 <w:color w:val="000000"/>
                 <w:sz w:val="20"/>
               </w:rPr>
@@ -1343,12 +1386,14 @@
             <w:tcW w:type="dxa" w:w="1728"/>
           </w:tcPr>
           <w:p>
+            <w:pPr>
+              <w:spacing w:after="20" w:before="20"/>
+            </w:pPr>
             <w:r/>
             <w:r>
               <w:rPr>
                 <w:rFonts w:ascii="Times New Roman" w:hAnsi="Times New Roman"/>
                 <w:b w:val="0"/>
-                <w:i w:val="0"/>
                 <w:color w:val="000000"/>
                 <w:sz w:val="20"/>
               </w:rPr>
@@ -1361,12 +1406,14 @@
             <w:tcW w:type="dxa" w:w="1728"/>
           </w:tcPr>
           <w:p>
+            <w:pPr>
+              <w:spacing w:after="20" w:before="20"/>
+            </w:pPr>
             <w:r/>
             <w:r>
               <w:rPr>
                 <w:rFonts w:ascii="Times New Roman" w:hAnsi="Times New Roman"/>
                 <w:b w:val="0"/>
-                <w:i w:val="0"/>
                 <w:color w:val="000000"/>
                 <w:sz w:val="20"/>
               </w:rPr>
@@ -1381,12 +1428,14 @@
             <w:tcW w:type="dxa" w:w="1728"/>
           </w:tcPr>
           <w:p>
+            <w:pPr>
+              <w:spacing w:after="20" w:before="20"/>
+            </w:pPr>
             <w:r/>
             <w:r>
               <w:rPr>
                 <w:rFonts w:ascii="Times New Roman" w:hAnsi="Times New Roman"/>
                 <w:b w:val="0"/>
-                <w:i w:val="0"/>
                 <w:color w:val="000000"/>
                 <w:sz w:val="20"/>
               </w:rPr>
@@ -1399,12 +1448,14 @@
             <w:tcW w:type="dxa" w:w="1728"/>
           </w:tcPr>
           <w:p>
+            <w:pPr>
+              <w:spacing w:after="20" w:before="20"/>
+            </w:pPr>
             <w:r/>
             <w:r>
               <w:rPr>
                 <w:rFonts w:ascii="Times New Roman" w:hAnsi="Times New Roman"/>
                 <w:b w:val="0"/>
-                <w:i w:val="0"/>
                 <w:color w:val="000000"/>
                 <w:sz w:val="20"/>
               </w:rPr>
@@ -1417,12 +1468,14 @@
             <w:tcW w:type="dxa" w:w="1728"/>
           </w:tcPr>
           <w:p>
+            <w:pPr>
+              <w:spacing w:after="20" w:before="20"/>
+            </w:pPr>
             <w:r/>
             <w:r>
               <w:rPr>
                 <w:rFonts w:ascii="Times New Roman" w:hAnsi="Times New Roman"/>
                 <w:b w:val="0"/>
-                <w:i w:val="0"/>
                 <w:color w:val="000000"/>
                 <w:sz w:val="20"/>
               </w:rPr>
@@ -1435,12 +1488,14 @@
             <w:tcW w:type="dxa" w:w="1728"/>
           </w:tcPr>
           <w:p>
+            <w:pPr>
+              <w:spacing w:after="20" w:before="20"/>
+            </w:pPr>
             <w:r/>
             <w:r>
               <w:rPr>
                 <w:rFonts w:ascii="Times New Roman" w:hAnsi="Times New Roman"/>
                 <w:b w:val="0"/>
-                <w:i w:val="0"/>
                 <w:color w:val="000000"/>
                 <w:sz w:val="20"/>
               </w:rPr>
@@ -1453,12 +1508,14 @@
             <w:tcW w:type="dxa" w:w="1728"/>
           </w:tcPr>
           <w:p>
+            <w:pPr>
+              <w:spacing w:after="20" w:before="20"/>
+            </w:pPr>
             <w:r/>
             <w:r>
               <w:rPr>
                 <w:rFonts w:ascii="Times New Roman" w:hAnsi="Times New Roman"/>
                 <w:b w:val="0"/>
-                <w:i w:val="0"/>
                 <w:color w:val="000000"/>
                 <w:sz w:val="20"/>
               </w:rPr>
@@ -1473,12 +1530,14 @@
             <w:tcW w:type="dxa" w:w="1728"/>
           </w:tcPr>
           <w:p>
+            <w:pPr>
+              <w:spacing w:after="20" w:before="20"/>
+            </w:pPr>
             <w:r/>
             <w:r>
               <w:rPr>
                 <w:rFonts w:ascii="Times New Roman" w:hAnsi="Times New Roman"/>
                 <w:b w:val="0"/>
-                <w:i w:val="0"/>
                 <w:color w:val="000000"/>
                 <w:sz w:val="20"/>
               </w:rPr>
@@ -1491,12 +1550,14 @@
             <w:tcW w:type="dxa" w:w="1728"/>
           </w:tcPr>
           <w:p>
+            <w:pPr>
+              <w:spacing w:after="20" w:before="20"/>
+            </w:pPr>
             <w:r/>
             <w:r>
               <w:rPr>
                 <w:rFonts w:ascii="Times New Roman" w:hAnsi="Times New Roman"/>
                 <w:b w:val="0"/>
-                <w:i w:val="0"/>
                 <w:color w:val="000000"/>
                 <w:sz w:val="20"/>
               </w:rPr>
@@ -1509,12 +1570,14 @@
             <w:tcW w:type="dxa" w:w="1728"/>
           </w:tcPr>
           <w:p>
+            <w:pPr>
+              <w:spacing w:after="20" w:before="20"/>
+            </w:pPr>
             <w:r/>
             <w:r>
               <w:rPr>
                 <w:rFonts w:ascii="Times New Roman" w:hAnsi="Times New Roman"/>
                 <w:b w:val="0"/>
-                <w:i w:val="0"/>
                 <w:color w:val="000000"/>
                 <w:sz w:val="20"/>
               </w:rPr>
@@ -1527,12 +1590,14 @@
             <w:tcW w:type="dxa" w:w="1728"/>
           </w:tcPr>
           <w:p>
+            <w:pPr>
+              <w:spacing w:after="20" w:before="20"/>
+            </w:pPr>
             <w:r/>
             <w:r>
               <w:rPr>
                 <w:rFonts w:ascii="Times New Roman" w:hAnsi="Times New Roman"/>
                 <w:b w:val="0"/>
-                <w:i w:val="0"/>
                 <w:color w:val="000000"/>
                 <w:sz w:val="20"/>
               </w:rPr>
@@ -1545,12 +1610,14 @@
             <w:tcW w:type="dxa" w:w="1728"/>
           </w:tcPr>
           <w:p>
+            <w:pPr>
+              <w:spacing w:after="20" w:before="20"/>
+            </w:pPr>
             <w:r/>
             <w:r>
               <w:rPr>
                 <w:rFonts w:ascii="Times New Roman" w:hAnsi="Times New Roman"/>
                 <w:b w:val="0"/>
-                <w:i w:val="0"/>
                 <w:color w:val="000000"/>
                 <w:sz w:val="20"/>
               </w:rPr>
@@ -1565,12 +1632,14 @@
             <w:tcW w:type="dxa" w:w="1728"/>
           </w:tcPr>
           <w:p>
+            <w:pPr>
+              <w:spacing w:after="20" w:before="20"/>
+            </w:pPr>
             <w:r/>
             <w:r>
               <w:rPr>
                 <w:rFonts w:ascii="Times New Roman" w:hAnsi="Times New Roman"/>
                 <w:b w:val="0"/>
-                <w:i w:val="0"/>
                 <w:color w:val="000000"/>
                 <w:sz w:val="20"/>
               </w:rPr>
@@ -1583,12 +1652,14 @@
             <w:tcW w:type="dxa" w:w="1728"/>
           </w:tcPr>
           <w:p>
+            <w:pPr>
+              <w:spacing w:after="20" w:before="20"/>
+            </w:pPr>
             <w:r/>
             <w:r>
               <w:rPr>
                 <w:rFonts w:ascii="Times New Roman" w:hAnsi="Times New Roman"/>
                 <w:b w:val="0"/>
-                <w:i w:val="0"/>
                 <w:color w:val="000000"/>
                 <w:sz w:val="20"/>
               </w:rPr>
@@ -1601,12 +1672,14 @@
             <w:tcW w:type="dxa" w:w="1728"/>
           </w:tcPr>
           <w:p>
+            <w:pPr>
+              <w:spacing w:after="20" w:before="20"/>
+            </w:pPr>
             <w:r/>
             <w:r>
               <w:rPr>
                 <w:rFonts w:ascii="Times New Roman" w:hAnsi="Times New Roman"/>
                 <w:b w:val="0"/>
-                <w:i w:val="0"/>
                 <w:color w:val="000000"/>
                 <w:sz w:val="20"/>
               </w:rPr>
@@ -1619,12 +1692,14 @@
             <w:tcW w:type="dxa" w:w="1728"/>
           </w:tcPr>
           <w:p>
+            <w:pPr>
+              <w:spacing w:after="20" w:before="20"/>
+            </w:pPr>
             <w:r/>
             <w:r>
               <w:rPr>
                 <w:rFonts w:ascii="Times New Roman" w:hAnsi="Times New Roman"/>
                 <w:b w:val="0"/>
-                <w:i w:val="0"/>
                 <w:color w:val="000000"/>
                 <w:sz w:val="20"/>
               </w:rPr>
@@ -1637,12 +1712,14 @@
             <w:tcW w:type="dxa" w:w="1728"/>
           </w:tcPr>
           <w:p>
+            <w:pPr>
+              <w:spacing w:after="20" w:before="20"/>
+            </w:pPr>
             <w:r/>
             <w:r>
               <w:rPr>
                 <w:rFonts w:ascii="Times New Roman" w:hAnsi="Times New Roman"/>
                 <w:b w:val="0"/>
-                <w:i w:val="0"/>
                 <w:color w:val="000000"/>
                 <w:sz w:val="20"/>
               </w:rPr>
@@ -1657,12 +1734,14 @@
             <w:tcW w:type="dxa" w:w="1728"/>
           </w:tcPr>
           <w:p>
+            <w:pPr>
+              <w:spacing w:after="20" w:before="20"/>
+            </w:pPr>
             <w:r/>
             <w:r>
               <w:rPr>
                 <w:rFonts w:ascii="Times New Roman" w:hAnsi="Times New Roman"/>
                 <w:b w:val="0"/>
-                <w:i w:val="0"/>
                 <w:color w:val="000000"/>
                 <w:sz w:val="20"/>
               </w:rPr>
@@ -1675,12 +1754,14 @@
             <w:tcW w:type="dxa" w:w="1728"/>
           </w:tcPr>
           <w:p>
+            <w:pPr>
+              <w:spacing w:after="20" w:before="20"/>
+            </w:pPr>
             <w:r/>
             <w:r>
               <w:rPr>
                 <w:rFonts w:ascii="Times New Roman" w:hAnsi="Times New Roman"/>
                 <w:b w:val="0"/>
-                <w:i w:val="0"/>
                 <w:color w:val="000000"/>
                 <w:sz w:val="20"/>
               </w:rPr>
@@ -1693,12 +1774,14 @@
             <w:tcW w:type="dxa" w:w="1728"/>
           </w:tcPr>
           <w:p>
+            <w:pPr>
+              <w:spacing w:after="20" w:before="20"/>
+            </w:pPr>
             <w:r/>
             <w:r>
               <w:rPr>
                 <w:rFonts w:ascii="Times New Roman" w:hAnsi="Times New Roman"/>
                 <w:b w:val="0"/>
-                <w:i w:val="0"/>
                 <w:color w:val="000000"/>
                 <w:sz w:val="20"/>
               </w:rPr>
@@ -1711,12 +1794,14 @@
             <w:tcW w:type="dxa" w:w="1728"/>
           </w:tcPr>
           <w:p>
+            <w:pPr>
+              <w:spacing w:after="20" w:before="20"/>
+            </w:pPr>
             <w:r/>
             <w:r>
               <w:rPr>
                 <w:rFonts w:ascii="Times New Roman" w:hAnsi="Times New Roman"/>
                 <w:b w:val="0"/>
-                <w:i w:val="0"/>
                 <w:color w:val="000000"/>
                 <w:sz w:val="20"/>
               </w:rPr>
@@ -1729,12 +1814,14 @@
             <w:tcW w:type="dxa" w:w="1728"/>
           </w:tcPr>
           <w:p>
+            <w:pPr>
+              <w:spacing w:after="20" w:before="20"/>
+            </w:pPr>
             <w:r/>
             <w:r>
               <w:rPr>
                 <w:rFonts w:ascii="Times New Roman" w:hAnsi="Times New Roman"/>
                 <w:b w:val="0"/>
-                <w:i w:val="0"/>
                 <w:color w:val="000000"/>
                 <w:sz w:val="20"/>
               </w:rPr>
@@ -1749,12 +1836,14 @@
             <w:tcW w:type="dxa" w:w="1728"/>
           </w:tcPr>
           <w:p>
+            <w:pPr>
+              <w:spacing w:after="20" w:before="20"/>
+            </w:pPr>
             <w:r/>
             <w:r>
               <w:rPr>
                 <w:rFonts w:ascii="Times New Roman" w:hAnsi="Times New Roman"/>
                 <w:b w:val="0"/>
-                <w:i w:val="0"/>
                 <w:color w:val="000000"/>
                 <w:sz w:val="20"/>
               </w:rPr>
@@ -1767,12 +1856,14 @@
             <w:tcW w:type="dxa" w:w="1728"/>
           </w:tcPr>
           <w:p>
+            <w:pPr>
+              <w:spacing w:after="20" w:before="20"/>
+            </w:pPr>
             <w:r/>
             <w:r>
               <w:rPr>
                 <w:rFonts w:ascii="Times New Roman" w:hAnsi="Times New Roman"/>
                 <w:b w:val="0"/>
-                <w:i w:val="0"/>
                 <w:color w:val="000000"/>
                 <w:sz w:val="20"/>
               </w:rPr>
@@ -1785,12 +1876,14 @@
             <w:tcW w:type="dxa" w:w="1728"/>
           </w:tcPr>
           <w:p>
+            <w:pPr>
+              <w:spacing w:after="20" w:before="20"/>
+            </w:pPr>
             <w:r/>
             <w:r>
               <w:rPr>
                 <w:rFonts w:ascii="Times New Roman" w:hAnsi="Times New Roman"/>
                 <w:b w:val="0"/>
-                <w:i w:val="0"/>
                 <w:color w:val="000000"/>
                 <w:sz w:val="20"/>
               </w:rPr>
@@ -1803,12 +1896,14 @@
             <w:tcW w:type="dxa" w:w="1728"/>
           </w:tcPr>
           <w:p>
+            <w:pPr>
+              <w:spacing w:after="20" w:before="20"/>
+            </w:pPr>
             <w:r/>
             <w:r>
               <w:rPr>
                 <w:rFonts w:ascii="Times New Roman" w:hAnsi="Times New Roman"/>
                 <w:b w:val="0"/>
-                <w:i w:val="0"/>
                 <w:color w:val="000000"/>
                 <w:sz w:val="20"/>
               </w:rPr>
@@ -1821,12 +1916,14 @@
             <w:tcW w:type="dxa" w:w="1728"/>
           </w:tcPr>
           <w:p>
+            <w:pPr>
+              <w:spacing w:after="20" w:before="20"/>
+            </w:pPr>
             <w:r/>
             <w:r>
               <w:rPr>
                 <w:rFonts w:ascii="Times New Roman" w:hAnsi="Times New Roman"/>
                 <w:b w:val="0"/>
-                <w:i w:val="0"/>
                 <w:color w:val="000000"/>
                 <w:sz w:val="20"/>
               </w:rPr>
@@ -1841,12 +1938,14 @@
             <w:tcW w:type="dxa" w:w="1728"/>
           </w:tcPr>
           <w:p>
+            <w:pPr>
+              <w:spacing w:after="20" w:before="20"/>
+            </w:pPr>
             <w:r/>
             <w:r>
               <w:rPr>
                 <w:rFonts w:ascii="Times New Roman" w:hAnsi="Times New Roman"/>
                 <w:b w:val="0"/>
-                <w:i w:val="0"/>
                 <w:color w:val="000000"/>
                 <w:sz w:val="20"/>
               </w:rPr>
@@ -1859,12 +1958,14 @@
             <w:tcW w:type="dxa" w:w="1728"/>
           </w:tcPr>
           <w:p>
+            <w:pPr>
+              <w:spacing w:after="20" w:before="20"/>
+            </w:pPr>
             <w:r/>
             <w:r>
               <w:rPr>
                 <w:rFonts w:ascii="Times New Roman" w:hAnsi="Times New Roman"/>
                 <w:b w:val="0"/>
-                <w:i w:val="0"/>
                 <w:color w:val="000000"/>
                 <w:sz w:val="20"/>
               </w:rPr>
@@ -1877,12 +1978,14 @@
             <w:tcW w:type="dxa" w:w="1728"/>
           </w:tcPr>
           <w:p>
+            <w:pPr>
+              <w:spacing w:after="20" w:before="20"/>
+            </w:pPr>
             <w:r/>
             <w:r>
               <w:rPr>
                 <w:rFonts w:ascii="Times New Roman" w:hAnsi="Times New Roman"/>
                 <w:b w:val="0"/>
-                <w:i w:val="0"/>
                 <w:color w:val="000000"/>
                 <w:sz w:val="20"/>
               </w:rPr>
@@ -1895,12 +1998,14 @@
             <w:tcW w:type="dxa" w:w="1728"/>
           </w:tcPr>
           <w:p>
+            <w:pPr>
+              <w:spacing w:after="20" w:before="20"/>
+            </w:pPr>
             <w:r/>
             <w:r>
               <w:rPr>
                 <w:rFonts w:ascii="Times New Roman" w:hAnsi="Times New Roman"/>
                 <w:b w:val="0"/>
-                <w:i w:val="0"/>
                 <w:color w:val="000000"/>
                 <w:sz w:val="20"/>
               </w:rPr>
@@ -1913,12 +2018,14 @@
             <w:tcW w:type="dxa" w:w="1728"/>
           </w:tcPr>
           <w:p>
+            <w:pPr>
+              <w:spacing w:after="20" w:before="20"/>
+            </w:pPr>
             <w:r/>
             <w:r>
               <w:rPr>
                 <w:rFonts w:ascii="Times New Roman" w:hAnsi="Times New Roman"/>
                 <w:b w:val="0"/>
-                <w:i w:val="0"/>
                 <w:color w:val="000000"/>
                 <w:sz w:val="20"/>
               </w:rPr>
@@ -1928,10 +2035,99 @@
         </w:tc>
       </w:tr>
     </w:tbl>
-    <w:p/>
     <w:p>
       <w:pPr>
-        <w:spacing w:before="320" w:after="120"/>
+        <w:spacing w:after="80" w:before="160"/>
+      </w:pPr>
+      <w:r>
+        <w:rPr>
+          <w:rFonts w:ascii="Times New Roman" w:hAnsi="Times New Roman"/>
+          <w:b/>
+          <w:i w:val="0"/>
+          <w:color w:val="2F5496"/>
+          <w:sz w:val="24"/>
+        </w:rPr>
+        <w:t>3.1 How Confidence Levels Are Assigned</w:t>
+      </w:r>
+    </w:p>
+    <w:p>
+      <w:pPr>
+        <w:spacing w:after="60"/>
+      </w:pPr>
+      <w:r>
+        <w:rPr>
+          <w:rFonts w:ascii="Times New Roman" w:hAnsi="Times New Roman"/>
+          <w:b w:val="0"/>
+          <w:i w:val="0"/>
+          <w:color w:val="000000"/>
+          <w:sz w:val="22"/>
+        </w:rPr>
+        <w:t>Confidence levels in Table 1 are assigned according to the following criteria:</w:t>
+      </w:r>
+    </w:p>
+    <w:p>
+      <w:pPr>
+        <w:spacing w:after="60"/>
+      </w:pPr>
+      <w:r>
+        <w:rPr>
+          <w:rFonts w:ascii="Times New Roman" w:hAnsi="Times New Roman"/>
+          <w:b w:val="0"/>
+          <w:i w:val="0"/>
+          <w:color w:val="000000"/>
+          <w:sz w:val="22"/>
+        </w:rPr>
+        <w:t>• High: Replicated across two or more independent domains with holdout validation and rival model defeat. The result survives permutation tests, confound controls, and cross-domain replication.</w:t>
+      </w:r>
+    </w:p>
+    <w:p>
+      <w:pPr>
+        <w:spacing w:after="60"/>
+      </w:pPr>
+      <w:r>
+        <w:rPr>
+          <w:rFonts w:ascii="Times New Roman" w:hAnsi="Times New Roman"/>
+          <w:b w:val="0"/>
+          <w:i w:val="0"/>
+          <w:color w:val="000000"/>
+          <w:sz w:val="22"/>
+        </w:rPr>
+        <w:t>• Medium: Demonstrated in one domain or in simulation with robustness checks. The result is internally consistent and survives basic controls, but has not yet been independently replicated across domains.</w:t>
+      </w:r>
+    </w:p>
+    <w:p>
+      <w:pPr>
+        <w:spacing w:after="60"/>
+      </w:pPr>
+      <w:r>
+        <w:rPr>
+          <w:rFonts w:ascii="Times New Roman" w:hAnsi="Times New Roman"/>
+          <w:b w:val="0"/>
+          <w:i w:val="0"/>
+          <w:color w:val="000000"/>
+          <w:sz w:val="22"/>
+        </w:rPr>
+        <w:t>• Low: Theoretically predicted by the TFP framework but not yet empirically tested, or tested only indirectly.</w:t>
+      </w:r>
+    </w:p>
+    <w:p>
+      <w:pPr>
+        <w:spacing w:after="60"/>
+      </w:pPr>
+      <w:r>
+        <w:rPr>
+          <w:rFonts w:ascii="Times New Roman" w:hAnsi="Times New Roman"/>
+          <w:b w:val="0"/>
+          <w:i w:val="0"/>
+          <w:color w:val="000000"/>
+          <w:sz w:val="22"/>
+        </w:rPr>
+        <w:t>• Open: Identified as a testable prediction but no data have been collected. These represent future research directions rather than current claims.</w:t>
+      </w:r>
+    </w:p>
+    <w:p>
+      <w:pPr>
+        <w:spacing w:after="120" w:before="240"/>
       </w:pPr>
       <w:r>
         <w:rPr>
@@ -1946,7 +2142,7 @@
     </w:p>
     <w:p>
       <w:pPr>
-        <w:spacing w:before="0" w:after="60" w:line="260" w:lineRule="exact"/>
+        <w:spacing w:after="60"/>
       </w:pPr>
       <w:r>
         <w:rPr>
@@ -1956,27 +2152,27 @@
           <w:color w:val="000000"/>
           <w:sz w:val="22"/>
         </w:rPr>
-        <w:t>TFP’s claims are not equally strong. The following hierarchy ranks them by empirical support, from the most robustly validated to the most speculative.</w:t>
+        <w:t>TFP's claims are not equally strong. The following hierarchy ranks them by empirical support, from the most robustly validated to the most speculative.</w:t>
       </w:r>
     </w:p>
     <w:p>
       <w:pPr>
-        <w:spacing w:before="200" w:after="80"/>
+        <w:spacing w:after="40" w:before="120"/>
       </w:pPr>
       <w:r>
         <w:rPr>
           <w:rFonts w:ascii="Times New Roman" w:hAnsi="Times New Roman"/>
           <w:b/>
           <w:i w:val="0"/>
-          <w:color w:val="2F5496"/>
-          <w:sz w:val="24"/>
+          <w:color w:val="000000"/>
+          <w:sz w:val="22"/>
         </w:rPr>
         <w:t>Level 1 (Strongest): Stage Non-Interchangeability and Transition Topology</w:t>
       </w:r>
     </w:p>
     <w:p>
       <w:pPr>
-        <w:spacing w:before="0" w:after="60" w:line="260" w:lineRule="exact"/>
+        <w:spacing w:after="60"/>
       </w:pPr>
       <w:r>
         <w:rPr>
@@ -1991,22 +2187,22 @@
     </w:p>
     <w:p>
       <w:pPr>
-        <w:spacing w:before="200" w:after="80"/>
+        <w:spacing w:after="40" w:before="120"/>
       </w:pPr>
       <w:r>
         <w:rPr>
           <w:rFonts w:ascii="Times New Roman" w:hAnsi="Times New Roman"/>
           <w:b/>
           <w:i w:val="0"/>
-          <w:color w:val="2F5496"/>
-          <w:sz w:val="24"/>
+          <w:color w:val="000000"/>
+          <w:sz w:val="22"/>
         </w:rPr>
         <w:t>Level 2 (Strong): Viability-Gated Q4 Bifurcation and Reseeding Structure</w:t>
       </w:r>
     </w:p>
     <w:p>
       <w:pPr>
-        <w:spacing w:before="0" w:after="60" w:line="260" w:lineRule="exact"/>
+        <w:spacing w:after="60"/>
       </w:pPr>
       <w:r>
         <w:rPr>
@@ -2021,22 +2217,22 @@
     </w:p>
     <w:p>
       <w:pPr>
-        <w:spacing w:before="200" w:after="80"/>
+        <w:spacing w:after="40" w:before="120"/>
       </w:pPr>
       <w:r>
         <w:rPr>
           <w:rFonts w:ascii="Times New Roman" w:hAnsi="Times New Roman"/>
           <w:b/>
           <w:i w:val="0"/>
-          <w:color w:val="2F5496"/>
-          <w:sz w:val="24"/>
+          <w:color w:val="000000"/>
+          <w:sz w:val="22"/>
         </w:rPr>
         <w:t>Level 3 (Supported): Stage-Specific Operator Binding</w:t>
       </w:r>
     </w:p>
     <w:p>
       <w:pPr>
-        <w:spacing w:before="0" w:after="60" w:line="260" w:lineRule="exact"/>
+        <w:spacing w:after="60"/>
       </w:pPr>
       <w:r>
         <w:rPr>
@@ -2051,22 +2247,22 @@
     </w:p>
     <w:p>
       <w:pPr>
-        <w:spacing w:before="200" w:after="80"/>
+        <w:spacing w:after="40" w:before="120"/>
       </w:pPr>
       <w:r>
         <w:rPr>
           <w:rFonts w:ascii="Times New Roman" w:hAnsi="Times New Roman"/>
           <w:b/>
           <w:i w:val="0"/>
-          <w:color w:val="2F5496"/>
-          <w:sz w:val="24"/>
+          <w:color w:val="000000"/>
+          <w:sz w:val="22"/>
         </w:rPr>
         <w:t>Level 4 (Proposed): Full Grammar, EIL Dynamics, Cross-Scale Isomorphism</w:t>
       </w:r>
     </w:p>
     <w:p>
       <w:pPr>
-        <w:spacing w:before="0" w:after="60" w:line="260" w:lineRule="exact"/>
+        <w:spacing w:after="60"/>
       </w:pPr>
       <w:r>
         <w:rPr>
@@ -2081,7 +2277,7 @@
     </w:p>
     <w:p>
       <w:pPr>
-        <w:spacing w:before="320" w:after="120"/>
+        <w:spacing w:after="120" w:before="240"/>
       </w:pPr>
       <w:r>
         <w:rPr>
@@ -2091,12 +2287,12 @@
           <w:color w:val="2F5496"/>
           <w:sz w:val="28"/>
         </w:rPr>
-        <w:t>5. Operator Definitions (Locked)</w:t>
+        <w:t>5. Canonical Operational Definitions (v1.0)</w:t>
       </w:r>
     </w:p>
     <w:p>
       <w:pPr>
-        <w:spacing w:before="0" w:after="60" w:line="260" w:lineRule="exact"/>
+        <w:spacing w:after="60"/>
       </w:pPr>
       <w:r>
         <w:rPr>
@@ -2106,22 +2302,22 @@
           <w:color w:val="000000"/>
           <w:sz w:val="22"/>
         </w:rPr>
-        <w:t>Table 2 provides the locked operator definitions used across all TFP papers. These definitions are fixed for the current research program; any modification would require explicit justification and versioning.</w:t>
+        <w:t>Table 2 provides the canonical operational definitions used across all TFP papers. These definitions represent version 1.0 of the measurement framework. Three of four operators (E_out, E_in, B_out) have been validated across multiple institutional domains; B_in has not been independently tested. Future revisions would require explicit justification and versioning.</w:t>
       </w:r>
     </w:p>
     <w:p>
       <w:pPr>
-        <w:spacing w:before="0" w:after="60" w:line="260" w:lineRule="exact"/>
+        <w:spacing w:after="80"/>
       </w:pPr>
       <w:r>
         <w:rPr>
           <w:rFonts w:ascii="Times New Roman" w:hAnsi="Times New Roman"/>
-          <w:b w:val="0"/>
-          <w:i w:val="0"/>
+          <w:b/>
+          <w:i/>
           <w:color w:val="000000"/>
-          <w:sz w:val="22"/>
+          <w:sz w:val="20"/>
         </w:rPr>
-        <w:t>Table 2. TFP Information Operators</w:t>
+        <w:t>Table 2. TFP Information Operators (v1.0)</w:t>
       </w:r>
     </w:p>
     <w:tbl>
@@ -2130,12 +2326,12 @@
         <w:jc w:val="center"/>
         <w:tblLook w:firstColumn="1" w:firstRow="1" w:lastColumn="0" w:lastRow="0" w:noHBand="0" w:noVBand="1" w:val="04A0"/>
         <w:tblBorders>
-          <w:top w:val="single" w:sz="4" w:space="0" w:color="999999"/>
-          <w:left w:val="single" w:sz="4" w:space="0" w:color="999999"/>
-          <w:bottom w:val="single" w:sz="4" w:space="0" w:color="999999"/>
-          <w:right w:val="single" w:sz="4" w:space="0" w:color="999999"/>
-          <w:insideH w:val="single" w:sz="4" w:space="0" w:color="999999"/>
-          <w:insideV w:val="single" w:sz="4" w:space="0" w:color="999999"/>
+          <w:top w:val="single" w:sz="4" w:space="0" w:color="808080"/>
+          <w:left w:val="single" w:sz="4" w:space="0" w:color="808080"/>
+          <w:bottom w:val="single" w:sz="4" w:space="0" w:color="808080"/>
+          <w:right w:val="single" w:sz="4" w:space="0" w:color="808080"/>
+          <w:insideH w:val="single" w:sz="4" w:space="0" w:color="808080"/>
+          <w:insideV w:val="single" w:sz="4" w:space="0" w:color="808080"/>
         </w:tblBorders>
       </w:tblPr>
       <w:tblGrid>
@@ -2149,16 +2345,18 @@
         <w:tc>
           <w:tcPr>
             <w:tcW w:type="dxa" w:w="1728"/>
-            <w:shd w:fill="4472C4"/>
+            <w:shd w:fill="D9E2F3" w:val="clear"/>
           </w:tcPr>
           <w:p>
+            <w:pPr>
+              <w:spacing w:after="20" w:before="20"/>
+            </w:pPr>
             <w:r/>
             <w:r>
               <w:rPr>
                 <w:rFonts w:ascii="Times New Roman" w:hAnsi="Times New Roman"/>
                 <w:b/>
-                <w:i w:val="0"/>
-                <w:color w:val="FFFFFF"/>
+                <w:color w:val="000000"/>
                 <w:sz w:val="20"/>
               </w:rPr>
               <w:t>Operator</w:t>
@@ -2168,16 +2366,18 @@
         <w:tc>
           <w:tcPr>
             <w:tcW w:type="dxa" w:w="1728"/>
-            <w:shd w:fill="4472C4"/>
+            <w:shd w:fill="D9E2F3" w:val="clear"/>
           </w:tcPr>
           <w:p>
+            <w:pPr>
+              <w:spacing w:after="20" w:before="20"/>
+            </w:pPr>
             <w:r/>
             <w:r>
               <w:rPr>
                 <w:rFonts w:ascii="Times New Roman" w:hAnsi="Times New Roman"/>
                 <w:b/>
-                <w:i w:val="0"/>
-                <w:color w:val="FFFFFF"/>
+                <w:color w:val="000000"/>
                 <w:sz w:val="20"/>
               </w:rPr>
               <w:t>Symbol</w:t>
@@ -2187,16 +2387,18 @@
         <w:tc>
           <w:tcPr>
             <w:tcW w:type="dxa" w:w="1728"/>
-            <w:shd w:fill="4472C4"/>
+            <w:shd w:fill="D9E2F3" w:val="clear"/>
           </w:tcPr>
           <w:p>
+            <w:pPr>
+              <w:spacing w:after="20" w:before="20"/>
+            </w:pPr>
             <w:r/>
             <w:r>
               <w:rPr>
                 <w:rFonts w:ascii="Times New Roman" w:hAnsi="Times New Roman"/>
                 <w:b/>
-                <w:i w:val="0"/>
-                <w:color w:val="FFFFFF"/>
+                <w:color w:val="000000"/>
                 <w:sz w:val="20"/>
               </w:rPr>
               <w:t>Definition</w:t>
@@ -2206,16 +2408,18 @@
         <w:tc>
           <w:tcPr>
             <w:tcW w:type="dxa" w:w="1728"/>
-            <w:shd w:fill="4472C4"/>
+            <w:shd w:fill="D9E2F3" w:val="clear"/>
           </w:tcPr>
           <w:p>
+            <w:pPr>
+              <w:spacing w:after="20" w:before="20"/>
+            </w:pPr>
             <w:r/>
             <w:r>
               <w:rPr>
                 <w:rFonts w:ascii="Times New Roman" w:hAnsi="Times New Roman"/>
                 <w:b/>
-                <w:i w:val="0"/>
-                <w:color w:val="FFFFFF"/>
+                <w:color w:val="000000"/>
                 <w:sz w:val="20"/>
               </w:rPr>
               <w:t>Measurable As</w:t>
@@ -2225,19 +2429,21 @@
         <w:tc>
           <w:tcPr>
             <w:tcW w:type="dxa" w:w="1728"/>
-            <w:shd w:fill="4472C4"/>
+            <w:shd w:fill="D9E2F3" w:val="clear"/>
           </w:tcPr>
           <w:p>
+            <w:pPr>
+              <w:spacing w:after="20" w:before="20"/>
+            </w:pPr>
             <w:r/>
             <w:r>
               <w:rPr>
                 <w:rFonts w:ascii="Times New Roman" w:hAnsi="Times New Roman"/>
                 <w:b/>
-                <w:i w:val="0"/>
-                <w:color w:val="FFFFFF"/>
+                <w:color w:val="000000"/>
                 <w:sz w:val="20"/>
               </w:rPr>
-              <w:t>Domains Tested</w:t>
+              <w:t>Validation Status</w:t>
             </w:r>
           </w:p>
         </w:tc>
@@ -2248,12 +2454,14 @@
             <w:tcW w:type="dxa" w:w="1728"/>
           </w:tcPr>
           <w:p>
+            <w:pPr>
+              <w:spacing w:after="20" w:before="20"/>
+            </w:pPr>
             <w:r/>
             <w:r>
               <w:rPr>
                 <w:rFonts w:ascii="Times New Roman" w:hAnsi="Times New Roman"/>
                 <w:b w:val="0"/>
-                <w:i w:val="0"/>
                 <w:color w:val="000000"/>
                 <w:sz w:val="20"/>
               </w:rPr>
@@ -2266,12 +2474,14 @@
             <w:tcW w:type="dxa" w:w="1728"/>
           </w:tcPr>
           <w:p>
+            <w:pPr>
+              <w:spacing w:after="20" w:before="20"/>
+            </w:pPr>
             <w:r/>
             <w:r>
               <w:rPr>
                 <w:rFonts w:ascii="Times New Roman" w:hAnsi="Times New Roman"/>
                 <w:b w:val="0"/>
-                <w:i w:val="0"/>
                 <w:color w:val="000000"/>
                 <w:sz w:val="20"/>
               </w:rPr>
@@ -2284,12 +2494,14 @@
             <w:tcW w:type="dxa" w:w="1728"/>
           </w:tcPr>
           <w:p>
+            <w:pPr>
+              <w:spacing w:after="20" w:before="20"/>
+            </w:pPr>
             <w:r/>
             <w:r>
               <w:rPr>
                 <w:rFonts w:ascii="Times New Roman" w:hAnsi="Times New Roman"/>
                 <w:b w:val="0"/>
-                <w:i w:val="0"/>
                 <w:color w:val="000000"/>
                 <w:sz w:val="20"/>
               </w:rPr>
@@ -2302,12 +2514,14 @@
             <w:tcW w:type="dxa" w:w="1728"/>
           </w:tcPr>
           <w:p>
+            <w:pPr>
+              <w:spacing w:after="20" w:before="20"/>
+            </w:pPr>
             <w:r/>
             <w:r>
               <w:rPr>
                 <w:rFonts w:ascii="Times New Roman" w:hAnsi="Times New Roman"/>
                 <w:b w:val="0"/>
-                <w:i w:val="0"/>
                 <w:color w:val="000000"/>
                 <w:sz w:val="20"/>
               </w:rPr>
@@ -2320,12 +2534,14 @@
             <w:tcW w:type="dxa" w:w="1728"/>
           </w:tcPr>
           <w:p>
+            <w:pPr>
+              <w:spacing w:after="20" w:before="20"/>
+            </w:pPr>
             <w:r/>
             <w:r>
               <w:rPr>
                 <w:rFonts w:ascii="Times New Roman" w:hAnsi="Times New Roman"/>
                 <w:b w:val="0"/>
-                <w:i w:val="0"/>
                 <w:color w:val="000000"/>
                 <w:sz w:val="20"/>
               </w:rPr>
@@ -2340,12 +2556,14 @@
             <w:tcW w:type="dxa" w:w="1728"/>
           </w:tcPr>
           <w:p>
+            <w:pPr>
+              <w:spacing w:after="20" w:before="20"/>
+            </w:pPr>
             <w:r/>
             <w:r>
               <w:rPr>
                 <w:rFonts w:ascii="Times New Roman" w:hAnsi="Times New Roman"/>
                 <w:b w:val="0"/>
-                <w:i w:val="0"/>
                 <w:color w:val="000000"/>
                 <w:sz w:val="20"/>
               </w:rPr>
@@ -2358,12 +2576,14 @@
             <w:tcW w:type="dxa" w:w="1728"/>
           </w:tcPr>
           <w:p>
+            <w:pPr>
+              <w:spacing w:after="20" w:before="20"/>
+            </w:pPr>
             <w:r/>
             <w:r>
               <w:rPr>
                 <w:rFonts w:ascii="Times New Roman" w:hAnsi="Times New Roman"/>
                 <w:b w:val="0"/>
-                <w:i w:val="0"/>
                 <w:color w:val="000000"/>
                 <w:sz w:val="20"/>
               </w:rPr>
@@ -2376,12 +2596,14 @@
             <w:tcW w:type="dxa" w:w="1728"/>
           </w:tcPr>
           <w:p>
+            <w:pPr>
+              <w:spacing w:after="20" w:before="20"/>
+            </w:pPr>
             <w:r/>
             <w:r>
               <w:rPr>
                 <w:rFonts w:ascii="Times New Roman" w:hAnsi="Times New Roman"/>
                 <w:b w:val="0"/>
-                <w:i w:val="0"/>
                 <w:color w:val="000000"/>
                 <w:sz w:val="20"/>
               </w:rPr>
@@ -2394,12 +2616,14 @@
             <w:tcW w:type="dxa" w:w="1728"/>
           </w:tcPr>
           <w:p>
+            <w:pPr>
+              <w:spacing w:after="20" w:before="20"/>
+            </w:pPr>
             <w:r/>
             <w:r>
               <w:rPr>
                 <w:rFonts w:ascii="Times New Roman" w:hAnsi="Times New Roman"/>
                 <w:b w:val="0"/>
-                <w:i w:val="0"/>
                 <w:color w:val="000000"/>
                 <w:sz w:val="20"/>
               </w:rPr>
@@ -2412,16 +2636,18 @@
             <w:tcW w:type="dxa" w:w="1728"/>
           </w:tcPr>
           <w:p>
+            <w:pPr>
+              <w:spacing w:after="20" w:before="20"/>
+            </w:pPr>
             <w:r/>
             <w:r>
               <w:rPr>
                 <w:rFonts w:ascii="Times New Roman" w:hAnsi="Times New Roman"/>
                 <w:b w:val="0"/>
-                <w:i w:val="0"/>
                 <w:color w:val="000000"/>
                 <w:sz w:val="20"/>
               </w:rPr>
-              <w:t>IETF, Patents, CT.gov, FR-EPA</w:t>
+              <w:t>Validated (4 domains)</w:t>
             </w:r>
           </w:p>
         </w:tc>
@@ -2432,12 +2658,14 @@
             <w:tcW w:type="dxa" w:w="1728"/>
           </w:tcPr>
           <w:p>
+            <w:pPr>
+              <w:spacing w:after="20" w:before="20"/>
+            </w:pPr>
             <w:r/>
             <w:r>
               <w:rPr>
                 <w:rFonts w:ascii="Times New Roman" w:hAnsi="Times New Roman"/>
                 <w:b w:val="0"/>
-                <w:i w:val="0"/>
                 <w:color w:val="000000"/>
                 <w:sz w:val="20"/>
               </w:rPr>
@@ -2450,12 +2678,14 @@
             <w:tcW w:type="dxa" w:w="1728"/>
           </w:tcPr>
           <w:p>
+            <w:pPr>
+              <w:spacing w:after="20" w:before="20"/>
+            </w:pPr>
             <w:r/>
             <w:r>
               <w:rPr>
                 <w:rFonts w:ascii="Times New Roman" w:hAnsi="Times New Roman"/>
                 <w:b w:val="0"/>
-                <w:i w:val="0"/>
                 <w:color w:val="000000"/>
                 <w:sz w:val="20"/>
               </w:rPr>
@@ -2468,12 +2698,14 @@
             <w:tcW w:type="dxa" w:w="1728"/>
           </w:tcPr>
           <w:p>
+            <w:pPr>
+              <w:spacing w:after="20" w:before="20"/>
+            </w:pPr>
             <w:r/>
             <w:r>
               <w:rPr>
                 <w:rFonts w:ascii="Times New Roman" w:hAnsi="Times New Roman"/>
                 <w:b w:val="0"/>
-                <w:i w:val="0"/>
                 <w:color w:val="000000"/>
                 <w:sz w:val="20"/>
               </w:rPr>
@@ -2486,12 +2718,14 @@
             <w:tcW w:type="dxa" w:w="1728"/>
           </w:tcPr>
           <w:p>
+            <w:pPr>
+              <w:spacing w:after="20" w:before="20"/>
+            </w:pPr>
             <w:r/>
             <w:r>
               <w:rPr>
                 <w:rFonts w:ascii="Times New Roman" w:hAnsi="Times New Roman"/>
                 <w:b w:val="0"/>
-                <w:i w:val="0"/>
                 <w:color w:val="000000"/>
                 <w:sz w:val="20"/>
               </w:rPr>
@@ -2504,16 +2738,18 @@
             <w:tcW w:type="dxa" w:w="1728"/>
           </w:tcPr>
           <w:p>
+            <w:pPr>
+              <w:spacing w:after="20" w:before="20"/>
+            </w:pPr>
             <w:r/>
             <w:r>
               <w:rPr>
                 <w:rFonts w:ascii="Times New Roman" w:hAnsi="Times New Roman"/>
                 <w:b w:val="0"/>
-                <w:i w:val="0"/>
                 <w:color w:val="000000"/>
                 <w:sz w:val="20"/>
               </w:rPr>
-              <w:t>IETF, FR-EPA, CT.gov, Patents</w:t>
+              <w:t>Validated (4 domains)</w:t>
             </w:r>
           </w:p>
         </w:tc>
@@ -2524,12 +2760,14 @@
             <w:tcW w:type="dxa" w:w="1728"/>
           </w:tcPr>
           <w:p>
+            <w:pPr>
+              <w:spacing w:after="20" w:before="20"/>
+            </w:pPr>
             <w:r/>
             <w:r>
               <w:rPr>
                 <w:rFonts w:ascii="Times New Roman" w:hAnsi="Times New Roman"/>
                 <w:b w:val="0"/>
-                <w:i w:val="0"/>
                 <w:color w:val="000000"/>
                 <w:sz w:val="20"/>
               </w:rPr>
@@ -2542,12 +2780,14 @@
             <w:tcW w:type="dxa" w:w="1728"/>
           </w:tcPr>
           <w:p>
+            <w:pPr>
+              <w:spacing w:after="20" w:before="20"/>
+            </w:pPr>
             <w:r/>
             <w:r>
               <w:rPr>
                 <w:rFonts w:ascii="Times New Roman" w:hAnsi="Times New Roman"/>
                 <w:b w:val="0"/>
-                <w:i w:val="0"/>
                 <w:color w:val="000000"/>
                 <w:sz w:val="20"/>
               </w:rPr>
@@ -2560,12 +2800,14 @@
             <w:tcW w:type="dxa" w:w="1728"/>
           </w:tcPr>
           <w:p>
+            <w:pPr>
+              <w:spacing w:after="20" w:before="20"/>
+            </w:pPr>
             <w:r/>
             <w:r>
               <w:rPr>
                 <w:rFonts w:ascii="Times New Roman" w:hAnsi="Times New Roman"/>
                 <w:b w:val="0"/>
-                <w:i w:val="0"/>
                 <w:color w:val="000000"/>
                 <w:sz w:val="20"/>
               </w:rPr>
@@ -2578,12 +2820,14 @@
             <w:tcW w:type="dxa" w:w="1728"/>
           </w:tcPr>
           <w:p>
+            <w:pPr>
+              <w:spacing w:after="20" w:before="20"/>
+            </w:pPr>
             <w:r/>
             <w:r>
               <w:rPr>
                 <w:rFonts w:ascii="Times New Roman" w:hAnsi="Times New Roman"/>
                 <w:b w:val="0"/>
-                <w:i w:val="0"/>
                 <w:color w:val="000000"/>
                 <w:sz w:val="20"/>
               </w:rPr>
@@ -2596,25 +2840,26 @@
             <w:tcW w:type="dxa" w:w="1728"/>
           </w:tcPr>
           <w:p>
+            <w:pPr>
+              <w:spacing w:after="20" w:before="20"/>
+            </w:pPr>
             <w:r/>
             <w:r>
               <w:rPr>
                 <w:rFonts w:ascii="Times New Roman" w:hAnsi="Times New Roman"/>
                 <w:b w:val="0"/>
-                <w:i w:val="0"/>
                 <w:color w:val="000000"/>
                 <w:sz w:val="20"/>
               </w:rPr>
-              <w:t>All 4 domains</w:t>
+              <w:t>Validated (4 domains)</w:t>
             </w:r>
           </w:p>
         </w:tc>
       </w:tr>
     </w:tbl>
-    <w:p/>
     <w:p>
       <w:pPr>
-        <w:spacing w:before="320" w:after="120"/>
+        <w:spacing w:after="120" w:before="240"/>
       </w:pPr>
       <w:r>
         <w:rPr>
@@ -2629,7 +2874,7 @@
     </w:p>
     <w:p>
       <w:pPr>
-        <w:spacing w:before="0" w:after="60" w:line="260" w:lineRule="exact"/>
+        <w:spacing w:after="60"/>
       </w:pPr>
       <w:r>
         <w:rPr>
@@ -2639,12 +2884,12 @@
           <w:color w:val="000000"/>
           <w:sz w:val="22"/>
         </w:rPr>
-        <w:t>This section provides step-by-step guidance for researchers who wish to test TFP’s predictions on a new lifecycle dataset.</w:t>
+        <w:t>This section provides step-by-step guidance for researchers who wish to test TFP predictions on a new lifecycle dataset.</w:t>
       </w:r>
     </w:p>
     <w:p>
       <w:pPr>
-        <w:spacing w:before="200" w:after="80"/>
+        <w:spacing w:after="80" w:before="160"/>
       </w:pPr>
       <w:r>
         <w:rPr>
@@ -2654,13 +2899,12 @@
           <w:color w:val="2F5496"/>
           <w:sz w:val="24"/>
         </w:rPr>
-        <w:t>6.1 Full Test Protocol</w:t>
+        <w:t>6.1 Prerequisites</w:t>
       </w:r>
     </w:p>
     <w:p>
       <w:pPr>
-        <w:spacing w:before="0" w:after="40" w:line="260" w:lineRule="exact"/>
-        <w:ind w:left="720" w:hanging="360"/>
+        <w:spacing w:after="60"/>
       </w:pPr>
       <w:r>
         <w:rPr>
@@ -2670,13 +2914,12 @@
           <w:color w:val="000000"/>
           <w:sz w:val="22"/>
         </w:rPr>
-        <w:t>1. Identify a system with staged lifecycle progression. The system must have discrete, temporally ordered stages with observable transitions. Examples: software development sprints, legislative processes, product development pipelines, biological development stages, disease progression.</w:t>
+        <w:t>Before beginning a TFP test, verify that your data meets the following minimum requirements:</w:t>
       </w:r>
     </w:p>
     <w:p>
       <w:pPr>
-        <w:spacing w:before="0" w:after="40" w:line="260" w:lineRule="exact"/>
-        <w:ind w:left="720" w:hanging="360"/>
+        <w:spacing w:after="60"/>
       </w:pPr>
       <w:r>
         <w:rPr>
@@ -2686,13 +2929,12 @@
           <w:color w:val="000000"/>
           <w:sz w:val="22"/>
         </w:rPr>
-        <w:t>2. Map institutional or natural stage boundaries to Q1–Q4. Each stage should correspond to one quadrant based on the dominant information-processing function performed at that stage. Q1 = internal orientation and early exploration; Q2 = external gathering and selection; Q3 = internal narrowing and refinement; Q4 = external commitment and deployment.</w:t>
+        <w:t>• Timestamped lifecycle data with three or more discrete, temporally ordered stages.</w:t>
       </w:r>
     </w:p>
     <w:p>
       <w:pPr>
-        <w:spacing w:before="0" w:after="40" w:line="260" w:lineRule="exact"/>
-        <w:ind w:left="720" w:hanging="360"/>
+        <w:spacing w:after="60"/>
       </w:pPr>
       <w:r>
         <w:rPr>
@@ -2702,13 +2944,12 @@
           <w:color w:val="000000"/>
           <w:sz w:val="22"/>
         </w:rPr>
-        <w:t>3. For each stage, measure the predicted operator’s signal strength. Use the operator proxies from Table 2 or develop domain-appropriate equivalents. The key requirement is that each operator must be measured independently—do not use a single metric as a proxy for multiple operators.</w:t>
+        <w:t>• At least one measurable proxy for each operator you intend to test (see Table 2). At minimum, an external coupling metric (e.g., cross-references, external collaborators, incoming citations) is required for the minimum viable test.</w:t>
       </w:r>
     </w:p>
     <w:p>
       <w:pPr>
-        <w:spacing w:before="0" w:after="40" w:line="260" w:lineRule="exact"/>
-        <w:ind w:left="720" w:hanging="360"/>
+        <w:spacing w:after="60"/>
       </w:pPr>
       <w:r>
         <w:rPr>
@@ -2718,13 +2959,12 @@
           <w:color w:val="000000"/>
           <w:sz w:val="22"/>
         </w:rPr>
-        <w:t>4. Run the permutation search. For 3 operators, there are 3! = 6 possible operator–stage assignments. For 4 operators, there are 4! = 24. TFP predicts that its assignment will produce the strongest aggregate signal. Compute a composite fit metric for each permutation and rank them.</w:t>
+        <w:t>• A sample size sufficient for permutation testing. As a rough guideline, 50+ lifecycle instances provide adequate power for the permutation search; smaller samples can be used for exploratory analysis but limit statistical conclusions.</w:t>
       </w:r>
     </w:p>
     <w:p>
       <w:pPr>
-        <w:spacing w:before="0" w:after="40" w:line="260" w:lineRule="exact"/>
-        <w:ind w:left="720" w:hanging="360"/>
+        <w:spacing w:after="60"/>
       </w:pPr>
       <w:r>
         <w:rPr>
@@ -2734,13 +2974,27 @@
           <w:color w:val="000000"/>
           <w:sz w:val="22"/>
         </w:rPr>
-        <w:t>5. Run the wrong-stage permutation test. Shuffle the stage labels while keeping operator assignments fixed. TFP predicts that shuffling stages will destroy the signal.</w:t>
+        <w:t>• Stage boundaries defined independently of TFP predictions (i.e., based on institutional rules, natural transitions, or domain conventions rather than post hoc optimization).</w:t>
       </w:r>
     </w:p>
     <w:p>
       <w:pPr>
-        <w:spacing w:before="0" w:after="40" w:line="260" w:lineRule="exact"/>
-        <w:ind w:left="720" w:hanging="360"/>
+        <w:spacing w:after="80" w:before="160"/>
+      </w:pPr>
+      <w:r>
+        <w:rPr>
+          <w:rFonts w:ascii="Times New Roman" w:hAnsi="Times New Roman"/>
+          <w:b/>
+          <w:i w:val="0"/>
+          <w:color w:val="2F5496"/>
+          <w:sz w:val="24"/>
+        </w:rPr>
+        <w:t>6.2 Expected Time Investment</w:t>
+      </w:r>
+    </w:p>
+    <w:p>
+      <w:pPr>
+        <w:spacing w:after="60"/>
       </w:pPr>
       <w:r>
         <w:rPr>
@@ -2750,13 +3004,12 @@
           <w:color w:val="000000"/>
           <w:sz w:val="22"/>
         </w:rPr>
-        <w:t>6. Run holdout validation. Split data temporally or by subsample. TFP predicts that results will replicate on held-out data.</w:t>
+        <w:t>• Minimum viable test (Section 6.4): 1–2 days, assuming data are already in tabular form with stage labels and at least one operator proxy.</w:t>
       </w:r>
     </w:p>
     <w:p>
       <w:pPr>
-        <w:spacing w:before="0" w:after="40" w:line="260" w:lineRule="exact"/>
-        <w:ind w:left="720" w:hanging="360"/>
+        <w:spacing w:after="60"/>
       </w:pPr>
       <w:r>
         <w:rPr>
@@ -2766,12 +3019,12 @@
           <w:color w:val="000000"/>
           <w:sz w:val="22"/>
         </w:rPr>
-        <w:t>7. Report honestly, including negative results. A domain where TFP’s predictions fail is as informative as one where they succeed. Negative results help map TFP’s boundary conditions.</w:t>
+        <w:t>• Full test protocol (Section 6.3): 1–2 weeks, including data preparation, operator measurement, permutation search, holdout validation, and write-up.</w:t>
       </w:r>
     </w:p>
     <w:p>
       <w:pPr>
-        <w:spacing w:before="200" w:after="80"/>
+        <w:spacing w:after="80" w:before="160"/>
       </w:pPr>
       <w:r>
         <w:rPr>
@@ -2781,12 +3034,12 @@
           <w:color w:val="2F5496"/>
           <w:sz w:val="24"/>
         </w:rPr>
-        <w:t>6.2 Minimum Viable Test</w:t>
+        <w:t>6.3 Full Test Protocol</w:t>
       </w:r>
     </w:p>
     <w:p>
       <w:pPr>
-        <w:spacing w:before="0" w:after="60" w:line="260" w:lineRule="exact"/>
+        <w:spacing w:after="60"/>
       </w:pPr>
       <w:r>
         <w:rPr>
@@ -2796,12 +3049,12 @@
           <w:color w:val="000000"/>
           <w:sz w:val="22"/>
         </w:rPr>
-        <w:t>For researchers who want the simplest possible TFP test before committing to the full protocol:</w:t>
+        <w:t>1. Identify a system with staged lifecycle progression. The system must have discrete, temporally ordered stages with observable transitions. Examples: software development sprints, legislative processes, product development pipelines, biological development stages, disease progression. What failure looks like: if the system lacks discrete stages or temporal ordering, TFP predictions do not apply.</w:t>
       </w:r>
     </w:p>
     <w:p>
       <w:pPr>
-        <w:spacing w:before="0" w:after="60" w:line="260" w:lineRule="exact"/>
+        <w:spacing w:after="60"/>
       </w:pPr>
       <w:r>
         <w:rPr>
@@ -2811,12 +3064,207 @@
           <w:color w:val="000000"/>
           <w:sz w:val="22"/>
         </w:rPr>
-        <w:t>If you have lifecycle data with three or more timestamped stages and a measurable external coupling metric (e.g., cross-references, external collaborators, incoming citations), you can test whether coupling peaks at the selection stage (Q2). If it does, that is consistent with TFP. If coupling peaks at a different stage, that is evidence against TFP’s operator–stage binding prediction. This single test is not sufficient to validate TFP, but it is sufficient to motivate or discourage the full protocol.</w:t>
+        <w:t>2. Map institutional or natural stage boundaries to Q1–Q4. Each stage should correspond to one quadrant based on the dominant information-processing function performed at that stage. Q1 = internal preparation before external engagement; Q2 = external gathering and evaluation; Q3 = internal narrowing and convergence; Q4 = external commitment and deployment. What failure looks like: if stages cannot be mapped to quadrants without ambiguity, document the mapping rationale and consider whether the system may lack the structure TFP predicts.</w:t>
       </w:r>
     </w:p>
     <w:p>
       <w:pPr>
-        <w:spacing w:before="320" w:after="120"/>
+        <w:spacing w:after="60"/>
+      </w:pPr>
+      <w:r>
+        <w:rPr>
+          <w:rFonts w:ascii="Times New Roman" w:hAnsi="Times New Roman"/>
+          <w:b w:val="0"/>
+          <w:i w:val="0"/>
+          <w:color w:val="000000"/>
+          <w:sz w:val="22"/>
+        </w:rPr>
+        <w:t>3. For each stage, measure the predicted operator's signal strength. Use the operator proxies from Table 2 or develop domain-appropriate equivalents. The key requirement is that each operator must be measured independently—do not use a single metric as a proxy for multiple operators. What failure looks like: if operator proxies cannot be measured independently, the test is inconclusive rather than negative.</w:t>
+      </w:r>
+    </w:p>
+    <w:p>
+      <w:pPr>
+        <w:spacing w:after="60"/>
+      </w:pPr>
+      <w:r>
+        <w:rPr>
+          <w:rFonts w:ascii="Times New Roman" w:hAnsi="Times New Roman"/>
+          <w:b w:val="0"/>
+          <w:i w:val="0"/>
+          <w:color w:val="000000"/>
+          <w:sz w:val="22"/>
+        </w:rPr>
+        <w:t>4. Run the permutation search. For 3 operators, there are 3! = 6 possible operator–stage assignments. For 4 operators, there are 4! = 24. TFP predicts that its assignment will produce the strongest aggregate signal. Compute a composite fit metric for each permutation and rank them. What failure looks like: TFP's predicted assignment is not ranked #1, or is not statistically distinguishable from alternatives.</w:t>
+      </w:r>
+    </w:p>
+    <w:p>
+      <w:pPr>
+        <w:spacing w:after="60"/>
+      </w:pPr>
+      <w:r>
+        <w:rPr>
+          <w:rFonts w:ascii="Times New Roman" w:hAnsi="Times New Roman"/>
+          <w:b w:val="0"/>
+          <w:i w:val="0"/>
+          <w:color w:val="000000"/>
+          <w:sz w:val="22"/>
+        </w:rPr>
+        <w:t>5. Run the wrong-stage permutation test. Shuffle the stage labels while keeping operator assignments fixed. TFP predicts that shuffling stages will destroy the signal. What failure looks like: the signal survives stage shuffling, suggesting the result is an artifact of the metric rather than stage-specific structure.</w:t>
+      </w:r>
+    </w:p>
+    <w:p>
+      <w:pPr>
+        <w:spacing w:after="60"/>
+      </w:pPr>
+      <w:r>
+        <w:rPr>
+          <w:rFonts w:ascii="Times New Roman" w:hAnsi="Times New Roman"/>
+          <w:b w:val="0"/>
+          <w:i w:val="0"/>
+          <w:color w:val="000000"/>
+          <w:sz w:val="22"/>
+        </w:rPr>
+        <w:t>6. Run holdout validation. Split data temporally or by subsample. TFP predicts that results will replicate on held-out data. What failure looks like: the training result does not replicate in the holdout sample.</w:t>
+      </w:r>
+    </w:p>
+    <w:p>
+      <w:pPr>
+        <w:spacing w:after="60"/>
+      </w:pPr>
+      <w:r>
+        <w:rPr>
+          <w:rFonts w:ascii="Times New Roman" w:hAnsi="Times New Roman"/>
+          <w:b w:val="0"/>
+          <w:i w:val="0"/>
+          <w:color w:val="000000"/>
+          <w:sz w:val="22"/>
+        </w:rPr>
+        <w:t>7. Report honestly, including negative results. A domain where TFP predictions fail is as informative as one where they succeed. Negative results help map TFP's boundary conditions.</w:t>
+      </w:r>
+    </w:p>
+    <w:p>
+      <w:pPr>
+        <w:spacing w:after="80" w:before="160"/>
+      </w:pPr>
+      <w:r>
+        <w:rPr>
+          <w:rFonts w:ascii="Times New Roman" w:hAnsi="Times New Roman"/>
+          <w:b/>
+          <w:i w:val="0"/>
+          <w:color w:val="2F5496"/>
+          <w:sz w:val="24"/>
+        </w:rPr>
+        <w:t>6.4 Minimum Viable Test</w:t>
+      </w:r>
+    </w:p>
+    <w:p>
+      <w:pPr>
+        <w:spacing w:after="60"/>
+      </w:pPr>
+      <w:r>
+        <w:rPr>
+          <w:rFonts w:ascii="Times New Roman" w:hAnsi="Times New Roman"/>
+          <w:b w:val="0"/>
+          <w:i w:val="0"/>
+          <w:color w:val="000000"/>
+          <w:sz w:val="22"/>
+        </w:rPr>
+        <w:t>For researchers who want the simplest possible TFP test before committing to the full protocol: if you have lifecycle data with three or more timestamped stages and a measurable external coupling metric (e.g., cross-references, external collaborators, incoming citations), you can test whether coupling peaks at the selection stage (Q2). If it does, that is consistent with TFP. If coupling peaks at a different stage, that is evidence against TFP's operator–stage binding prediction. This single test is not sufficient to validate TFP, but it is sufficient to motivate or discourage the full protocol.</w:t>
+      </w:r>
+    </w:p>
+    <w:p>
+      <w:pPr>
+        <w:spacing w:after="80" w:before="160"/>
+      </w:pPr>
+      <w:r>
+        <w:rPr>
+          <w:rFonts w:ascii="Times New Roman" w:hAnsi="Times New Roman"/>
+          <w:b/>
+          <w:i w:val="0"/>
+          <w:color w:val="2F5496"/>
+          <w:sz w:val="24"/>
+        </w:rPr>
+        <w:t>6.5 Worked Example</w:t>
+      </w:r>
+    </w:p>
+    <w:p>
+      <w:pPr>
+        <w:spacing w:after="60"/>
+      </w:pPr>
+      <w:r>
+        <w:rPr>
+          <w:rFonts w:ascii="Times New Roman" w:hAnsi="Times New Roman"/>
+          <w:b w:val="0"/>
+          <w:i w:val="0"/>
+          <w:color w:val="000000"/>
+          <w:sz w:val="22"/>
+        </w:rPr>
+        <w:t>For example, in a software release cycle with stages Draft → Review → Release Candidate → Stable Release:</w:t>
+      </w:r>
+    </w:p>
+    <w:p>
+      <w:pPr>
+        <w:spacing w:after="60"/>
+      </w:pPr>
+      <w:r>
+        <w:rPr>
+          <w:rFonts w:ascii="Times New Roman" w:hAnsi="Times New Roman"/>
+          <w:b w:val="0"/>
+          <w:i w:val="0"/>
+          <w:color w:val="000000"/>
+          <w:sz w:val="22"/>
+        </w:rPr>
+        <w:t>• Map stages: Draft = Q1 (internal preparation), Review = Q2 (external feedback gathering), Release Candidate = Q3 (narrowing, bug triage), Stable Release = Q4 (irreversible public commitment).</w:t>
+      </w:r>
+    </w:p>
+    <w:p>
+      <w:pPr>
+        <w:spacing w:after="60"/>
+      </w:pPr>
+      <w:r>
+        <w:rPr>
+          <w:rFonts w:ascii="Times New Roman" w:hAnsi="Times New Roman"/>
+          <w:b w:val="0"/>
+          <w:i w:val="0"/>
+          <w:color w:val="000000"/>
+          <w:sz w:val="22"/>
+        </w:rPr>
+        <w:t>• Measure operators: For E_out at the Review stage, count the number of unique external reviewers, cross-project references, and community comments per release. For E_in at the Release Candidate stage, measure the rate of bug closure, feature freeze enforcement, and candidate elimination.</w:t>
+      </w:r>
+    </w:p>
+    <w:p>
+      <w:pPr>
+        <w:spacing w:after="60"/>
+      </w:pPr>
+      <w:r>
+        <w:rPr>
+          <w:rFonts w:ascii="Times New Roman" w:hAnsi="Times New Roman"/>
+          <w:b w:val="0"/>
+          <w:i w:val="0"/>
+          <w:color w:val="000000"/>
+          <w:sz w:val="22"/>
+        </w:rPr>
+        <w:t>• Permutation search: Compute the composite fit for all 24 operator–stage assignments. TFP predicts that {Q1: B_in, Q2: E_out, Q3: E_in, Q4: B_out} ranks #1.</w:t>
+      </w:r>
+    </w:p>
+    <w:p>
+      <w:pPr>
+        <w:spacing w:after="60"/>
+      </w:pPr>
+      <w:r>
+        <w:rPr>
+          <w:rFonts w:ascii="Times New Roman" w:hAnsi="Times New Roman"/>
+          <w:b w:val="0"/>
+          <w:i w:val="0"/>
+          <w:color w:val="000000"/>
+          <w:sz w:val="22"/>
+        </w:rPr>
+        <w:t>• Failure scenario: If external reviewer count peaks during the Release Candidate stage rather than Review, the Q2–E_out binding prediction fails for this domain.</w:t>
+      </w:r>
+    </w:p>
+    <w:p>
+      <w:pPr>
+        <w:spacing w:after="120" w:before="240"/>
       </w:pPr>
       <w:r>
         <w:rPr>
@@ -2831,7 +3279,7 @@
     </w:p>
     <w:p>
       <w:pPr>
-        <w:spacing w:before="0" w:after="60" w:line="260" w:lineRule="exact"/>
+        <w:spacing w:after="60"/>
       </w:pPr>
       <w:r>
         <w:rPr>
@@ -2841,20 +3289,20 @@
           <w:color w:val="000000"/>
           <w:sz w:val="22"/>
         </w:rPr>
-        <w:t>Table 3 specifies the benchmark tasks that any TFP validation study should include, along with the rival models each test is designed to distinguish from TFP and the kill criteria that would constitute a failure.</w:t>
+        <w:t>Table 3 specifies the benchmark tasks that a TFP validation study should include, along with rival models, kill criteria, minimum data requirements, and estimated difficulty. These benchmarks form a canonical evaluation framework: researchers testing TFP in any domain should report results against these tasks to enable cross-study comparison.</w:t>
       </w:r>
     </w:p>
     <w:p>
       <w:pPr>
-        <w:spacing w:before="0" w:after="60" w:line="260" w:lineRule="exact"/>
+        <w:spacing w:after="80"/>
       </w:pPr>
       <w:r>
         <w:rPr>
           <w:rFonts w:ascii="Times New Roman" w:hAnsi="Times New Roman"/>
-          <w:b w:val="0"/>
-          <w:i w:val="0"/>
+          <w:b/>
+          <w:i/>
           <w:color w:val="000000"/>
-          <w:sz w:val="22"/>
+          <w:sz w:val="20"/>
         </w:rPr>
         <w:t>Table 3. Benchmark Tasks</w:t>
       </w:r>
@@ -2865,34 +3313,38 @@
         <w:jc w:val="center"/>
         <w:tblLook w:firstColumn="1" w:firstRow="1" w:lastColumn="0" w:lastRow="0" w:noHBand="0" w:noVBand="1" w:val="04A0"/>
         <w:tblBorders>
-          <w:top w:val="single" w:sz="4" w:space="0" w:color="999999"/>
-          <w:left w:val="single" w:sz="4" w:space="0" w:color="999999"/>
-          <w:bottom w:val="single" w:sz="4" w:space="0" w:color="999999"/>
-          <w:right w:val="single" w:sz="4" w:space="0" w:color="999999"/>
-          <w:insideH w:val="single" w:sz="4" w:space="0" w:color="999999"/>
-          <w:insideV w:val="single" w:sz="4" w:space="0" w:color="999999"/>
+          <w:top w:val="single" w:sz="4" w:space="0" w:color="808080"/>
+          <w:left w:val="single" w:sz="4" w:space="0" w:color="808080"/>
+          <w:bottom w:val="single" w:sz="4" w:space="0" w:color="808080"/>
+          <w:right w:val="single" w:sz="4" w:space="0" w:color="808080"/>
+          <w:insideH w:val="single" w:sz="4" w:space="0" w:color="808080"/>
+          <w:insideV w:val="single" w:sz="4" w:space="0" w:color="808080"/>
         </w:tblBorders>
       </w:tblPr>
       <w:tblGrid>
-        <w:gridCol w:w="2160"/>
-        <w:gridCol w:w="2160"/>
-        <w:gridCol w:w="2160"/>
-        <w:gridCol w:w="2160"/>
+        <w:gridCol w:w="1440"/>
+        <w:gridCol w:w="1440"/>
+        <w:gridCol w:w="1440"/>
+        <w:gridCol w:w="1440"/>
+        <w:gridCol w:w="1440"/>
+        <w:gridCol w:w="1440"/>
       </w:tblGrid>
       <w:tr>
         <w:tc>
           <w:tcPr>
-            <w:tcW w:type="dxa" w:w="2160"/>
-            <w:shd w:fill="4472C4"/>
+            <w:tcW w:type="dxa" w:w="1440"/>
+            <w:shd w:fill="D9E2F3" w:val="clear"/>
           </w:tcPr>
           <w:p>
+            <w:pPr>
+              <w:spacing w:after="20" w:before="20"/>
+            </w:pPr>
             <w:r/>
             <w:r>
               <w:rPr>
                 <w:rFonts w:ascii="Times New Roman" w:hAnsi="Times New Roman"/>
                 <w:b/>
-                <w:i w:val="0"/>
-                <w:color w:val="FFFFFF"/>
+                <w:color w:val="000000"/>
                 <w:sz w:val="20"/>
               </w:rPr>
               <w:t>Benchmark</w:t>
@@ -2901,17 +3353,19 @@
         </w:tc>
         <w:tc>
           <w:tcPr>
-            <w:tcW w:type="dxa" w:w="2160"/>
-            <w:shd w:fill="4472C4"/>
+            <w:tcW w:type="dxa" w:w="1440"/>
+            <w:shd w:fill="D9E2F3" w:val="clear"/>
           </w:tcPr>
           <w:p>
+            <w:pPr>
+              <w:spacing w:after="20" w:before="20"/>
+            </w:pPr>
             <w:r/>
             <w:r>
               <w:rPr>
                 <w:rFonts w:ascii="Times New Roman" w:hAnsi="Times New Roman"/>
                 <w:b/>
-                <w:i w:val="0"/>
-                <w:color w:val="FFFFFF"/>
+                <w:color w:val="000000"/>
                 <w:sz w:val="20"/>
               </w:rPr>
               <w:t>What It Tests</w:t>
@@ -2920,17 +3374,19 @@
         </w:tc>
         <w:tc>
           <w:tcPr>
-            <w:tcW w:type="dxa" w:w="2160"/>
-            <w:shd w:fill="4472C4"/>
+            <w:tcW w:type="dxa" w:w="1440"/>
+            <w:shd w:fill="D9E2F3" w:val="clear"/>
           </w:tcPr>
           <w:p>
+            <w:pPr>
+              <w:spacing w:after="20" w:before="20"/>
+            </w:pPr>
             <w:r/>
             <w:r>
               <w:rPr>
                 <w:rFonts w:ascii="Times New Roman" w:hAnsi="Times New Roman"/>
                 <w:b/>
-                <w:i w:val="0"/>
-                <w:color w:val="FFFFFF"/>
+                <w:color w:val="000000"/>
                 <w:sz w:val="20"/>
               </w:rPr>
               <w:t>Rival Models</w:t>
@@ -2939,20 +3395,64 @@
         </w:tc>
         <w:tc>
           <w:tcPr>
-            <w:tcW w:type="dxa" w:w="2160"/>
-            <w:shd w:fill="4472C4"/>
+            <w:tcW w:type="dxa" w:w="1440"/>
+            <w:shd w:fill="D9E2F3" w:val="clear"/>
           </w:tcPr>
           <w:p>
+            <w:pPr>
+              <w:spacing w:after="20" w:before="20"/>
+            </w:pPr>
             <w:r/>
             <w:r>
               <w:rPr>
                 <w:rFonts w:ascii="Times New Roman" w:hAnsi="Times New Roman"/>
                 <w:b/>
-                <w:i w:val="0"/>
-                <w:color w:val="FFFFFF"/>
+                <w:color w:val="000000"/>
                 <w:sz w:val="20"/>
               </w:rPr>
               <w:t>Kill Criteria</w:t>
+            </w:r>
+          </w:p>
+        </w:tc>
+        <w:tc>
+          <w:tcPr>
+            <w:tcW w:type="dxa" w:w="1440"/>
+            <w:shd w:fill="D9E2F3" w:val="clear"/>
+          </w:tcPr>
+          <w:p>
+            <w:pPr>
+              <w:spacing w:after="20" w:before="20"/>
+            </w:pPr>
+            <w:r/>
+            <w:r>
+              <w:rPr>
+                <w:rFonts w:ascii="Times New Roman" w:hAnsi="Times New Roman"/>
+                <w:b/>
+                <w:color w:val="000000"/>
+                <w:sz w:val="20"/>
+              </w:rPr>
+              <w:t>Min. Data</w:t>
+            </w:r>
+          </w:p>
+        </w:tc>
+        <w:tc>
+          <w:tcPr>
+            <w:tcW w:type="dxa" w:w="1440"/>
+            <w:shd w:fill="D9E2F3" w:val="clear"/>
+          </w:tcPr>
+          <w:p>
+            <w:pPr>
+              <w:spacing w:after="20" w:before="20"/>
+            </w:pPr>
+            <w:r/>
+            <w:r>
+              <w:rPr>
+                <w:rFonts w:ascii="Times New Roman" w:hAnsi="Times New Roman"/>
+                <w:b/>
+                <w:color w:val="000000"/>
+                <w:sz w:val="20"/>
+              </w:rPr>
+              <w:t>Difficulty</w:t>
             </w:r>
           </w:p>
         </w:tc>
@@ -2960,15 +3460,17 @@
       <w:tr>
         <w:tc>
           <w:tcPr>
-            <w:tcW w:type="dxa" w:w="2160"/>
+            <w:tcW w:type="dxa" w:w="1440"/>
           </w:tcPr>
           <w:p>
+            <w:pPr>
+              <w:spacing w:after="20" w:before="20"/>
+            </w:pPr>
             <w:r/>
             <w:r>
               <w:rPr>
                 <w:rFonts w:ascii="Times New Roman" w:hAnsi="Times New Roman"/>
                 <w:b w:val="0"/>
-                <w:i w:val="0"/>
                 <w:color w:val="000000"/>
                 <w:sz w:val="20"/>
               </w:rPr>
@@ -2978,15 +3480,17 @@
         </w:tc>
         <w:tc>
           <w:tcPr>
-            <w:tcW w:type="dxa" w:w="2160"/>
+            <w:tcW w:type="dxa" w:w="1440"/>
           </w:tcPr>
           <w:p>
+            <w:pPr>
+              <w:spacing w:after="20" w:before="20"/>
+            </w:pPr>
             <w:r/>
             <w:r>
               <w:rPr>
                 <w:rFonts w:ascii="Times New Roman" w:hAnsi="Times New Roman"/>
                 <w:b w:val="0"/>
-                <w:i w:val="0"/>
                 <w:color w:val="000000"/>
                 <w:sz w:val="20"/>
               </w:rPr>
@@ -2996,15 +3500,17 @@
         </w:tc>
         <w:tc>
           <w:tcPr>
-            <w:tcW w:type="dxa" w:w="2160"/>
+            <w:tcW w:type="dxa" w:w="1440"/>
           </w:tcPr>
           <w:p>
+            <w:pPr>
+              <w:spacing w:after="20" w:before="20"/>
+            </w:pPr>
             <w:r/>
             <w:r>
               <w:rPr>
                 <w:rFonts w:ascii="Times New Roman" w:hAnsi="Times New Roman"/>
                 <w:b w:val="0"/>
-                <w:i w:val="0"/>
                 <w:color w:val="000000"/>
                 <w:sz w:val="20"/>
               </w:rPr>
@@ -3014,15 +3520,17 @@
         </w:tc>
         <w:tc>
           <w:tcPr>
-            <w:tcW w:type="dxa" w:w="2160"/>
+            <w:tcW w:type="dxa" w:w="1440"/>
           </w:tcPr>
           <w:p>
+            <w:pPr>
+              <w:spacing w:after="20" w:before="20"/>
+            </w:pPr>
             <w:r/>
             <w:r>
               <w:rPr>
                 <w:rFonts w:ascii="Times New Roman" w:hAnsi="Times New Roman"/>
                 <w:b w:val="0"/>
-                <w:i w:val="0"/>
                 <w:color w:val="000000"/>
                 <w:sz w:val="20"/>
               </w:rPr>
@@ -3030,19 +3538,61 @@
             </w:r>
           </w:p>
         </w:tc>
-      </w:tr>
-      <w:tr>
         <w:tc>
           <w:tcPr>
-            <w:tcW w:type="dxa" w:w="2160"/>
+            <w:tcW w:type="dxa" w:w="1440"/>
           </w:tcPr>
           <w:p>
+            <w:pPr>
+              <w:spacing w:after="20" w:before="20"/>
+            </w:pPr>
             <w:r/>
             <w:r>
               <w:rPr>
                 <w:rFonts w:ascii="Times New Roman" w:hAnsi="Times New Roman"/>
                 <w:b w:val="0"/>
-                <w:i w:val="0"/>
+                <w:color w:val="000000"/>
+                <w:sz w:val="20"/>
+              </w:rPr>
+              <w:t>50+ instances, 3+ stages, 3+ operator proxies</w:t>
+            </w:r>
+          </w:p>
+        </w:tc>
+        <w:tc>
+          <w:tcPr>
+            <w:tcW w:type="dxa" w:w="1440"/>
+          </w:tcPr>
+          <w:p>
+            <w:pPr>
+              <w:spacing w:after="20" w:before="20"/>
+            </w:pPr>
+            <w:r/>
+            <w:r>
+              <w:rPr>
+                <w:rFonts w:ascii="Times New Roman" w:hAnsi="Times New Roman"/>
+                <w:b w:val="0"/>
+                <w:color w:val="000000"/>
+                <w:sz w:val="20"/>
+              </w:rPr>
+              <w:t>Beginner</w:t>
+            </w:r>
+          </w:p>
+        </w:tc>
+      </w:tr>
+      <w:tr>
+        <w:tc>
+          <w:tcPr>
+            <w:tcW w:type="dxa" w:w="1440"/>
+          </w:tcPr>
+          <w:p>
+            <w:pPr>
+              <w:spacing w:after="20" w:before="20"/>
+            </w:pPr>
+            <w:r/>
+            <w:r>
+              <w:rPr>
+                <w:rFonts w:ascii="Times New Roman" w:hAnsi="Times New Roman"/>
+                <w:b w:val="0"/>
                 <w:color w:val="000000"/>
                 <w:sz w:val="20"/>
               </w:rPr>
@@ -3052,15 +3602,17 @@
         </w:tc>
         <w:tc>
           <w:tcPr>
-            <w:tcW w:type="dxa" w:w="2160"/>
+            <w:tcW w:type="dxa" w:w="1440"/>
           </w:tcPr>
           <w:p>
+            <w:pPr>
+              <w:spacing w:after="20" w:before="20"/>
+            </w:pPr>
             <w:r/>
             <w:r>
               <w:rPr>
                 <w:rFonts w:ascii="Times New Roman" w:hAnsi="Times New Roman"/>
                 <w:b w:val="0"/>
-                <w:i w:val="0"/>
                 <w:color w:val="000000"/>
                 <w:sz w:val="20"/>
               </w:rPr>
@@ -3070,15 +3622,17 @@
         </w:tc>
         <w:tc>
           <w:tcPr>
-            <w:tcW w:type="dxa" w:w="2160"/>
+            <w:tcW w:type="dxa" w:w="1440"/>
           </w:tcPr>
           <w:p>
+            <w:pPr>
+              <w:spacing w:after="20" w:before="20"/>
+            </w:pPr>
             <w:r/>
             <w:r>
               <w:rPr>
                 <w:rFonts w:ascii="Times New Roman" w:hAnsi="Times New Roman"/>
                 <w:b w:val="0"/>
-                <w:i w:val="0"/>
                 <w:color w:val="000000"/>
                 <w:sz w:val="20"/>
               </w:rPr>
@@ -3088,19 +3642,61 @@
         </w:tc>
         <w:tc>
           <w:tcPr>
-            <w:tcW w:type="dxa" w:w="2160"/>
+            <w:tcW w:type="dxa" w:w="1440"/>
           </w:tcPr>
           <w:p>
+            <w:pPr>
+              <w:spacing w:after="20" w:before="20"/>
+            </w:pPr>
             <w:r/>
             <w:r>
               <w:rPr>
                 <w:rFonts w:ascii="Times New Roman" w:hAnsi="Times New Roman"/>
                 <w:b w:val="0"/>
-                <w:i w:val="0"/>
                 <w:color w:val="000000"/>
                 <w:sz w:val="20"/>
               </w:rPr>
-              <w:t>Signal does not collapse under shuffling</w:t>
+              <w:t>Signal survives shuffling</w:t>
+            </w:r>
+          </w:p>
+        </w:tc>
+        <w:tc>
+          <w:tcPr>
+            <w:tcW w:type="dxa" w:w="1440"/>
+          </w:tcPr>
+          <w:p>
+            <w:pPr>
+              <w:spacing w:after="20" w:before="20"/>
+            </w:pPr>
+            <w:r/>
+            <w:r>
+              <w:rPr>
+                <w:rFonts w:ascii="Times New Roman" w:hAnsi="Times New Roman"/>
+                <w:b w:val="0"/>
+                <w:color w:val="000000"/>
+                <w:sz w:val="20"/>
+              </w:rPr>
+              <w:t>50+ instances, 3+ stages</w:t>
+            </w:r>
+          </w:p>
+        </w:tc>
+        <w:tc>
+          <w:tcPr>
+            <w:tcW w:type="dxa" w:w="1440"/>
+          </w:tcPr>
+          <w:p>
+            <w:pPr>
+              <w:spacing w:after="20" w:before="20"/>
+            </w:pPr>
+            <w:r/>
+            <w:r>
+              <w:rPr>
+                <w:rFonts w:ascii="Times New Roman" w:hAnsi="Times New Roman"/>
+                <w:b w:val="0"/>
+                <w:color w:val="000000"/>
+                <w:sz w:val="20"/>
+              </w:rPr>
+              <w:t>Beginner</w:t>
             </w:r>
           </w:p>
         </w:tc>
@@ -3108,15 +3704,17 @@
       <w:tr>
         <w:tc>
           <w:tcPr>
-            <w:tcW w:type="dxa" w:w="2160"/>
+            <w:tcW w:type="dxa" w:w="1440"/>
           </w:tcPr>
           <w:p>
+            <w:pPr>
+              <w:spacing w:after="20" w:before="20"/>
+            </w:pPr>
             <w:r/>
             <w:r>
               <w:rPr>
                 <w:rFonts w:ascii="Times New Roman" w:hAnsi="Times New Roman"/>
                 <w:b w:val="0"/>
-                <w:i w:val="0"/>
                 <w:color w:val="000000"/>
                 <w:sz w:val="20"/>
               </w:rPr>
@@ -3126,15 +3724,17 @@
         </w:tc>
         <w:tc>
           <w:tcPr>
-            <w:tcW w:type="dxa" w:w="2160"/>
+            <w:tcW w:type="dxa" w:w="1440"/>
           </w:tcPr>
           <w:p>
+            <w:pPr>
+              <w:spacing w:after="20" w:before="20"/>
+            </w:pPr>
             <w:r/>
             <w:r>
               <w:rPr>
                 <w:rFonts w:ascii="Times New Roman" w:hAnsi="Times New Roman"/>
                 <w:b w:val="0"/>
-                <w:i w:val="0"/>
                 <w:color w:val="000000"/>
                 <w:sz w:val="20"/>
               </w:rPr>
@@ -3144,15 +3744,17 @@
         </w:tc>
         <w:tc>
           <w:tcPr>
-            <w:tcW w:type="dxa" w:w="2160"/>
+            <w:tcW w:type="dxa" w:w="1440"/>
           </w:tcPr>
           <w:p>
+            <w:pPr>
+              <w:spacing w:after="20" w:before="20"/>
+            </w:pPr>
             <w:r/>
             <w:r>
               <w:rPr>
                 <w:rFonts w:ascii="Times New Roman" w:hAnsi="Times New Roman"/>
                 <w:b w:val="0"/>
-                <w:i w:val="0"/>
                 <w:color w:val="000000"/>
                 <w:sz w:val="20"/>
               </w:rPr>
@@ -3162,15 +3764,17 @@
         </w:tc>
         <w:tc>
           <w:tcPr>
-            <w:tcW w:type="dxa" w:w="2160"/>
+            <w:tcW w:type="dxa" w:w="1440"/>
           </w:tcPr>
           <w:p>
+            <w:pPr>
+              <w:spacing w:after="20" w:before="20"/>
+            </w:pPr>
             <w:r/>
             <w:r>
               <w:rPr>
                 <w:rFonts w:ascii="Times New Roman" w:hAnsi="Times New Roman"/>
                 <w:b w:val="0"/>
-                <w:i w:val="0"/>
                 <w:color w:val="000000"/>
                 <w:sz w:val="20"/>
               </w:rPr>
@@ -3178,19 +3782,61 @@
             </w:r>
           </w:p>
         </w:tc>
-      </w:tr>
-      <w:tr>
         <w:tc>
           <w:tcPr>
-            <w:tcW w:type="dxa" w:w="2160"/>
+            <w:tcW w:type="dxa" w:w="1440"/>
           </w:tcPr>
           <w:p>
+            <w:pPr>
+              <w:spacing w:after="20" w:before="20"/>
+            </w:pPr>
             <w:r/>
             <w:r>
               <w:rPr>
                 <w:rFonts w:ascii="Times New Roman" w:hAnsi="Times New Roman"/>
                 <w:b w:val="0"/>
-                <w:i w:val="0"/>
+                <w:color w:val="000000"/>
+                <w:sz w:val="20"/>
+              </w:rPr>
+              <w:t>50+ instances, 3+ stages, 3+ operator proxies</w:t>
+            </w:r>
+          </w:p>
+        </w:tc>
+        <w:tc>
+          <w:tcPr>
+            <w:tcW w:type="dxa" w:w="1440"/>
+          </w:tcPr>
+          <w:p>
+            <w:pPr>
+              <w:spacing w:after="20" w:before="20"/>
+            </w:pPr>
+            <w:r/>
+            <w:r>
+              <w:rPr>
+                <w:rFonts w:ascii="Times New Roman" w:hAnsi="Times New Roman"/>
+                <w:b w:val="0"/>
+                <w:color w:val="000000"/>
+                <w:sz w:val="20"/>
+              </w:rPr>
+              <w:t>Intermediate</w:t>
+            </w:r>
+          </w:p>
+        </w:tc>
+      </w:tr>
+      <w:tr>
+        <w:tc>
+          <w:tcPr>
+            <w:tcW w:type="dxa" w:w="1440"/>
+          </w:tcPr>
+          <w:p>
+            <w:pPr>
+              <w:spacing w:after="20" w:before="20"/>
+            </w:pPr>
+            <w:r/>
+            <w:r>
+              <w:rPr>
+                <w:rFonts w:ascii="Times New Roman" w:hAnsi="Times New Roman"/>
+                <w:b w:val="0"/>
                 <w:color w:val="000000"/>
                 <w:sz w:val="20"/>
               </w:rPr>
@@ -3200,15 +3846,17 @@
         </w:tc>
         <w:tc>
           <w:tcPr>
-            <w:tcW w:type="dxa" w:w="2160"/>
+            <w:tcW w:type="dxa" w:w="1440"/>
           </w:tcPr>
           <w:p>
+            <w:pPr>
+              <w:spacing w:after="20" w:before="20"/>
+            </w:pPr>
             <w:r/>
             <w:r>
               <w:rPr>
                 <w:rFonts w:ascii="Times New Roman" w:hAnsi="Times New Roman"/>
                 <w:b w:val="0"/>
-                <w:i w:val="0"/>
                 <w:color w:val="000000"/>
                 <w:sz w:val="20"/>
               </w:rPr>
@@ -3218,15 +3866,17 @@
         </w:tc>
         <w:tc>
           <w:tcPr>
-            <w:tcW w:type="dxa" w:w="2160"/>
+            <w:tcW w:type="dxa" w:w="1440"/>
           </w:tcPr>
           <w:p>
+            <w:pPr>
+              <w:spacing w:after="20" w:before="20"/>
+            </w:pPr>
             <w:r/>
             <w:r>
               <w:rPr>
                 <w:rFonts w:ascii="Times New Roman" w:hAnsi="Times New Roman"/>
                 <w:b w:val="0"/>
-                <w:i w:val="0"/>
                 <w:color w:val="000000"/>
                 <w:sz w:val="20"/>
               </w:rPr>
@@ -3236,15 +3886,17 @@
         </w:tc>
         <w:tc>
           <w:tcPr>
-            <w:tcW w:type="dxa" w:w="2160"/>
+            <w:tcW w:type="dxa" w:w="1440"/>
           </w:tcPr>
           <w:p>
+            <w:pPr>
+              <w:spacing w:after="20" w:before="20"/>
+            </w:pPr>
             <w:r/>
             <w:r>
               <w:rPr>
                 <w:rFonts w:ascii="Times New Roman" w:hAnsi="Times New Roman"/>
                 <w:b w:val="0"/>
-                <w:i w:val="0"/>
                 <w:color w:val="000000"/>
                 <w:sz w:val="20"/>
               </w:rPr>
@@ -3252,19 +3904,61 @@
             </w:r>
           </w:p>
         </w:tc>
-      </w:tr>
-      <w:tr>
         <w:tc>
           <w:tcPr>
-            <w:tcW w:type="dxa" w:w="2160"/>
+            <w:tcW w:type="dxa" w:w="1440"/>
           </w:tcPr>
           <w:p>
+            <w:pPr>
+              <w:spacing w:after="20" w:before="20"/>
+            </w:pPr>
             <w:r/>
             <w:r>
               <w:rPr>
                 <w:rFonts w:ascii="Times New Roman" w:hAnsi="Times New Roman"/>
                 <w:b w:val="0"/>
-                <w:i w:val="0"/>
+                <w:color w:val="000000"/>
+                <w:sz w:val="20"/>
+              </w:rPr>
+              <w:t>200+ instances, time-series operator data</w:t>
+            </w:r>
+          </w:p>
+        </w:tc>
+        <w:tc>
+          <w:tcPr>
+            <w:tcW w:type="dxa" w:w="1440"/>
+          </w:tcPr>
+          <w:p>
+            <w:pPr>
+              <w:spacing w:after="20" w:before="20"/>
+            </w:pPr>
+            <w:r/>
+            <w:r>
+              <w:rPr>
+                <w:rFonts w:ascii="Times New Roman" w:hAnsi="Times New Roman"/>
+                <w:b w:val="0"/>
+                <w:color w:val="000000"/>
+                <w:sz w:val="20"/>
+              </w:rPr>
+              <w:t>Advanced</w:t>
+            </w:r>
+          </w:p>
+        </w:tc>
+      </w:tr>
+      <w:tr>
+        <w:tc>
+          <w:tcPr>
+            <w:tcW w:type="dxa" w:w="1440"/>
+          </w:tcPr>
+          <w:p>
+            <w:pPr>
+              <w:spacing w:after="20" w:before="20"/>
+            </w:pPr>
+            <w:r/>
+            <w:r>
+              <w:rPr>
+                <w:rFonts w:ascii="Times New Roman" w:hAnsi="Times New Roman"/>
+                <w:b w:val="0"/>
                 <w:color w:val="000000"/>
                 <w:sz w:val="20"/>
               </w:rPr>
@@ -3274,15 +3968,17 @@
         </w:tc>
         <w:tc>
           <w:tcPr>
-            <w:tcW w:type="dxa" w:w="2160"/>
+            <w:tcW w:type="dxa" w:w="1440"/>
           </w:tcPr>
           <w:p>
+            <w:pPr>
+              <w:spacing w:after="20" w:before="20"/>
+            </w:pPr>
             <w:r/>
             <w:r>
               <w:rPr>
                 <w:rFonts w:ascii="Times New Roman" w:hAnsi="Times New Roman"/>
                 <w:b w:val="0"/>
-                <w:i w:val="0"/>
                 <w:color w:val="000000"/>
                 <w:sz w:val="20"/>
               </w:rPr>
@@ -3292,15 +3988,17 @@
         </w:tc>
         <w:tc>
           <w:tcPr>
-            <w:tcW w:type="dxa" w:w="2160"/>
+            <w:tcW w:type="dxa" w:w="1440"/>
           </w:tcPr>
           <w:p>
+            <w:pPr>
+              <w:spacing w:after="20" w:before="20"/>
+            </w:pPr>
             <w:r/>
             <w:r>
               <w:rPr>
                 <w:rFonts w:ascii="Times New Roman" w:hAnsi="Times New Roman"/>
                 <w:b w:val="0"/>
-                <w:i w:val="0"/>
                 <w:color w:val="000000"/>
                 <w:sz w:val="20"/>
               </w:rPr>
@@ -3310,15 +4008,17 @@
         </w:tc>
         <w:tc>
           <w:tcPr>
-            <w:tcW w:type="dxa" w:w="2160"/>
+            <w:tcW w:type="dxa" w:w="1440"/>
           </w:tcPr>
           <w:p>
+            <w:pPr>
+              <w:spacing w:after="20" w:before="20"/>
+            </w:pPr>
             <w:r/>
             <w:r>
               <w:rPr>
                 <w:rFonts w:ascii="Times New Roman" w:hAnsi="Times New Roman"/>
                 <w:b w:val="0"/>
-                <w:i w:val="0"/>
                 <w:color w:val="000000"/>
                 <w:sz w:val="20"/>
               </w:rPr>
@@ -3326,19 +4026,61 @@
             </w:r>
           </w:p>
         </w:tc>
-      </w:tr>
-      <w:tr>
         <w:tc>
           <w:tcPr>
-            <w:tcW w:type="dxa" w:w="2160"/>
+            <w:tcW w:type="dxa" w:w="1440"/>
           </w:tcPr>
           <w:p>
+            <w:pPr>
+              <w:spacing w:after="20" w:before="20"/>
+            </w:pPr>
             <w:r/>
             <w:r>
               <w:rPr>
                 <w:rFonts w:ascii="Times New Roman" w:hAnsi="Times New Roman"/>
                 <w:b w:val="0"/>
-                <w:i w:val="0"/>
+                <w:color w:val="000000"/>
+                <w:sz w:val="20"/>
+              </w:rPr>
+              <w:t>2+ domains, 50+ instances each</w:t>
+            </w:r>
+          </w:p>
+        </w:tc>
+        <w:tc>
+          <w:tcPr>
+            <w:tcW w:type="dxa" w:w="1440"/>
+          </w:tcPr>
+          <w:p>
+            <w:pPr>
+              <w:spacing w:after="20" w:before="20"/>
+            </w:pPr>
+            <w:r/>
+            <w:r>
+              <w:rPr>
+                <w:rFonts w:ascii="Times New Roman" w:hAnsi="Times New Roman"/>
+                <w:b w:val="0"/>
+                <w:color w:val="000000"/>
+                <w:sz w:val="20"/>
+              </w:rPr>
+              <w:t>Intermediate</w:t>
+            </w:r>
+          </w:p>
+        </w:tc>
+      </w:tr>
+      <w:tr>
+        <w:tc>
+          <w:tcPr>
+            <w:tcW w:type="dxa" w:w="1440"/>
+          </w:tcPr>
+          <w:p>
+            <w:pPr>
+              <w:spacing w:after="20" w:before="20"/>
+            </w:pPr>
+            <w:r/>
+            <w:r>
+              <w:rPr>
+                <w:rFonts w:ascii="Times New Roman" w:hAnsi="Times New Roman"/>
+                <w:b w:val="0"/>
                 <w:color w:val="000000"/>
                 <w:sz w:val="20"/>
               </w:rPr>
@@ -3348,15 +4090,17 @@
         </w:tc>
         <w:tc>
           <w:tcPr>
-            <w:tcW w:type="dxa" w:w="2160"/>
+            <w:tcW w:type="dxa" w:w="1440"/>
           </w:tcPr>
           <w:p>
+            <w:pPr>
+              <w:spacing w:after="20" w:before="20"/>
+            </w:pPr>
             <w:r/>
             <w:r>
               <w:rPr>
                 <w:rFonts w:ascii="Times New Roman" w:hAnsi="Times New Roman"/>
                 <w:b w:val="0"/>
-                <w:i w:val="0"/>
                 <w:color w:val="000000"/>
                 <w:sz w:val="20"/>
               </w:rPr>
@@ -3366,15 +4110,17 @@
         </w:tc>
         <w:tc>
           <w:tcPr>
-            <w:tcW w:type="dxa" w:w="2160"/>
+            <w:tcW w:type="dxa" w:w="1440"/>
           </w:tcPr>
           <w:p>
+            <w:pPr>
+              <w:spacing w:after="20" w:before="20"/>
+            </w:pPr>
             <w:r/>
             <w:r>
               <w:rPr>
                 <w:rFonts w:ascii="Times New Roman" w:hAnsi="Times New Roman"/>
                 <w:b w:val="0"/>
-                <w:i w:val="0"/>
                 <w:color w:val="000000"/>
                 <w:sz w:val="20"/>
               </w:rPr>
@@ -3384,15 +4130,17 @@
         </w:tc>
         <w:tc>
           <w:tcPr>
-            <w:tcW w:type="dxa" w:w="2160"/>
+            <w:tcW w:type="dxa" w:w="1440"/>
           </w:tcPr>
           <w:p>
+            <w:pPr>
+              <w:spacing w:after="20" w:before="20"/>
+            </w:pPr>
             <w:r/>
             <w:r>
               <w:rPr>
                 <w:rFonts w:ascii="Times New Roman" w:hAnsi="Times New Roman"/>
                 <w:b w:val="0"/>
-                <w:i w:val="0"/>
                 <w:color w:val="000000"/>
                 <w:sz w:val="20"/>
               </w:rPr>
@@ -3400,19 +4148,61 @@
             </w:r>
           </w:p>
         </w:tc>
-      </w:tr>
-      <w:tr>
         <w:tc>
           <w:tcPr>
-            <w:tcW w:type="dxa" w:w="2160"/>
+            <w:tcW w:type="dxa" w:w="1440"/>
           </w:tcPr>
           <w:p>
+            <w:pPr>
+              <w:spacing w:after="20" w:before="20"/>
+            </w:pPr>
             <w:r/>
             <w:r>
               <w:rPr>
                 <w:rFonts w:ascii="Times New Roman" w:hAnsi="Times New Roman"/>
                 <w:b w:val="0"/>
-                <w:i w:val="0"/>
+                <w:color w:val="000000"/>
+                <w:sz w:val="20"/>
+              </w:rPr>
+              <w:t>100+ instances (split 70/30)</w:t>
+            </w:r>
+          </w:p>
+        </w:tc>
+        <w:tc>
+          <w:tcPr>
+            <w:tcW w:type="dxa" w:w="1440"/>
+          </w:tcPr>
+          <w:p>
+            <w:pPr>
+              <w:spacing w:after="20" w:before="20"/>
+            </w:pPr>
+            <w:r/>
+            <w:r>
+              <w:rPr>
+                <w:rFonts w:ascii="Times New Roman" w:hAnsi="Times New Roman"/>
+                <w:b w:val="0"/>
+                <w:color w:val="000000"/>
+                <w:sz w:val="20"/>
+              </w:rPr>
+              <w:t>Beginner</w:t>
+            </w:r>
+          </w:p>
+        </w:tc>
+      </w:tr>
+      <w:tr>
+        <w:tc>
+          <w:tcPr>
+            <w:tcW w:type="dxa" w:w="1440"/>
+          </w:tcPr>
+          <w:p>
+            <w:pPr>
+              <w:spacing w:after="20" w:before="20"/>
+            </w:pPr>
+            <w:r/>
+            <w:r>
+              <w:rPr>
+                <w:rFonts w:ascii="Times New Roman" w:hAnsi="Times New Roman"/>
+                <w:b w:val="0"/>
                 <w:color w:val="000000"/>
                 <w:sz w:val="20"/>
               </w:rPr>
@@ -3422,15 +4212,17 @@
         </w:tc>
         <w:tc>
           <w:tcPr>
-            <w:tcW w:type="dxa" w:w="2160"/>
+            <w:tcW w:type="dxa" w:w="1440"/>
           </w:tcPr>
           <w:p>
+            <w:pPr>
+              <w:spacing w:after="20" w:before="20"/>
+            </w:pPr>
             <w:r/>
             <w:r>
               <w:rPr>
                 <w:rFonts w:ascii="Times New Roman" w:hAnsi="Times New Roman"/>
                 <w:b w:val="0"/>
-                <w:i w:val="0"/>
                 <w:color w:val="000000"/>
                 <w:sz w:val="20"/>
               </w:rPr>
@@ -3440,15 +4232,17 @@
         </w:tc>
         <w:tc>
           <w:tcPr>
-            <w:tcW w:type="dxa" w:w="2160"/>
+            <w:tcW w:type="dxa" w:w="1440"/>
           </w:tcPr>
           <w:p>
+            <w:pPr>
+              <w:spacing w:after="20" w:before="20"/>
+            </w:pPr>
             <w:r/>
             <w:r>
               <w:rPr>
                 <w:rFonts w:ascii="Times New Roman" w:hAnsi="Times New Roman"/>
                 <w:b w:val="0"/>
-                <w:i w:val="0"/>
                 <w:color w:val="000000"/>
                 <w:sz w:val="20"/>
               </w:rPr>
@@ -3458,15 +4252,17 @@
         </w:tc>
         <w:tc>
           <w:tcPr>
-            <w:tcW w:type="dxa" w:w="2160"/>
+            <w:tcW w:type="dxa" w:w="1440"/>
           </w:tcPr>
           <w:p>
+            <w:pPr>
+              <w:spacing w:after="20" w:before="20"/>
+            </w:pPr>
             <w:r/>
             <w:r>
               <w:rPr>
                 <w:rFonts w:ascii="Times New Roman" w:hAnsi="Times New Roman"/>
                 <w:b w:val="0"/>
-                <w:i w:val="0"/>
                 <w:color w:val="000000"/>
                 <w:sz w:val="20"/>
               </w:rPr>
@@ -3474,12 +4270,51 @@
             </w:r>
           </w:p>
         </w:tc>
+        <w:tc>
+          <w:tcPr>
+            <w:tcW w:type="dxa" w:w="1440"/>
+          </w:tcPr>
+          <w:p>
+            <w:pPr>
+              <w:spacing w:after="20" w:before="20"/>
+            </w:pPr>
+            <w:r/>
+            <w:r>
+              <w:rPr>
+                <w:rFonts w:ascii="Times New Roman" w:hAnsi="Times New Roman"/>
+                <w:b w:val="0"/>
+                <w:color w:val="000000"/>
+                <w:sz w:val="20"/>
+              </w:rPr>
+              <w:t>100+ instances, confound metadata</w:t>
+            </w:r>
+          </w:p>
+        </w:tc>
+        <w:tc>
+          <w:tcPr>
+            <w:tcW w:type="dxa" w:w="1440"/>
+          </w:tcPr>
+          <w:p>
+            <w:pPr>
+              <w:spacing w:after="20" w:before="20"/>
+            </w:pPr>
+            <w:r/>
+            <w:r>
+              <w:rPr>
+                <w:rFonts w:ascii="Times New Roman" w:hAnsi="Times New Roman"/>
+                <w:b w:val="0"/>
+                <w:color w:val="000000"/>
+                <w:sz w:val="20"/>
+              </w:rPr>
+              <w:t>Intermediate</w:t>
+            </w:r>
+          </w:p>
+        </w:tc>
       </w:tr>
     </w:tbl>
-    <w:p/>
     <w:p>
       <w:pPr>
-        <w:spacing w:before="320" w:after="120"/>
+        <w:spacing w:after="120" w:before="240"/>
       </w:pPr>
       <w:r>
         <w:rPr>
@@ -3494,7 +4329,7 @@
     </w:p>
     <w:p>
       <w:pPr>
-        <w:spacing w:before="200" w:after="80"/>
+        <w:spacing w:after="80" w:before="160"/>
       </w:pPr>
       <w:r>
         <w:rPr>
@@ -3509,7 +4344,7 @@
     </w:p>
     <w:p>
       <w:pPr>
-        <w:spacing w:before="0" w:after="60" w:line="260" w:lineRule="exact"/>
+        <w:spacing w:after="60"/>
       </w:pPr>
       <w:r>
         <w:rPr>
@@ -3524,7 +4359,7 @@
     </w:p>
     <w:p>
       <w:pPr>
-        <w:spacing w:before="200" w:after="80"/>
+        <w:spacing w:after="80" w:before="160"/>
       </w:pPr>
       <w:r>
         <w:rPr>
@@ -3539,7 +4374,7 @@
     </w:p>
     <w:p>
       <w:pPr>
-        <w:spacing w:before="0" w:after="60" w:line="260" w:lineRule="exact"/>
+        <w:spacing w:after="60"/>
       </w:pPr>
       <w:r>
         <w:rPr>
@@ -3554,7 +4389,7 @@
     </w:p>
     <w:p>
       <w:pPr>
-        <w:spacing w:before="200" w:after="80"/>
+        <w:spacing w:after="80" w:before="160"/>
       </w:pPr>
       <w:r>
         <w:rPr>
@@ -3569,19 +4404,8 @@
     </w:p>
     <w:p>
       <w:pPr>
-        <w:spacing w:before="0" w:after="40" w:line="260" w:lineRule="exact"/>
-        <w:ind w:left="720" w:hanging="360"/>
+        <w:spacing w:after="60"/>
       </w:pPr>
-      <w:r>
-        <w:rPr>
-          <w:rFonts w:ascii="Times New Roman" w:hAnsi="Times New Roman"/>
-          <w:b/>
-          <w:i w:val="0"/>
-          <w:color w:val="000000"/>
-          <w:sz w:val="22"/>
-        </w:rPr>
-        <w:t xml:space="preserve">A. Finite state grammar. </w:t>
-      </w:r>
       <w:r>
         <w:rPr>
           <w:rFonts w:ascii="Times New Roman" w:hAnsi="Times New Roman"/>
@@ -3590,24 +4414,13 @@
           <w:color w:val="000000"/>
           <w:sz w:val="22"/>
         </w:rPr>
-        <w:t>The lifecycle as a formal grammar with production rules. Each stage is a non-terminal symbol; transitions are rewrite rules. Would need to explain why the grammar has exactly four non-terminals and why the production rules are asymmetric.</w:t>
+        <w:t>A. Finite state grammar. The lifecycle as a formal grammar with production rules. Each stage is a non-terminal symbol; transitions are rewrite rules. Would need to explain why the grammar has exactly four non-terminals and why the production rules are asymmetric.</w:t>
       </w:r>
     </w:p>
     <w:p>
       <w:pPr>
-        <w:spacing w:before="0" w:after="40" w:line="260" w:lineRule="exact"/>
-        <w:ind w:left="720" w:hanging="360"/>
+        <w:spacing w:after="60"/>
       </w:pPr>
-      <w:r>
-        <w:rPr>
-          <w:rFonts w:ascii="Times New Roman" w:hAnsi="Times New Roman"/>
-          <w:b/>
-          <w:i w:val="0"/>
-          <w:color w:val="000000"/>
-          <w:sz w:val="22"/>
-        </w:rPr>
-        <w:t xml:space="preserve">B. Thermodynamic engine. </w:t>
-      </w:r>
       <w:r>
         <w:rPr>
           <w:rFonts w:ascii="Times New Roman" w:hAnsi="Times New Roman"/>
@@ -3616,24 +4429,13 @@
           <w:color w:val="000000"/>
           <w:sz w:val="22"/>
         </w:rPr>
-        <w:t>The lifecycle as energy dissipation with phase transitions. Each stage corresponds to a thermodynamic regime. Would need to explain the specific operator–stage bindings without introducing domain-specific parameters.</w:t>
+        <w:t>B. Thermodynamic engine. The lifecycle as energy dissipation with phase transitions. Each stage corresponds to a thermodynamic regime. Would need to explain the specific operator–stage bindings without introducing domain-specific parameters.</w:t>
       </w:r>
     </w:p>
     <w:p>
       <w:pPr>
-        <w:spacing w:before="0" w:after="40" w:line="260" w:lineRule="exact"/>
-        <w:ind w:left="720" w:hanging="360"/>
+        <w:spacing w:after="60"/>
       </w:pPr>
-      <w:r>
-        <w:rPr>
-          <w:rFonts w:ascii="Times New Roman" w:hAnsi="Times New Roman"/>
-          <w:b/>
-          <w:i w:val="0"/>
-          <w:color w:val="000000"/>
-          <w:sz w:val="22"/>
-        </w:rPr>
-        <w:t xml:space="preserve">C. Information bottleneck. </w:t>
-      </w:r>
       <w:r>
         <w:rPr>
           <w:rFonts w:ascii="Times New Roman" w:hAnsi="Times New Roman"/>
@@ -3642,24 +4444,13 @@
           <w:color w:val="000000"/>
           <w:sz w:val="22"/>
         </w:rPr>
-        <w:t>The lifecycle as a compression–expansion cycle. Gathering stages expand the information channel; narrowing stages compress it. Would need to explain why the cycle has a fixed phase order rather than oscillating freely.</w:t>
+        <w:t>C. Information bottleneck. The lifecycle as a compression–expansion cycle. Gathering stages expand the information channel; narrowing stages compress it. Would need to explain why the cycle has a fixed phase order rather than oscillating freely.</w:t>
       </w:r>
     </w:p>
     <w:p>
       <w:pPr>
-        <w:spacing w:before="0" w:after="40" w:line="260" w:lineRule="exact"/>
-        <w:ind w:left="720" w:hanging="360"/>
+        <w:spacing w:after="60"/>
       </w:pPr>
-      <w:r>
-        <w:rPr>
-          <w:rFonts w:ascii="Times New Roman" w:hAnsi="Times New Roman"/>
-          <w:b/>
-          <w:i w:val="0"/>
-          <w:color w:val="000000"/>
-          <w:sz w:val="22"/>
-        </w:rPr>
-        <w:t xml:space="preserve">D. Evolutionary search architecture. </w:t>
-      </w:r>
       <w:r>
         <w:rPr>
           <w:rFonts w:ascii="Times New Roman" w:hAnsi="Times New Roman"/>
@@ -3668,12 +4459,12 @@
           <w:color w:val="000000"/>
           <w:sz w:val="22"/>
         </w:rPr>
-        <w:t>The lifecycle as a structured exploration algorithm with generation, selection, refinement, and deployment phases. Would need to explain why this particular decomposition is favored over alternatives.</w:t>
+        <w:t>D. Evolutionary search architecture. The lifecycle as a structured exploration algorithm with generation, selection, refinement, and deployment phases. Would need to explain why this particular decomposition is favored over alternatives.</w:t>
       </w:r>
     </w:p>
     <w:p>
       <w:pPr>
-        <w:spacing w:before="200" w:after="80"/>
+        <w:spacing w:after="80" w:before="160"/>
       </w:pPr>
       <w:r>
         <w:rPr>
@@ -3688,7 +4479,7 @@
     </w:p>
     <w:p>
       <w:pPr>
-        <w:spacing w:before="0" w:after="60" w:line="260" w:lineRule="exact"/>
+        <w:spacing w:after="60"/>
       </w:pPr>
       <w:r>
         <w:rPr>
@@ -3703,7 +4494,7 @@
     </w:p>
     <w:p>
       <w:pPr>
-        <w:spacing w:before="320" w:after="120"/>
+        <w:spacing w:after="120" w:before="240"/>
       </w:pPr>
       <w:r>
         <w:rPr>
@@ -3718,7 +4509,7 @@
     </w:p>
     <w:p>
       <w:pPr>
-        <w:spacing w:before="0" w:after="60" w:line="260" w:lineRule="exact"/>
+        <w:spacing w:after="60"/>
       </w:pPr>
       <w:r>
         <w:rPr>
@@ -3733,9 +4524,18 @@
     </w:p>
     <w:p>
       <w:pPr>
-        <w:spacing w:before="0" w:after="40" w:line="260" w:lineRule="exact"/>
-        <w:ind w:left="720" w:hanging="360"/>
+        <w:spacing w:after="60"/>
       </w:pPr>
+      <w:r>
+        <w:rPr>
+          <w:rFonts w:ascii="Times New Roman" w:hAnsi="Times New Roman"/>
+          <w:b/>
+          <w:i w:val="0"/>
+          <w:color w:val="000000"/>
+          <w:sz w:val="22"/>
+        </w:rPr>
+        <w:t>1. Direct Q1 measurement.</w:t>
+      </w:r>
       <w:r>
         <w:rPr>
           <w:rFonts w:ascii="Times New Roman" w:hAnsi="Times New Roman"/>
@@ -3744,14 +4544,23 @@
           <w:color w:val="000000"/>
           <w:sz w:val="22"/>
         </w:rPr>
-        <w:t>1. Direct Q1 measurement. Q1 (internal orientation) has not been directly measured. Testing requires process-tracing methods such as eye-tracking, think-aloud protocols, or neural recording during the earliest stages of a lifecycle process.</w:t>
+        <w:t xml:space="preserve"> Q1 (internal preparation) has not been directly measured. Testing requires process-tracing methods such as eye-tracking, think-aloud protocols, or neural recording during the earliest stages of a lifecycle process.</w:t>
       </w:r>
     </w:p>
     <w:p>
       <w:pPr>
-        <w:spacing w:before="0" w:after="40" w:line="260" w:lineRule="exact"/>
-        <w:ind w:left="720" w:hanging="360"/>
+        <w:spacing w:after="60"/>
       </w:pPr>
+      <w:r>
+        <w:rPr>
+          <w:rFonts w:ascii="Times New Roman" w:hAnsi="Times New Roman"/>
+          <w:b/>
+          <w:i w:val="0"/>
+          <w:color w:val="000000"/>
+          <w:sz w:val="22"/>
+        </w:rPr>
+        <w:t>2. Direct Q4A measurement.</w:t>
+      </w:r>
       <w:r>
         <w:rPr>
           <w:rFonts w:ascii="Times New Roman" w:hAnsi="Times New Roman"/>
@@ -3760,14 +4569,23 @@
           <w:color w:val="000000"/>
           <w:sz w:val="22"/>
         </w:rPr>
-        <w:t>2. Direct Q4A measurement. Q4A (deployment continuation) has not been independently validated. Testing requires multi-stage tracking of systems that successfully pass the Q4 viability gate.</w:t>
+        <w:t xml:space="preserve"> Q4A (deployment continuation) has not been independently validated. Testing requires multi-stage tracking of systems that successfully pass the Q4 viability gate.</w:t>
       </w:r>
     </w:p>
     <w:p>
       <w:pPr>
-        <w:spacing w:before="0" w:after="40" w:line="260" w:lineRule="exact"/>
-        <w:ind w:left="720" w:hanging="360"/>
+        <w:spacing w:after="60"/>
       </w:pPr>
+      <w:r>
+        <w:rPr>
+          <w:rFonts w:ascii="Times New Roman" w:hAnsi="Times New Roman"/>
+          <w:b/>
+          <w:i w:val="0"/>
+          <w:color w:val="000000"/>
+          <w:sz w:val="22"/>
+        </w:rPr>
+        <w:t>3. B_in independent validation.</w:t>
+      </w:r>
       <w:r>
         <w:rPr>
           <w:rFonts w:ascii="Times New Roman" w:hAnsi="Times New Roman"/>
@@ -3776,14 +4594,23 @@
           <w:color w:val="000000"/>
           <w:sz w:val="22"/>
         </w:rPr>
-        <w:t>3. B_in independent validation. The internal stabilization operator (B_in) has not been tested independently of the other operators. Developing independent B_in metrics is a prerequisite for full four-operator validation.</w:t>
+        <w:t xml:space="preserve"> The internal stabilization operator (B_in) has not been tested independently of the other operators. Developing independent B_in metrics is a prerequisite for full four-operator validation.</w:t>
       </w:r>
     </w:p>
     <w:p>
       <w:pPr>
-        <w:spacing w:before="0" w:after="40" w:line="260" w:lineRule="exact"/>
-        <w:ind w:left="720" w:hanging="360"/>
+        <w:spacing w:after="60"/>
       </w:pPr>
+      <w:r>
+        <w:rPr>
+          <w:rFonts w:ascii="Times New Roman" w:hAnsi="Times New Roman"/>
+          <w:b/>
+          <w:i w:val="0"/>
+          <w:color w:val="000000"/>
+          <w:sz w:val="22"/>
+        </w:rPr>
+        <w:t>4. Non-institutional domain testing.</w:t>
+      </w:r>
       <w:r>
         <w:rPr>
           <w:rFonts w:ascii="Times New Roman" w:hAnsi="Times New Roman"/>
@@ -3792,14 +4619,23 @@
           <w:color w:val="000000"/>
           <w:sz w:val="22"/>
         </w:rPr>
-        <w:t>4. Non-institutional domain testing. All current TFP evidence comes from institutional domains (standards bodies, clinical trials, regulatory processes, patents). Testing in biological development, ecological succession, immune response, or other non-institutional domains is needed to assess the generality of the claims.</w:t>
+        <w:t xml:space="preserve"> All current TFP evidence comes from institutional domains (standards bodies, clinical trials, regulatory processes, patents). Testing in biological development, ecological succession, immune response, or other non-institutional domains is needed to assess the generality of the claims.</w:t>
       </w:r>
     </w:p>
     <w:p>
       <w:pPr>
-        <w:spacing w:before="0" w:after="40" w:line="260" w:lineRule="exact"/>
-        <w:ind w:left="720" w:hanging="360"/>
+        <w:spacing w:after="60"/>
       </w:pPr>
+      <w:r>
+        <w:rPr>
+          <w:rFonts w:ascii="Times New Roman" w:hAnsi="Times New Roman"/>
+          <w:b/>
+          <w:i w:val="0"/>
+          <w:color w:val="000000"/>
+          <w:sz w:val="22"/>
+        </w:rPr>
+        <w:t>5. Stronger quantitative predictions.</w:t>
+      </w:r>
       <w:r>
         <w:rPr>
           <w:rFonts w:ascii="Times New Roman" w:hAnsi="Times New Roman"/>
@@ -3808,14 +4644,23 @@
           <w:color w:val="000000"/>
           <w:sz w:val="22"/>
         </w:rPr>
-        <w:t>5. Stronger quantitative predictions. Current TFP predictions are directional (operator X peaks at stage Y). Moving to quantitative predictions—specifying expected effect size ranges—would strengthen the framework’s falsifiability.</w:t>
+        <w:t xml:space="preserve"> Current TFP predictions are directional (operator X peaks at stage Y). Moving to quantitative predictions—specifying expected effect size ranges—would strengthen the framework's falsifiability.</w:t>
       </w:r>
     </w:p>
     <w:p>
       <w:pPr>
-        <w:spacing w:before="0" w:after="40" w:line="260" w:lineRule="exact"/>
-        <w:ind w:left="720" w:hanging="360"/>
+        <w:spacing w:after="60"/>
       </w:pPr>
+      <w:r>
+        <w:rPr>
+          <w:rFonts w:ascii="Times New Roman" w:hAnsi="Times New Roman"/>
+          <w:b/>
+          <w:i w:val="0"/>
+          <w:color w:val="000000"/>
+          <w:sz w:val="22"/>
+        </w:rPr>
+        <w:t>6. Domain boundary conditions.</w:t>
+      </w:r>
       <w:r>
         <w:rPr>
           <w:rFonts w:ascii="Times New Roman" w:hAnsi="Times New Roman"/>
@@ -3824,14 +4669,23 @@
           <w:color w:val="000000"/>
           <w:sz w:val="22"/>
         </w:rPr>
-        <w:t>6. Domain boundary conditions. Systematic identification of which systems exhibit TFP structure and which do not. Understanding why some systems lack lifecycle structure is as important as understanding why others have it.</w:t>
+        <w:t xml:space="preserve"> Systematic identification of which systems exhibit TFP structure and which do not. Understanding why some systems lack lifecycle structure is as important as understanding why others have it.</w:t>
       </w:r>
     </w:p>
     <w:p>
       <w:pPr>
-        <w:spacing w:before="0" w:after="40" w:line="260" w:lineRule="exact"/>
-        <w:ind w:left="720" w:hanging="360"/>
+        <w:spacing w:after="60"/>
       </w:pPr>
+      <w:r>
+        <w:rPr>
+          <w:rFonts w:ascii="Times New Roman" w:hAnsi="Times New Roman"/>
+          <w:b/>
+          <w:i w:val="0"/>
+          <w:color w:val="000000"/>
+          <w:sz w:val="22"/>
+        </w:rPr>
+        <w:t>7. Inside-out generator search.</w:t>
+      </w:r>
       <w:r>
         <w:rPr>
           <w:rFonts w:ascii="Times New Roman" w:hAnsi="Times New Roman"/>
@@ -3840,14 +4694,23 @@
           <w:color w:val="000000"/>
           <w:sz w:val="22"/>
         </w:rPr>
-        <w:t>7. Inside-out generator search. Identifying the mechanism that generates the observed surface invariants (see Section 8).</w:t>
+        <w:t xml:space="preserve"> Identifying the mechanism that generates the observed surface invariants (see Section 8).</w:t>
       </w:r>
     </w:p>
     <w:p>
       <w:pPr>
-        <w:spacing w:before="0" w:after="40" w:line="260" w:lineRule="exact"/>
-        <w:ind w:left="720" w:hanging="360"/>
+        <w:spacing w:after="60"/>
       </w:pPr>
+      <w:r>
+        <w:rPr>
+          <w:rFonts w:ascii="Times New Roman" w:hAnsi="Times New Roman"/>
+          <w:b/>
+          <w:i w:val="0"/>
+          <w:color w:val="000000"/>
+          <w:sz w:val="22"/>
+        </w:rPr>
+        <w:t>8. Operator irreducibility.</w:t>
+      </w:r>
       <w:r>
         <w:rPr>
           <w:rFonts w:ascii="Times New Roman" w:hAnsi="Times New Roman"/>
@@ -3856,14 +4719,23 @@
           <w:color w:val="000000"/>
           <w:sz w:val="22"/>
         </w:rPr>
-        <w:t>8. Operator irreducibility. Are four operators the minimum number required, or could the observed signatures be explained by fewer (or more) operators? Formal analysis of operator independence and irreducibility is needed.</w:t>
+        <w:t xml:space="preserve"> Are four operators the minimum number required, or could the observed signatures be explained by fewer (or more) operators? Formal analysis of operator independence and irreducibility is needed.</w:t>
       </w:r>
     </w:p>
     <w:p>
       <w:pPr>
-        <w:spacing w:before="0" w:after="40" w:line="260" w:lineRule="exact"/>
-        <w:ind w:left="720" w:hanging="360"/>
+        <w:spacing w:after="60"/>
       </w:pPr>
+      <w:r>
+        <w:rPr>
+          <w:rFonts w:ascii="Times New Roman" w:hAnsi="Times New Roman"/>
+          <w:b/>
+          <w:i w:val="0"/>
+          <w:color w:val="000000"/>
+          <w:sz w:val="22"/>
+        </w:rPr>
+        <w:t>9. Cross-scale isomorphism.</w:t>
+      </w:r>
       <w:r>
         <w:rPr>
           <w:rFonts w:ascii="Times New Roman" w:hAnsi="Times New Roman"/>
@@ -3872,14 +4744,23 @@
           <w:color w:val="000000"/>
           <w:sz w:val="22"/>
         </w:rPr>
-        <w:t>9. Cross-scale isomorphism. TFP predicts that the same lifecycle structure appears at micro, meso, and macro scales. This prediction has not been tested.</w:t>
+        <w:t xml:space="preserve"> TFP predicts that the same lifecycle structure appears at micro, meso, and macro scales. This prediction has not been tested.</w:t>
       </w:r>
     </w:p>
     <w:p>
       <w:pPr>
-        <w:spacing w:before="0" w:after="40" w:line="260" w:lineRule="exact"/>
-        <w:ind w:left="720" w:hanging="360"/>
+        <w:spacing w:after="60"/>
       </w:pPr>
+      <w:r>
+        <w:rPr>
+          <w:rFonts w:ascii="Times New Roman" w:hAnsi="Times New Roman"/>
+          <w:b/>
+          <w:i w:val="0"/>
+          <w:color w:val="000000"/>
+          <w:sz w:val="22"/>
+        </w:rPr>
+        <w:t>10. Relation to existing frameworks.</w:t>
+      </w:r>
       <w:r>
         <w:rPr>
           <w:rFonts w:ascii="Times New Roman" w:hAnsi="Times New Roman"/>
@@ -3888,12 +4769,12 @@
           <w:color w:val="000000"/>
           <w:sz w:val="22"/>
         </w:rPr>
-        <w:t>10. Relation to existing frameworks. Systematic comparison of TFP with explore–exploit models, lifecycle frameworks in organizational science, phase transition models in physics, and developmental stage theories in biology.</w:t>
+        <w:t xml:space="preserve"> Systematic comparison of TFP with explore–exploit models, lifecycle frameworks in organizational science, phase transition models in physics, and developmental stage theories in biology.</w:t>
       </w:r>
     </w:p>
     <w:p>
       <w:pPr>
-        <w:spacing w:before="320" w:after="120"/>
+        <w:spacing w:after="120" w:before="240"/>
       </w:pPr>
       <w:r>
         <w:rPr>
@@ -3908,7 +4789,7 @@
     </w:p>
     <w:p>
       <w:pPr>
-        <w:spacing w:before="0" w:after="60" w:line="260" w:lineRule="exact"/>
+        <w:spacing w:after="60"/>
       </w:pPr>
       <w:r>
         <w:rPr>
@@ -3918,13 +4799,12 @@
           <w:color w:val="000000"/>
           <w:sz w:val="22"/>
         </w:rPr>
-        <w:t>TFP’s next stage of progress depends on contributions from researchers with diverse backgrounds. The following paths indicate how different expertise maps to open problems.</w:t>
+        <w:t>TFP's next stage of progress depends on contributions from researchers with diverse backgrounds. The following paths indicate how different expertise maps to open problems.</w:t>
       </w:r>
     </w:p>
     <w:p>
       <w:pPr>
-        <w:spacing w:before="0" w:after="40" w:line="260" w:lineRule="exact"/>
-        <w:ind w:left="720" w:hanging="360"/>
+        <w:spacing w:after="60"/>
       </w:pPr>
       <w:r>
         <w:rPr>
@@ -3934,7 +4814,7 @@
           <w:color w:val="000000"/>
           <w:sz w:val="22"/>
         </w:rPr>
-        <w:t xml:space="preserve">Computational researchers: </w:t>
+        <w:t>Computational researchers:</w:t>
       </w:r>
       <w:r>
         <w:rPr>
@@ -3944,13 +4824,12 @@
           <w:color w:val="000000"/>
           <w:sz w:val="22"/>
         </w:rPr>
-        <w:t>Run the permutation search on new domains, build latent-state rival models, search for minimal generators that reproduce TFP’s signatures.</w:t>
+        <w:t xml:space="preserve"> Run the permutation search on new domains, build latent-state rival models, search for minimal generators that reproduce TFP's signatures.</w:t>
       </w:r>
     </w:p>
     <w:p>
       <w:pPr>
-        <w:spacing w:before="0" w:after="40" w:line="260" w:lineRule="exact"/>
-        <w:ind w:left="720" w:hanging="360"/>
+        <w:spacing w:after="60"/>
       </w:pPr>
       <w:r>
         <w:rPr>
@@ -3960,7 +4839,7 @@
           <w:color w:val="000000"/>
           <w:sz w:val="22"/>
         </w:rPr>
-        <w:t xml:space="preserve">Behavioral scientists: </w:t>
+        <w:t>Behavioral scientists:</w:t>
       </w:r>
       <w:r>
         <w:rPr>
@@ -3970,13 +4849,12 @@
           <w:color w:val="000000"/>
           <w:sz w:val="22"/>
         </w:rPr>
-        <w:t>Test Q1 and Q4B predictions with process-tracing methods, design experiments that distinguish TFP from generic explore–exploit models.</w:t>
+        <w:t xml:space="preserve"> Test Q1 and Q4B predictions with process-tracing methods, design experiments that distinguish TFP from generic explore–exploit models.</w:t>
       </w:r>
     </w:p>
     <w:p>
       <w:pPr>
-        <w:spacing w:before="0" w:after="40" w:line="260" w:lineRule="exact"/>
-        <w:ind w:left="720" w:hanging="360"/>
+        <w:spacing w:after="60"/>
       </w:pPr>
       <w:r>
         <w:rPr>
@@ -3986,7 +4864,7 @@
           <w:color w:val="000000"/>
           <w:sz w:val="22"/>
         </w:rPr>
-        <w:t xml:space="preserve">Complexity scientists: </w:t>
+        <w:t>Complexity scientists:</w:t>
       </w:r>
       <w:r>
         <w:rPr>
@@ -3996,13 +4874,12 @@
           <w:color w:val="000000"/>
           <w:sz w:val="22"/>
         </w:rPr>
-        <w:t>Formalize the lifecycle as a dynamical system, test cross-scale predictions, explore connections to phase transition theory.</w:t>
+        <w:t xml:space="preserve"> Formalize the lifecycle as a dynamical system, test cross-scale predictions, explore connections to phase transition theory.</w:t>
       </w:r>
     </w:p>
     <w:p>
       <w:pPr>
-        <w:spacing w:before="0" w:after="40" w:line="260" w:lineRule="exact"/>
-        <w:ind w:left="720" w:hanging="360"/>
+        <w:spacing w:after="60"/>
       </w:pPr>
       <w:r>
         <w:rPr>
@@ -4012,7 +4889,7 @@
           <w:color w:val="000000"/>
           <w:sz w:val="22"/>
         </w:rPr>
-        <w:t xml:space="preserve">Data scientists: </w:t>
+        <w:t>Data scientists:</w:t>
       </w:r>
       <w:r>
         <w:rPr>
@@ -4022,13 +4899,12 @@
           <w:color w:val="000000"/>
           <w:sz w:val="22"/>
         </w:rPr>
-        <w:t>Apply the benchmark pipeline to new lifecycle datasets, develop improved operator metrics, test sensitivity to metric choice.</w:t>
+        <w:t xml:space="preserve"> Apply the benchmark pipeline to new lifecycle datasets, develop improved operator metrics, test sensitivity to metric choice.</w:t>
       </w:r>
     </w:p>
     <w:p>
       <w:pPr>
-        <w:spacing w:before="0" w:after="40" w:line="260" w:lineRule="exact"/>
-        <w:ind w:left="720" w:hanging="360"/>
+        <w:spacing w:after="60"/>
       </w:pPr>
       <w:r>
         <w:rPr>
@@ -4038,7 +4914,7 @@
           <w:color w:val="000000"/>
           <w:sz w:val="22"/>
         </w:rPr>
-        <w:t xml:space="preserve">AI researchers: </w:t>
+        <w:t>AI researchers:</w:t>
       </w:r>
       <w:r>
         <w:rPr>
@@ -4048,13 +4924,12 @@
           <w:color w:val="000000"/>
           <w:sz w:val="22"/>
         </w:rPr>
-        <w:t>Build TFP-inspired architectures, test whether TFP lifecycle structure improves reinforcement learning agents, investigate whether learned agents spontaneously develop TFP-like stage structure.</w:t>
+        <w:t xml:space="preserve"> Build TFP-inspired architectures, test whether TFP lifecycle structure improves reinforcement learning agents, investigate whether learned agents spontaneously develop TFP-like stage structure.</w:t>
       </w:r>
     </w:p>
     <w:p>
       <w:pPr>
-        <w:spacing w:before="0" w:after="40" w:line="260" w:lineRule="exact"/>
-        <w:ind w:left="720" w:hanging="360"/>
+        <w:spacing w:after="60"/>
       </w:pPr>
       <w:r>
         <w:rPr>
@@ -4064,7 +4939,7 @@
           <w:color w:val="000000"/>
           <w:sz w:val="22"/>
         </w:rPr>
-        <w:t xml:space="preserve">Methodologists: </w:t>
+        <w:t>Methodologists:</w:t>
       </w:r>
       <w:r>
         <w:rPr>
@@ -4074,12 +4949,12 @@
           <w:color w:val="000000"/>
           <w:sz w:val="22"/>
         </w:rPr>
-        <w:t>Develop better falsification tests, formalize the invariant hierarchy, design statistical frameworks for comparing lifecycle grammars.</w:t>
+        <w:t xml:space="preserve"> Develop better falsification tests, formalize the invariant hierarchy, design statistical frameworks for comparing lifecycle grammars.</w:t>
       </w:r>
     </w:p>
     <w:p>
       <w:pPr>
-        <w:spacing w:before="320" w:after="120"/>
+        <w:spacing w:after="120" w:before="240"/>
       </w:pPr>
       <w:r>
         <w:rPr>
@@ -4094,7 +4969,7 @@
     </w:p>
     <w:p>
       <w:pPr>
-        <w:spacing w:before="0" w:after="60" w:line="260" w:lineRule="exact"/>
+        <w:spacing w:after="60"/>
       </w:pPr>
       <w:r>
         <w:rPr>
@@ -4109,7 +4984,7 @@
     </w:p>
     <w:p>
       <w:pPr>
-        <w:spacing w:before="0" w:after="60" w:line="260" w:lineRule="exact"/>
+        <w:spacing w:after="60"/>
       </w:pPr>
       <w:r>
         <w:rPr>
@@ -4119,12 +4994,12 @@
           <w:color w:val="000000"/>
           <w:sz w:val="22"/>
         </w:rPr>
-        <w:t>The canonical invariant hierarchy (Section 4) provides a clear map of what is well-established and what is speculative. The benchmark tasks (Section 7) provide explicit rival models and kill criteria for each claim. The mechanism roadmap (Section 8) identifies the gap between surface invariants and their underlying generator without overstating current theoretical understanding.</w:t>
+        <w:t>The canonical invariant hierarchy (Section 4) provides a clear map of what is well-established and what is speculative. The benchmark tasks (Section 7) provide explicit rival models, minimum data requirements, and kill criteria for each claim. The mechanism roadmap (Section 8) identifies the gap between surface invariants and their underlying generator without overstating current theoretical understanding.</w:t>
       </w:r>
     </w:p>
     <w:p>
       <w:pPr>
-        <w:spacing w:before="0" w:after="60" w:line="260" w:lineRule="exact"/>
+        <w:spacing w:after="60"/>
       </w:pPr>
       <w:r>
         <w:rPr>
@@ -4134,12 +5009,12 @@
           <w:color w:val="000000"/>
           <w:sz w:val="22"/>
         </w:rPr>
-        <w:t>The next stage of progress depends on outsiders trying to break, formalize, or extend TFP. Researchers who find that TFP’s predictions hold in new domains will strengthen the program’s empirical foundation. Researchers who find that predictions fail will help identify boundary conditions and may reveal fundamental limitations. Both outcomes advance the research program. This paper provides the tools to begin.</w:t>
+        <w:t>The next stage of progress depends on independent replication and extension by outside researchers. Researchers who find that TFP predictions hold in new domains will strengthen the program's empirical foundation. Researchers who find that predictions fail will help identify boundary conditions and may reveal fundamental limitations. Both outcomes advance the research program. This paper provides the tools to begin.</w:t>
       </w:r>
     </w:p>
     <w:p>
       <w:pPr>
-        <w:spacing w:before="320" w:after="120"/>
+        <w:spacing w:after="120" w:before="240"/>
       </w:pPr>
       <w:r>
         <w:rPr>
@@ -4154,8 +5029,7 @@
     </w:p>
     <w:p>
       <w:pPr>
-        <w:spacing w:before="0" w:after="60" w:line="260" w:lineRule="exact"/>
-        <w:ind w:left="720" w:hanging="720"/>
+        <w:spacing w:after="60"/>
       </w:pPr>
       <w:r>
         <w:rPr>
@@ -4165,13 +5039,12 @@
           <w:color w:val="000000"/>
           <w:sz w:val="22"/>
         </w:rPr>
-        <w:t>[1] Ollar, A. (2026). Dual-Memory Dissociation in Adaptive Sequential Decision-Making: A Simulation Study. Manuscript submitted to Expert Systems with Applications.</w:t>
+        <w:t>[1] Ollar, A. (2026). Dual-Memory Dissociation in Adaptive Sequential Decision-Making: A Simulation Study. Submitted to Expert Systems with Applications. Preprint available at https://doi.org/10.5281/zenodo.18930571.</w:t>
       </w:r>
     </w:p>
     <w:p>
       <w:pPr>
-        <w:spacing w:before="0" w:after="60" w:line="260" w:lineRule="exact"/>
-        <w:ind w:left="720" w:hanging="720"/>
+        <w:spacing w:after="60"/>
       </w:pPr>
       <w:r>
         <w:rPr>
@@ -4181,13 +5054,12 @@
           <w:color w:val="000000"/>
           <w:sz w:val="22"/>
         </w:rPr>
-        <w:t>[2] Ollar, A. (2026). Battery Attribution and Cross-Dataset Dissociation of Lifecycle Stage Functions. Manuscript submitted to Journal of Power Sources.</w:t>
+        <w:t>[2] Ollar, A. (2026). Battery Attribution and Cross-Dataset Dissociation of Lifecycle Stage Functions. Submitted to Journal of Power Sources. Preprint available upon request.</w:t>
       </w:r>
     </w:p>
     <w:p>
       <w:pPr>
-        <w:spacing w:before="0" w:after="60" w:line="260" w:lineRule="exact"/>
-        <w:ind w:left="720" w:hanging="720"/>
+        <w:spacing w:after="60"/>
       </w:pPr>
       <w:r>
         <w:rPr>
@@ -4202,8 +5074,7 @@
     </w:p>
     <w:p>
       <w:pPr>
-        <w:spacing w:before="0" w:after="60" w:line="260" w:lineRule="exact"/>
-        <w:ind w:left="720" w:hanging="720"/>
+        <w:spacing w:after="60"/>
       </w:pPr>
       <w:r>
         <w:rPr>
@@ -4213,13 +5084,12 @@
           <w:color w:val="000000"/>
           <w:sz w:val="22"/>
         </w:rPr>
-        <w:t>[4] Ollar, A. (2026). Structural Opposition and Viability-Gated Reseeding in Institutional Lifecycles. Manuscript in preparation. [Paper 4]</w:t>
+        <w:t>[4] Ollar, A. (2026). Structural Opposition and Viability-Gated Reseeding in Institutional Lifecycles. Preprint available at https://doi.org/10.5281/zenodo.18930571.</w:t>
       </w:r>
     </w:p>
     <w:p>
       <w:pPr>
-        <w:spacing w:before="0" w:after="60" w:line="260" w:lineRule="exact"/>
-        <w:ind w:left="720" w:hanging="720"/>
+        <w:spacing w:after="60"/>
       </w:pPr>
       <w:r>
         <w:rPr>
@@ -4229,13 +5099,12 @@
           <w:color w:val="000000"/>
           <w:sz w:val="22"/>
         </w:rPr>
-        <w:t>[5] Ollar, A. (2026). Conserved Operator–Stage Binding Across Institutional Domains: A Permutation-Based Test of Lifecycle Grammar Non-Interchangeability. Manuscript in preparation. [Paper 5]</w:t>
+        <w:t>[5] Ollar, A. (2026). Conserved Operator–Stage Binding Across Institutional Domains: A Permutation-Based Test of Lifecycle Grammar Non-Interchangeability. Preprint in preparation.</w:t>
       </w:r>
     </w:p>
     <w:p>
       <w:pPr>
-        <w:spacing w:before="0" w:after="60" w:line="260" w:lineRule="exact"/>
-        <w:ind w:left="720" w:hanging="720"/>
+        <w:spacing w:after="60"/>
       </w:pPr>
       <w:r>
         <w:rPr>
@@ -4250,8 +5119,7 @@
     </w:p>
     <w:p>
       <w:pPr>
-        <w:spacing w:before="0" w:after="60" w:line="260" w:lineRule="exact"/>
-        <w:ind w:left="720" w:hanging="720"/>
+        <w:spacing w:after="60"/>
       </w:pPr>
       <w:r>
         <w:rPr>
@@ -4266,8 +5134,7 @@
     </w:p>
     <w:p>
       <w:pPr>
-        <w:spacing w:before="0" w:after="60" w:line="260" w:lineRule="exact"/>
-        <w:ind w:left="720" w:hanging="720"/>
+        <w:spacing w:after="60"/>
       </w:pPr>
       <w:r>
         <w:rPr>
@@ -4282,8 +5149,7 @@
     </w:p>
     <w:p>
       <w:pPr>
-        <w:spacing w:before="0" w:after="60" w:line="260" w:lineRule="exact"/>
-        <w:ind w:left="720" w:hanging="720"/>
+        <w:spacing w:after="60"/>
       </w:pPr>
       <w:r>
         <w:rPr>
@@ -4298,8 +5164,7 @@
     </w:p>
     <w:p>
       <w:pPr>
-        <w:spacing w:before="0" w:after="60" w:line="260" w:lineRule="exact"/>
-        <w:ind w:left="720" w:hanging="720"/>
+        <w:spacing w:after="60"/>
       </w:pPr>
       <w:r>
         <w:rPr>
@@ -4314,7 +5179,7 @@
     </w:p>
     <w:p>
       <w:pPr>
-        <w:spacing w:before="320" w:after="120"/>
+        <w:spacing w:after="120" w:before="240"/>
       </w:pPr>
       <w:r>
         <w:rPr>
@@ -4329,7 +5194,7 @@
     </w:p>
     <w:p>
       <w:pPr>
-        <w:spacing w:before="0" w:after="60" w:line="260" w:lineRule="exact"/>
+        <w:spacing w:after="60"/>
       </w:pPr>
       <w:r>
         <w:rPr>
@@ -4344,7 +5209,7 @@
     </w:p>
     <w:p>
       <w:pPr>
-        <w:spacing w:before="320" w:after="120"/>
+        <w:spacing w:after="120" w:before="240"/>
       </w:pPr>
       <w:r>
         <w:rPr>
@@ -4359,7 +5224,7 @@
     </w:p>
     <w:p>
       <w:pPr>
-        <w:spacing w:before="0" w:after="60" w:line="260" w:lineRule="exact"/>
+        <w:spacing w:after="60"/>
       </w:pPr>
       <w:r>
         <w:rPr>
@@ -4369,12 +5234,12 @@
           <w:color w:val="000000"/>
           <w:sz w:val="22"/>
         </w:rPr>
-        <w:t>Analysis code is available at https://github.com/aollar/TFP-core (private repository; access available on request to the author). Supplementary materials, including benchmark scripts and operator measurement templates, are available at https://github.com/aollar/TFP-supplementary-materials (public repository).</w:t>
+        <w:t>Analysis code is currently in a private repository (aollar/TFP-core) and will be made public upon publication. In the interim, the public repository aollar/TFP-supplementary-materials (https://github.com/aollar/TFP-supplementary-materials) contains papers, preregistration, and benchmark specifications.</w:t>
       </w:r>
     </w:p>
     <w:p>
       <w:pPr>
-        <w:spacing w:before="0" w:after="60" w:line="260" w:lineRule="exact"/>
+        <w:spacing w:after="60"/>
       </w:pPr>
       <w:r>
         <w:rPr>
@@ -4389,8 +5254,7 @@
     </w:p>
     <w:p>
       <w:pPr>
-        <w:spacing w:before="0" w:after="40" w:line="260" w:lineRule="exact"/>
-        <w:ind w:left="720" w:hanging="360"/>
+        <w:spacing w:after="60"/>
       </w:pPr>
       <w:r>
         <w:rPr>
@@ -4405,8 +5269,7 @@
     </w:p>
     <w:p>
       <w:pPr>
-        <w:spacing w:before="0" w:after="40" w:line="260" w:lineRule="exact"/>
-        <w:ind w:left="720" w:hanging="360"/>
+        <w:spacing w:after="60"/>
       </w:pPr>
       <w:r>
         <w:rPr>
@@ -4421,8 +5284,7 @@
     </w:p>
     <w:p>
       <w:pPr>
-        <w:spacing w:before="0" w:after="40" w:line="260" w:lineRule="exact"/>
-        <w:ind w:left="720" w:hanging="360"/>
+        <w:spacing w:after="60"/>
       </w:pPr>
       <w:r>
         <w:rPr>
@@ -4437,8 +5299,7 @@
     </w:p>
     <w:p>
       <w:pPr>
-        <w:spacing w:before="0" w:after="40" w:line="260" w:lineRule="exact"/>
-        <w:ind w:left="720" w:hanging="360"/>
+        <w:spacing w:after="60"/>
       </w:pPr>
       <w:r>
         <w:rPr>
@@ -4453,8 +5314,7 @@
     </w:p>
     <w:p>
       <w:pPr>
-        <w:spacing w:before="0" w:after="40" w:line="260" w:lineRule="exact"/>
-        <w:ind w:left="720" w:hanging="360"/>
+        <w:spacing w:after="60"/>
       </w:pPr>
       <w:r>
         <w:rPr>
@@ -4469,8 +5329,7 @@
     </w:p>
     <w:p>
       <w:pPr>
-        <w:spacing w:before="0" w:after="40" w:line="260" w:lineRule="exact"/>
-        <w:ind w:left="720" w:hanging="360"/>
+        <w:spacing w:after="60"/>
       </w:pPr>
       <w:r>
         <w:rPr>
@@ -4502,24 +5361,12 @@
       <w:jc w:val="center"/>
     </w:pPr>
     <w:r>
-      <w:rPr>
-        <w:rFonts w:ascii="Times New Roman" w:hAnsi="Times New Roman"/>
-        <w:sz w:val="20"/>
-      </w:rPr>
       <w:fldChar w:fldCharType="begin"/>
     </w:r>
     <w:r>
-      <w:rPr>
-        <w:rFonts w:ascii="Times New Roman" w:hAnsi="Times New Roman"/>
-        <w:sz w:val="20"/>
-      </w:rPr>
       <w:instrText xml:space="preserve"> PAGE </w:instrText>
     </w:r>
     <w:r>
-      <w:rPr>
-        <w:rFonts w:ascii="Times New Roman" w:hAnsi="Times New Roman"/>
-        <w:sz w:val="20"/>
-      </w:rPr>
       <w:fldChar w:fldCharType="end"/>
     </w:r>
   </w:p>

</xml_diff>

<commit_message>
Final polish: Start Here box, screening check rename, Q1 clarity, code availability
- Added Start Here roadmap box after keywords
- Renamed Minimum Viable Test to Entry-Level Screening Check
- Tightened Q1 wording with explicit not-yet-validated note
- Expanded Data/Code Availability with public repo details
- Fixed reference wording for papers in review

Co-Authored-By: Claude Opus 4.6 (1M context) <noreply@anthropic.com>
</commit_message>
<xml_diff>
--- a/papers/TFP_Handoff_Paper.docx
+++ b/papers/TFP_Handoff_Paper.docx
@@ -86,6 +86,67 @@
           <w:sz w:val="22"/>
         </w:rPr>
         <w:t>Keywords: lifecycle grammar, information operators, stage non-interchangeability, benchmark, falsification, research program, cross-domain invariants</w:t>
+      </w:r>
+    </w:p>
+    <w:p>
+      <w:r>
+        <w:rPr>
+          <w:rFonts w:ascii="Times New Roman" w:hAnsi="Times New Roman"/>
+          <w:b/>
+          <w:color w:val="2F5496"/>
+          <w:sz w:val="24"/>
+        </w:rPr>
+        <w:t>Start Here</w:t>
+      </w:r>
+    </w:p>
+    <w:p>
+      <w:r>
+        <w:rPr>
+          <w:rFonts w:ascii="Times New Roman" w:hAnsi="Times New Roman"/>
+          <w:sz w:val="22"/>
+        </w:rPr>
+        <w:t>To understand what TFP claims: read Section 2.</w:t>
+        <w:br/>
+      </w:r>
+      <w:r>
+        <w:rPr>
+          <w:rFonts w:ascii="Times New Roman" w:hAnsi="Times New Roman"/>
+          <w:sz w:val="22"/>
+        </w:rPr>
+        <w:t>To see what has been validated: read Table 1 in Section 3.</w:t>
+        <w:br/>
+      </w:r>
+      <w:r>
+        <w:rPr>
+          <w:rFonts w:ascii="Times New Roman" w:hAnsi="Times New Roman"/>
+          <w:sz w:val="22"/>
+        </w:rPr>
+        <w:t>To test TFP on your own data: follow the protocol in Section 6.</w:t>
+        <w:br/>
+      </w:r>
+      <w:r>
+        <w:rPr>
+          <w:rFonts w:ascii="Times New Roman" w:hAnsi="Times New Roman"/>
+          <w:sz w:val="22"/>
+        </w:rPr>
+        <w:t>To find benchmark tasks and rival models: see Section 7.</w:t>
+        <w:br/>
+      </w:r>
+      <w:r>
+        <w:rPr>
+          <w:rFonts w:ascii="Times New Roman" w:hAnsi="Times New Roman"/>
+          <w:sz w:val="22"/>
+        </w:rPr>
+        <w:t>To identify open problems where your expertise applies: see Section 9.</w:t>
+        <w:br/>
+      </w:r>
+      <w:r>
+        <w:rPr>
+          <w:rFonts w:ascii="Times New Roman" w:hAnsi="Times New Roman"/>
+          <w:sz w:val="22"/>
+        </w:rPr>
+        <w:t>To report results (including negative findings): see CONTRIBUTING.md in the public repository.</w:t>
+        <w:br/>
       </w:r>
     </w:p>
     <w:p>
@@ -265,7 +326,7 @@
           <w:color w:val="000000"/>
           <w:sz w:val="22"/>
         </w:rPr>
-        <w:t>• Q1 (Generation): The system stabilizes internally before engaging with external input. In lifecycle terms, this is the pre-engagement preparation phase.</w:t>
+        <w:t>• Q1 (Generation): The system forms an initial internal reference point before external engagement begins. In lifecycle terms, this corresponds to proposal drafting, study design, or initial filing. Q1 remains the least validated stage and is not directly tested in the current evidence base.</w:t>
       </w:r>
     </w:p>
     <w:p>
@@ -2944,7 +3005,7 @@
           <w:color w:val="000000"/>
           <w:sz w:val="22"/>
         </w:rPr>
-        <w:t>• At least one measurable proxy for each operator you intend to test (see Table 2). At minimum, an external coupling metric (e.g., cross-references, external collaborators, incoming citations) is required for the minimum viable test.</w:t>
+        <w:t>• At least one measurable proxy for each operator you intend to test (see Table 2). At minimum, an external coupling metric (e.g., cross-references, external collaborators, incoming citations) is required for the entry-level screening check.</w:t>
       </w:r>
     </w:p>
     <w:p>
@@ -3154,7 +3215,7 @@
           <w:color w:val="2F5496"/>
           <w:sz w:val="24"/>
         </w:rPr>
-        <w:t>6.4 Minimum Viable Test</w:t>
+        <w:t>6.4 Entry-Level Screening Check</w:t>
       </w:r>
     </w:p>
     <w:p>
@@ -3169,7 +3230,7 @@
           <w:color w:val="000000"/>
           <w:sz w:val="22"/>
         </w:rPr>
-        <w:t>For researchers who want the simplest possible TFP test before committing to the full protocol: if you have lifecycle data with three or more timestamped stages and a measurable external coupling metric (e.g., cross-references, external collaborators, incoming citations), you can test whether coupling peaks at the selection stage (Q2). If it does, that is consistent with TFP. If coupling peaks at a different stage, that is evidence against TFP's operator–stage binding prediction. This single test is not sufficient to validate TFP, but it is sufficient to motivate or discourage the full protocol.</w:t>
+        <w:t>For researchers who want a preliminary screening check to determine whether a fuller benchmark run is warranted before committing to the full protocol: if you have lifecycle data with three or more timestamped stages and a measurable external coupling metric (e.g., cross-references, external collaborators, incoming citations), you can test whether coupling peaks at the selection stage (Q2). If it does, that is consistent with TFP. If coupling peaks at a different stage, that is evidence against TFP's operator–stage binding prediction. This single test is not sufficient to validate TFP, but it is sufficient to motivate or discourage the full protocol.</w:t>
       </w:r>
     </w:p>
     <w:p>

</xml_diff>

<commit_message>
Fix all references: correct DOIs for Papers A, B, 4; add missing DOIs
Handoff Paper:
- [1] Paper A: DOI 10.5281/zenodo.18929188 (was truncated)
- [2] Paper B: DOI 10.5281/zenodo.18809446 (was missing)
- [3] Paper C: DOI 10.5281/zenodo.18930571 (correct)
- [4] Paper 4: DOI 10.5281/zenodo.19157916 (was using Paper C DOI)
- [5] Paper 5: preprint forthcoming

Paper 5:
- 2026a Paper A: added DOI 18929188
- 2026b Paper 4: fixed DOI from 18930571 to 19157916
- 2026c Paper B: added DOI 18809446

Co-Authored-By: Claude Opus 4.6 (1M context) <noreply@anthropic.com>
</commit_message>
<xml_diff>
--- a/papers/TFP_Handoff_Paper.docx
+++ b/papers/TFP_Handoff_Paper.docx
@@ -5100,7 +5100,7 @@
           <w:color w:val="000000"/>
           <w:sz w:val="22"/>
         </w:rPr>
-        <w:t>[1] Ollar, A. (2026). Dual-Memory Dissociation in Adaptive Sequential Decision-Making: A Simulation Study. Submitted to Expert Systems with Applications. Preprint available at https://doi.org/10.5281/zenodo.18930571.</w:t>
+        <w:t>[1] Ollar, A. (2026). Dual-memory dissociation under partial observability: An identifiability-governed phase transition. Submitted to Expert Systems with Applications. Preprint: https://doi.org/10.5281/zenodo.18929188</w:t>
       </w:r>
     </w:p>
     <w:p>
@@ -5115,7 +5115,7 @@
           <w:color w:val="000000"/>
           <w:sz w:val="22"/>
         </w:rPr>
-        <w:t>[2] Ollar, A. (2026). Battery Attribution and Cross-Dataset Dissociation of Lifecycle Stage Functions. Submitted to Journal of Power Sources. Preprint available upon request.</w:t>
+        <w:t>[2] Ollar, A. (2026). A dissociation test for causal attribution under partial observability: Separate memory channels for rate pressure and capacity damage in Li-ion batteries. Submitted to Journal of Power Sources. Preprint: https://doi.org/10.5281/zenodo.18809446</w:t>
       </w:r>
     </w:p>
     <w:p>
@@ -5130,7 +5130,7 @@
           <w:color w:val="000000"/>
           <w:sz w:val="22"/>
         </w:rPr>
-        <w:t>[3] Ollar, A. (2026). Structured Reseeding After Failure: Depletion-Gated Reorientation in a Foraging Task. Zenodo. https://doi.org/10.5281/zenodo.18930571</w:t>
+        <w:t>[3] Ollar, A. (2026). Depletion-gated reorientation: A minimal mechanism for efficient spatial foraging. Zenodo. https://doi.org/10.5281/zenodo.18930571</w:t>
       </w:r>
     </w:p>
     <w:p>
@@ -5145,7 +5145,7 @@
           <w:color w:val="000000"/>
           <w:sz w:val="22"/>
         </w:rPr>
-        <w:t>[4] Ollar, A. (2026). Structural Opposition and Viability-Gated Reseeding in Institutional Lifecycles. Preprint available at https://doi.org/10.5281/zenodo.18930571.</w:t>
+        <w:t>[4] Ollar, A. (2026). Structured reseeding after failure: Asymmetric selection-transformation cycles in macroeconomic, biological, and cognitive systems. Zenodo. https://doi.org/10.5281/zenodo.19157916</w:t>
       </w:r>
     </w:p>
     <w:p>
@@ -5160,7 +5160,7 @@
           <w:color w:val="000000"/>
           <w:sz w:val="22"/>
         </w:rPr>
-        <w:t>[5] Ollar, A. (2026). Conserved Operator–Stage Binding Across Institutional Domains: A Permutation-Based Test of Lifecycle Grammar Non-Interchangeability. Preprint in preparation.</w:t>
+        <w:t>[5] Ollar, A. (2026). Non-interchangeable stage functions in staged adaptive systems: A forced-choice test of operator-stage binding across four domains. Preprint forthcoming on Zenodo.</w:t>
       </w:r>
     </w:p>
     <w:p>

</xml_diff>

<commit_message>
Fix double-The, move keywords after abstract, remove date line
Co-Authored-By: Claude Opus 4.6 (1M context) <noreply@anthropic.com>
</commit_message>
<xml_diff>
--- a/papers/TFP_Handoff_Paper.docx
+++ b/papers/TFP_Handoff_Paper.docx
@@ -70,22 +70,6 @@
           <w:color w:val="000000"/>
           <w:sz w:val="22"/>
         </w:rPr>
-        <w:t>March 2026</w:t>
-      </w:r>
-    </w:p>
-    <w:p>
-      <w:pPr>
-        <w:spacing w:after="160"/>
-      </w:pPr>
-      <w:r>
-        <w:rPr>
-          <w:rFonts w:ascii="Times New Roman" w:hAnsi="Times New Roman"/>
-          <w:b w:val="0"/>
-          <w:i/>
-          <w:color w:val="000000"/>
-          <w:sz w:val="22"/>
-        </w:rPr>
-        <w:t>Keywords: lifecycle grammar, information operators, stage non-interchangeability, benchmark, falsification, research program, cross-domain invariants</w:t>
       </w:r>
     </w:p>
     <w:p>
@@ -177,6 +161,21 @@
           <w:sz w:val="22"/>
         </w:rPr>
         <w:t>The First Pattern (TFP) is a proposed lifecycle grammar: a claim that adaptive processes exhibiting staged progression share conserved, non-interchangeable stage functions organized around four information operators. This paper provides the minimum viable research package for outside researchers to independently test, replicate, falsify, or extend TFP predictions in new domains. We present: (a) a validated claims table with explicit confidence levels and assignment criteria; (b) canonical operational definitions for each information operator with measurable proxies; (c) step-by-step test protocols with prerequisites, time estimates, and explicit failure criteria; (d) benchmark tasks with rival models, minimum data requirements, and kill criteria; and (e) a catalog of open problems ranked by tractability. The current evidence base spans five papers covering institutional lifecycle domains (standards bodies, clinical trials, regulatory processes, patents), simulation, battery degradation, and foraging. Six core signatures have been validated at high confidence across multiple domains. Several predictions remain untested, the theoretical mechanism underlying the observed invariants is unknown, and the boundary conditions have not been systematically mapped. Every claim carries an explicit confidence level and every test carries explicit failure criteria. Researchers who find that TFP predictions fail in their domain will have contributed as much to the program as those who find support.</w:t>
+      </w:r>
+    </w:p>
+    <w:p>
+      <w:pPr>
+        <w:spacing w:after="160"/>
+      </w:pPr>
+      <w:r>
+        <w:rPr>
+          <w:rFonts w:ascii="Times New Roman" w:hAnsi="Times New Roman"/>
+          <w:b w:val="0"/>
+          <w:i/>
+          <w:color w:val="000000"/>
+          <w:sz w:val="22"/>
+        </w:rPr>
+        <w:t>Keywords: lifecycle grammar, information operators, stage non-interchangeability, benchmark, falsification, research program, cross-domain invariants</w:t>
       </w:r>
     </w:p>
     <w:p>

</xml_diff>

<commit_message>
Fix operator definitions: use Bind_in/Explore_out/Explore_in/Bind_out (TFP terms, not OPS)
Co-Authored-By: Claude Opus 4.6 (1M context) <noreply@anthropic.com>
</commit_message>
<xml_diff>
--- a/papers/TFP_Handoff_Paper.docx
+++ b/papers/TFP_Handoff_Paper.docx
@@ -415,7 +415,7 @@
           <w:color w:val="000000"/>
           <w:sz w:val="22"/>
         </w:rPr>
-        <w:t>• B_in (Internal anchor): Sticky internal reference resistant to change. Measurable as revision rate decline, protocol stability, self-citation persistence.</w:t>
+        <w:t>• Bind_in (B_in): Internal binding and stabilization. The system forms a stable internal reference point. Measurable as revision rate decline, protocol stability, self-citation persistence.</w:t>
       </w:r>
     </w:p>
     <w:p>
@@ -430,7 +430,7 @@
           <w:color w:val="000000"/>
           <w:sz w:val="22"/>
         </w:rPr>
-        <w:t>• E_out (External gathering): Broad scanning, channel-changing, gathering novelty. Measurable as cross-reference diversity, collaborator count, comment volume.</w:t>
+        <w:t>• Explore_out (E_out): External exploration and coupling. The system scans and gathers from external sources. Measurable as cross-reference diversity, collaborator count, comment volume.</w:t>
       </w:r>
     </w:p>
     <w:p>
@@ -445,7 +445,7 @@
           <w:color w:val="000000"/>
           <w:sz w:val="22"/>
         </w:rPr>
-        <w:t>• E_in (Internal narrowing): Concluding, eliminating options, reducing candidates. Measurable as text diff magnitude, outcome count reduction, coupling rate.</w:t>
+        <w:t>• Explore_in (E_in): Internal exploration and transformation. The system refines, narrows, and integrates internally. Measurable as text diff magnitude, outcome count reduction, coupling rate.</w:t>
       </w:r>
     </w:p>
     <w:p>
@@ -460,7 +460,7 @@
           <w:color w:val="000000"/>
           <w:sz w:val="22"/>
         </w:rPr>
-        <w:t>• B_out (External commitment): Persistent global write, difficult to reverse. Measurable as publication, grant award, results posting, effective date.</w:t>
+        <w:t>• Bind_out (B_out): External binding and commitment. The system commits irreversibly to an external boundary. Measurable as publication, grant award, results posting, effective date.</w:t>
       </w:r>
     </w:p>
     <w:p>

</xml_diff>

<commit_message>
Add dual-operator structure: entry + exit operators per quadrant
Each quadrant has two operators in sequence (entry -> exit).
Current evidence validates entry operators only.
Exit operators and within-quadrant dynamics noted as open problems.

Co-Authored-By: Claude Opus 4.6 (1M context) <noreply@anthropic.com>
</commit_message>
<xml_diff>
--- a/papers/TFP_Handoff_Paper.docx
+++ b/papers/TFP_Handoff_Paper.docx
@@ -371,6 +371,58 @@
           <w:sz w:val="22"/>
         </w:rPr>
         <w:t>• Q4 (Deployment): The system makes irreversible external commitments. Q4 bifurcates into Q4A (continuation along the current trajectory) and Q4B (viability-gated return to earlier lifecycle functions after failure).</w:t>
+      </w:r>
+    </w:p>
+    <w:p>
+      <w:r>
+        <w:rPr>
+          <w:rFonts w:ascii="Times New Roman" w:hAnsi="Times New Roman"/>
+          <w:sz w:val="22"/>
+        </w:rPr>
+        <w:t>Each quadrant comprises two information operators in sequence -- an entry operator and an exit operator -- that together produce the quadrant's function:</w:t>
+      </w:r>
+    </w:p>
+    <w:p>
+      <w:r>
+        <w:rPr>
+          <w:rFonts w:ascii="Times New Roman" w:hAnsi="Times New Roman"/>
+          <w:sz w:val="22"/>
+        </w:rPr>
+        <w:t>Q1: Bind_in -&gt; Explore_in  (stabilize internally, then explore internally)</w:t>
+        <w:br/>
+      </w:r>
+      <w:r>
+        <w:rPr>
+          <w:rFonts w:ascii="Times New Roman" w:hAnsi="Times New Roman"/>
+          <w:sz w:val="22"/>
+        </w:rPr>
+        <w:t>Q2: Explore_out -&gt; Bind_in  (gather externally, then consolidate internally)</w:t>
+        <w:br/>
+      </w:r>
+      <w:r>
+        <w:rPr>
+          <w:rFonts w:ascii="Times New Roman" w:hAnsi="Times New Roman"/>
+          <w:sz w:val="22"/>
+        </w:rPr>
+        <w:t>Q3: Explore_in -&gt; Bind_out  (transform internally, then commit externally)</w:t>
+        <w:br/>
+      </w:r>
+      <w:r>
+        <w:rPr>
+          <w:rFonts w:ascii="Times New Roman" w:hAnsi="Times New Roman"/>
+          <w:sz w:val="22"/>
+        </w:rPr>
+        <w:t>Q4: Bind_out -&gt; Explore_out  (deploy externally, then propagate)</w:t>
+        <w:br/>
+      </w:r>
+    </w:p>
+    <w:p>
+      <w:r>
+        <w:rPr>
+          <w:rFonts w:ascii="Times New Roman" w:hAnsi="Times New Roman"/>
+          <w:sz w:val="22"/>
+        </w:rPr>
+        <w:t>The current empirical evidence validates the entry operator at each stage: Explore_out at Q2, Explore_in at Q3, and Bind_out at Q4. The exit operators and the within-quadrant transition dynamics remain open problems for future work.</w:t>
       </w:r>
     </w:p>
     <w:p>

</xml_diff>

<commit_message>
Fix operator table: use Bind_in/Explore_out/Explore_in/Bind_out, remove OPS symbols (Di/Oe/Oi/De). Fix EIL name in validation table.
Co-Authored-By: Claude Opus 4.6 (1M context) <noreply@anthropic.com>
</commit_message>
<xml_diff>
--- a/papers/TFP_Handoff_Paper.docx
+++ b/papers/TFP_Handoff_Paper.docx
@@ -1846,18 +1846,8 @@
             <w:tcW w:type="dxa" w:w="1728"/>
           </w:tcPr>
           <w:p>
-            <w:pPr>
-              <w:spacing w:after="20" w:before="20"/>
-            </w:pPr>
-            <w:r/>
             <w:r>
-              <w:rPr>
-                <w:rFonts w:ascii="Times New Roman" w:hAnsi="Times New Roman"/>
-                <w:b w:val="0"/>
-                <w:color w:val="000000"/>
-                <w:sz w:val="20"/>
-              </w:rPr>
-              <w:t>EIL (interlocking loop)</w:t>
+              <w:t>EIL (Energy Integration Loop)</w:t>
             </w:r>
           </w:p>
         </w:tc>
@@ -2566,17 +2556,17 @@
             <w:tcW w:type="dxa" w:w="1728"/>
           </w:tcPr>
           <w:p>
-            <w:pPr>
-              <w:spacing w:after="20" w:before="20"/>
-            </w:pPr>
-            <w:r/>
             <w:r>
-              <w:rPr>
-                <w:rFonts w:ascii="Times New Roman" w:hAnsi="Times New Roman"/>
-                <w:b w:val="0"/>
-                <w:color w:val="000000"/>
-                <w:sz w:val="20"/>
-              </w:rPr>
+              <w:t>Bind_in</w:t>
+            </w:r>
+          </w:p>
+        </w:tc>
+        <w:tc>
+          <w:tcPr>
+            <w:tcW w:type="dxa" w:w="1728"/>
+          </w:tcPr>
+          <w:p>
+            <w:r>
               <w:t>B_in</w:t>
             </w:r>
           </w:p>
@@ -2586,18 +2576,8 @@
             <w:tcW w:type="dxa" w:w="1728"/>
           </w:tcPr>
           <w:p>
-            <w:pPr>
-              <w:spacing w:after="20" w:before="20"/>
-            </w:pPr>
-            <w:r/>
             <w:r>
-              <w:rPr>
-                <w:rFonts w:ascii="Times New Roman" w:hAnsi="Times New Roman"/>
-                <w:b w:val="0"/>
-                <w:color w:val="000000"/>
-                <w:sz w:val="20"/>
-              </w:rPr>
-              <w:t>Di</w:t>
+              <w:t>Internal binding and stabilization. The system forms a stable internal reference point.</w:t>
             </w:r>
           </w:p>
         </w:tc>
@@ -2606,37 +2586,7 @@
             <w:tcW w:type="dxa" w:w="1728"/>
           </w:tcPr>
           <w:p>
-            <w:pPr>
-              <w:spacing w:after="20" w:before="20"/>
-            </w:pPr>
-            <w:r/>
             <w:r>
-              <w:rPr>
-                <w:rFonts w:ascii="Times New Roman" w:hAnsi="Times New Roman"/>
-                <w:b w:val="0"/>
-                <w:color w:val="000000"/>
-                <w:sz w:val="20"/>
-              </w:rPr>
-              <w:t>Sticky internal reference resistant to change</w:t>
-            </w:r>
-          </w:p>
-        </w:tc>
-        <w:tc>
-          <w:tcPr>
-            <w:tcW w:type="dxa" w:w="1728"/>
-          </w:tcPr>
-          <w:p>
-            <w:pPr>
-              <w:spacing w:after="20" w:before="20"/>
-            </w:pPr>
-            <w:r/>
-            <w:r>
-              <w:rPr>
-                <w:rFonts w:ascii="Times New Roman" w:hAnsi="Times New Roman"/>
-                <w:b w:val="0"/>
-                <w:color w:val="000000"/>
-                <w:sz w:val="20"/>
-              </w:rPr>
               <w:t>Revision rate decline, protocol stability, self-citation persistence</w:t>
             </w:r>
           </w:p>
@@ -2668,17 +2618,17 @@
             <w:tcW w:type="dxa" w:w="1728"/>
           </w:tcPr>
           <w:p>
-            <w:pPr>
-              <w:spacing w:after="20" w:before="20"/>
-            </w:pPr>
-            <w:r/>
             <w:r>
-              <w:rPr>
-                <w:rFonts w:ascii="Times New Roman" w:hAnsi="Times New Roman"/>
-                <w:b w:val="0"/>
-                <w:color w:val="000000"/>
-                <w:sz w:val="20"/>
-              </w:rPr>
+              <w:t>Explore_out</w:t>
+            </w:r>
+          </w:p>
+        </w:tc>
+        <w:tc>
+          <w:tcPr>
+            <w:tcW w:type="dxa" w:w="1728"/>
+          </w:tcPr>
+          <w:p>
+            <w:r>
               <w:t>E_out</w:t>
             </w:r>
           </w:p>
@@ -2688,18 +2638,8 @@
             <w:tcW w:type="dxa" w:w="1728"/>
           </w:tcPr>
           <w:p>
-            <w:pPr>
-              <w:spacing w:after="20" w:before="20"/>
-            </w:pPr>
-            <w:r/>
             <w:r>
-              <w:rPr>
-                <w:rFonts w:ascii="Times New Roman" w:hAnsi="Times New Roman"/>
-                <w:b w:val="0"/>
-                <w:color w:val="000000"/>
-                <w:sz w:val="20"/>
-              </w:rPr>
-              <w:t>Oe</w:t>
+              <w:t>External exploration and coupling. The system scans and gathers from external sources.</w:t>
             </w:r>
           </w:p>
         </w:tc>
@@ -2708,38 +2648,8 @@
             <w:tcW w:type="dxa" w:w="1728"/>
           </w:tcPr>
           <w:p>
-            <w:pPr>
-              <w:spacing w:after="20" w:before="20"/>
-            </w:pPr>
-            <w:r/>
             <w:r>
-              <w:rPr>
-                <w:rFonts w:ascii="Times New Roman" w:hAnsi="Times New Roman"/>
-                <w:b w:val="0"/>
-                <w:color w:val="000000"/>
-                <w:sz w:val="20"/>
-              </w:rPr>
-              <w:t>Broad scanning, channel-changing, gathering novelty</w:t>
-            </w:r>
-          </w:p>
-        </w:tc>
-        <w:tc>
-          <w:tcPr>
-            <w:tcW w:type="dxa" w:w="1728"/>
-          </w:tcPr>
-          <w:p>
-            <w:pPr>
-              <w:spacing w:after="20" w:before="20"/>
-            </w:pPr>
-            <w:r/>
-            <w:r>
-              <w:rPr>
-                <w:rFonts w:ascii="Times New Roman" w:hAnsi="Times New Roman"/>
-                <w:b w:val="0"/>
-                <w:color w:val="000000"/>
-                <w:sz w:val="20"/>
-              </w:rPr>
-              <w:t>Cross-references, collaborator count, comment volume</w:t>
+              <w:t>Cross-references, collaborator count, comment volume, facility count</w:t>
             </w:r>
           </w:p>
         </w:tc>
@@ -2770,17 +2680,17 @@
             <w:tcW w:type="dxa" w:w="1728"/>
           </w:tcPr>
           <w:p>
-            <w:pPr>
-              <w:spacing w:after="20" w:before="20"/>
-            </w:pPr>
-            <w:r/>
             <w:r>
-              <w:rPr>
-                <w:rFonts w:ascii="Times New Roman" w:hAnsi="Times New Roman"/>
-                <w:b w:val="0"/>
-                <w:color w:val="000000"/>
-                <w:sz w:val="20"/>
-              </w:rPr>
+              <w:t>Explore_in</w:t>
+            </w:r>
+          </w:p>
+        </w:tc>
+        <w:tc>
+          <w:tcPr>
+            <w:tcW w:type="dxa" w:w="1728"/>
+          </w:tcPr>
+          <w:p>
+            <w:r>
               <w:t>E_in</w:t>
             </w:r>
           </w:p>
@@ -2790,18 +2700,8 @@
             <w:tcW w:type="dxa" w:w="1728"/>
           </w:tcPr>
           <w:p>
-            <w:pPr>
-              <w:spacing w:after="20" w:before="20"/>
-            </w:pPr>
-            <w:r/>
             <w:r>
-              <w:rPr>
-                <w:rFonts w:ascii="Times New Roman" w:hAnsi="Times New Roman"/>
-                <w:b w:val="0"/>
-                <w:color w:val="000000"/>
-                <w:sz w:val="20"/>
-              </w:rPr>
-              <w:t>Oi</w:t>
+              <w:t>Internal exploration and transformation. The system refines, narrows, and integrates internally.</w:t>
             </w:r>
           </w:p>
         </w:tc>
@@ -2810,38 +2710,8 @@
             <w:tcW w:type="dxa" w:w="1728"/>
           </w:tcPr>
           <w:p>
-            <w:pPr>
-              <w:spacing w:after="20" w:before="20"/>
-            </w:pPr>
-            <w:r/>
             <w:r>
-              <w:rPr>
-                <w:rFonts w:ascii="Times New Roman" w:hAnsi="Times New Roman"/>
-                <w:b w:val="0"/>
-                <w:color w:val="000000"/>
-                <w:sz w:val="20"/>
-              </w:rPr>
-              <w:t>Concluding, eliminating options, reducing candidates</w:t>
-            </w:r>
-          </w:p>
-        </w:tc>
-        <w:tc>
-          <w:tcPr>
-            <w:tcW w:type="dxa" w:w="1728"/>
-          </w:tcPr>
-          <w:p>
-            <w:pPr>
-              <w:spacing w:after="20" w:before="20"/>
-            </w:pPr>
-            <w:r/>
-            <w:r>
-              <w:rPr>
-                <w:rFonts w:ascii="Times New Roman" w:hAnsi="Times New Roman"/>
-                <w:b w:val="0"/>
-                <w:color w:val="000000"/>
-                <w:sz w:val="20"/>
-              </w:rPr>
-              <w:t>Text diff magnitude, outcome count, coupling rate</w:t>
+              <w:t>Text diff magnitude, outcome count, coupling rate, revision intensity</w:t>
             </w:r>
           </w:p>
         </w:tc>
@@ -2872,17 +2742,17 @@
             <w:tcW w:type="dxa" w:w="1728"/>
           </w:tcPr>
           <w:p>
-            <w:pPr>
-              <w:spacing w:after="20" w:before="20"/>
-            </w:pPr>
-            <w:r/>
             <w:r>
-              <w:rPr>
-                <w:rFonts w:ascii="Times New Roman" w:hAnsi="Times New Roman"/>
-                <w:b w:val="0"/>
-                <w:color w:val="000000"/>
-                <w:sz w:val="20"/>
-              </w:rPr>
+              <w:t>Bind_out</w:t>
+            </w:r>
+          </w:p>
+        </w:tc>
+        <w:tc>
+          <w:tcPr>
+            <w:tcW w:type="dxa" w:w="1728"/>
+          </w:tcPr>
+          <w:p>
+            <w:r>
               <w:t>B_out</w:t>
             </w:r>
           </w:p>
@@ -2892,18 +2762,8 @@
             <w:tcW w:type="dxa" w:w="1728"/>
           </w:tcPr>
           <w:p>
-            <w:pPr>
-              <w:spacing w:after="20" w:before="20"/>
-            </w:pPr>
-            <w:r/>
             <w:r>
-              <w:rPr>
-                <w:rFonts w:ascii="Times New Roman" w:hAnsi="Times New Roman"/>
-                <w:b w:val="0"/>
-                <w:color w:val="000000"/>
-                <w:sz w:val="20"/>
-              </w:rPr>
-              <w:t>De</w:t>
+              <w:t>External binding and commitment. The system commits irreversibly to an external boundary.</w:t>
             </w:r>
           </w:p>
         </w:tc>
@@ -2912,38 +2772,8 @@
             <w:tcW w:type="dxa" w:w="1728"/>
           </w:tcPr>
           <w:p>
-            <w:pPr>
-              <w:spacing w:after="20" w:before="20"/>
-            </w:pPr>
-            <w:r/>
             <w:r>
-              <w:rPr>
-                <w:rFonts w:ascii="Times New Roman" w:hAnsi="Times New Roman"/>
-                <w:b w:val="0"/>
-                <w:color w:val="000000"/>
-                <w:sz w:val="20"/>
-              </w:rPr>
-              <w:t>Persistent global write, difficult to reverse</w:t>
-            </w:r>
-          </w:p>
-        </w:tc>
-        <w:tc>
-          <w:tcPr>
-            <w:tcW w:type="dxa" w:w="1728"/>
-          </w:tcPr>
-          <w:p>
-            <w:pPr>
-              <w:spacing w:after="20" w:before="20"/>
-            </w:pPr>
-            <w:r/>
-            <w:r>
-              <w:rPr>
-                <w:rFonts w:ascii="Times New Roman" w:hAnsi="Times New Roman"/>
-                <w:b w:val="0"/>
-                <w:color w:val="000000"/>
-                <w:sz w:val="20"/>
-              </w:rPr>
-              <w:t>Publication, grant, results posting, effective date</w:t>
+              <w:t>Publication, grant award, results posting, effective date</w:t>
             </w:r>
           </w:p>
         </w:tc>

</xml_diff>

<commit_message>
Add IEC diagram (Figure 1) to Handoff Paper
Co-Authored-By: Claude Opus 4.6 (1M context) <noreply@anthropic.com>
</commit_message>
<xml_diff>
--- a/papers/TFP_Handoff_Paper.docx
+++ b/papers/TFP_Handoff_Paper.docx
@@ -371,6 +371,58 @@
           <w:sz w:val="22"/>
         </w:rPr>
         <w:t>• Q4 (Deployment): The system makes irreversible external commitments. Q4 bifurcates into Q4A (continuation along the current trajectory) and Q4B (viability-gated return to earlier lifecycle functions after failure).</w:t>
+      </w:r>
+    </w:p>
+    <w:p>
+      <w:pPr>
+        <w:jc w:val="center"/>
+      </w:pPr>
+      <w:r>
+        <w:drawing>
+          <wp:inline xmlns:a="http://schemas.openxmlformats.org/drawingml/2006/main" xmlns:pic="http://schemas.openxmlformats.org/drawingml/2006/picture">
+            <wp:extent cx="4114800" cy="4114800"/>
+            <wp:docPr id="1" name="Picture 1"/>
+            <wp:cNvGraphicFramePr>
+              <a:graphicFrameLocks noChangeAspect="1"/>
+            </wp:cNvGraphicFramePr>
+            <a:graphic>
+              <a:graphicData uri="http://schemas.openxmlformats.org/drawingml/2006/picture">
+                <pic:pic>
+                  <pic:nvPicPr>
+                    <pic:cNvPr id="0" name="iec_cycle.png"/>
+                    <pic:cNvPicPr/>
+                  </pic:nvPicPr>
+                  <pic:blipFill>
+                    <a:blip r:embed="rId10"/>
+                    <a:stretch>
+                      <a:fillRect/>
+                    </a:stretch>
+                  </pic:blipFill>
+                  <pic:spPr>
+                    <a:xfrm>
+                      <a:off x="0" y="0"/>
+                      <a:ext cx="4114800" cy="4114800"/>
+                    </a:xfrm>
+                    <a:prstGeom prst="rect"/>
+                  </pic:spPr>
+                </pic:pic>
+              </a:graphicData>
+            </a:graphic>
+          </wp:inline>
+        </w:drawing>
+      </w:r>
+    </w:p>
+    <w:p>
+      <w:pPr>
+        <w:jc w:val="center"/>
+      </w:pPr>
+      <w:r>
+        <w:rPr>
+          <w:rFonts w:ascii="Times New Roman" w:hAnsi="Times New Roman"/>
+          <w:i/>
+          <w:sz w:val="20"/>
+        </w:rPr>
+        <w:t>Figure 1. The Information Emergence Cycle (IEC). Four functional quadrants with their associated operators. The cycle proceeds Q1 (Generation) to Q2 (Selection) to Q3 (Refinement) to Q4 (Deployment), with Q4 bifurcating into Q4A (continuation) and Q4B (viability-gated reseeding).</w:t>
       </w:r>
     </w:p>
     <w:p>

</xml_diff>